<commit_message>
docs: portada institucional y referencias en el informe
- portada segun la plantilla de la universidad: logo, Arial 12 centrado con
  interlineado de 1,5, hoja carta y margenes de 2,5 cm, en su propia seccion
- apartado de referencias con sangria francesa, y citas en el cuerpo donde
  corresponde: Wilson para el intervalo de la proporcion, Welch para el
  contraste, Cohen para el umbral de la d, Cramer para la V, Tukey para las
  comparaciones multiples y la declaracion de la ASA sobre el valor p, que
  es la que respalda el argumento central del informe
- el logo queda en informe/recursos/ para que el documento se reconstruya
  sin depender de archivos externos

Ocho paginas contando la portada, en el limite de la rubrica.

Co-authored-by: María Fassler Neumann <m.fasslerneumann@uandresbello.edu>
</commit_message>
<xml_diff>
--- a/informe/Sumativa1_Informe_Sebastian_Antunez.docx
+++ b/informe/Sumativa1_Informe_Sebastian_Antunez.docx
@@ -4,55 +4,415 @@
   <w:body>
     <w:p>
       <w:pPr>
-        <w:spacing w:after="40"/>
+        <w:spacing w:after="240"/>
         <w:jc w:val="center"/>
       </w:pPr>
       <w:r>
-        <w:rPr>
+        <w:drawing>
+          <wp:inline distT="0" distB="0" distL="0" distR="0">
+            <wp:extent cx="1143000" cy="1143000"/>
+            <wp:effectExtent t="0" r="0" b="0" l="0"/>
+            <wp:docPr id="1" name="" descr="" title=""/>
+            <wp:cNvGraphicFramePr>
+              <a:graphicFrameLocks xmlns:a="http://schemas.openxmlformats.org/drawingml/2006/main" noChangeAspect="1"/>
+            </wp:cNvGraphicFramePr>
+            <a:graphic xmlns:a="http://schemas.openxmlformats.org/drawingml/2006/main">
+              <a:graphicData uri="http://schemas.openxmlformats.org/drawingml/2006/picture">
+                <pic:pic xmlns:pic="http://schemas.openxmlformats.org/drawingml/2006/picture">
+                  <pic:nvPicPr>
+                    <pic:cNvPr id="0" name="" descr=""/>
+                    <pic:cNvPicPr>
+                      <a:picLocks noChangeAspect="1" noChangeArrowheads="1"/>
+                    </pic:cNvPicPr>
+                  </pic:nvPicPr>
+                  <pic:blipFill>
+                    <a:blip r:embed="rId8" cstate="none"/>
+                    <a:srcRect/>
+                    <a:stretch>
+                      <a:fillRect/>
+                    </a:stretch>
+                  </pic:blipFill>
+                  <pic:spPr bwMode="auto">
+                    <a:xfrm>
+                      <a:off x="0" y="0"/>
+                      <a:ext cx="1143000" cy="1143000"/>
+                    </a:xfrm>
+                    <a:prstGeom prst="rect">
+                      <a:avLst/>
+                    </a:prstGeom>
+                  </pic:spPr>
+                </pic:pic>
+              </a:graphicData>
+            </a:graphic>
+          </wp:inline>
+        </w:drawing>
+      </w:r>
+    </w:p>
+    <w:p>
+      <w:pPr>
+        <w:spacing w:after="0" w:line="360"/>
+        <w:jc w:val="center"/>
+      </w:pPr>
+      <w:r>
+        <w:rPr>
+          <w:rFonts w:ascii="Arial" w:cs="Arial" w:eastAsia="Arial" w:hAnsi="Arial"/>
+          <w:b w:val="false"/>
+          <w:bCs w:val="false"/>
+          <w:sz w:val="24"/>
+          <w:szCs w:val="24"/>
+        </w:rPr>
+        <w:t xml:space="preserve">Facultad de Ingeniería</w:t>
+      </w:r>
+    </w:p>
+    <w:p>
+      <w:pPr>
+        <w:spacing w:after="0" w:line="360"/>
+        <w:jc w:val="center"/>
+      </w:pPr>
+      <w:r>
+        <w:rPr>
+          <w:rFonts w:ascii="Arial" w:cs="Arial" w:eastAsia="Arial" w:hAnsi="Arial"/>
+          <w:b w:val="false"/>
+          <w:bCs w:val="false"/>
+          <w:sz w:val="24"/>
+          <w:szCs w:val="24"/>
+        </w:rPr>
+        <w:t xml:space="preserve">Magíster en Ciencia de Datos e Inteligencia Artificial</w:t>
+      </w:r>
+    </w:p>
+    <w:p>
+      <w:pPr>
+        <w:spacing w:after="0" w:line="360"/>
+      </w:pPr>
+      <w:r>
+        <w:rPr>
+          <w:rFonts w:ascii="Arial" w:cs="Arial" w:eastAsia="Arial" w:hAnsi="Arial"/>
+          <w:sz w:val="24"/>
+          <w:szCs w:val="24"/>
+        </w:rPr>
+        <w:t xml:space="preserve"/>
+      </w:r>
+    </w:p>
+    <w:p>
+      <w:pPr>
+        <w:spacing w:after="0" w:line="360"/>
+      </w:pPr>
+      <w:r>
+        <w:rPr>
+          <w:rFonts w:ascii="Arial" w:cs="Arial" w:eastAsia="Arial" w:hAnsi="Arial"/>
+          <w:sz w:val="24"/>
+          <w:szCs w:val="24"/>
+        </w:rPr>
+        <w:t xml:space="preserve"/>
+      </w:r>
+    </w:p>
+    <w:p>
+      <w:pPr>
+        <w:spacing w:after="0" w:line="360"/>
+      </w:pPr>
+      <w:r>
+        <w:rPr>
+          <w:rFonts w:ascii="Arial" w:cs="Arial" w:eastAsia="Arial" w:hAnsi="Arial"/>
+          <w:sz w:val="24"/>
+          <w:szCs w:val="24"/>
+        </w:rPr>
+        <w:t xml:space="preserve"/>
+      </w:r>
+    </w:p>
+    <w:p>
+      <w:pPr>
+        <w:spacing w:after="0" w:line="360"/>
+        <w:jc w:val="center"/>
+      </w:pPr>
+      <w:r>
+        <w:rPr>
+          <w:rFonts w:ascii="Arial" w:cs="Arial" w:eastAsia="Arial" w:hAnsi="Arial"/>
           <w:b/>
           <w:bCs/>
-          <w:color w:val="1F3864"/>
-          <w:sz w:val="32"/>
-          <w:szCs w:val="32"/>
-        </w:rPr>
-        <w:t xml:space="preserve">Análisis de la deserción en la educación superior chilena</w:t>
-      </w:r>
-    </w:p>
-    <w:p>
-      <w:pPr>
-        <w:spacing w:after="160"/>
+          <w:sz w:val="24"/>
+          <w:szCs w:val="24"/>
+        </w:rPr>
+        <w:t xml:space="preserve">ANÁLISIS DE LA DESERCIÓN EN LA EDUCACIÓN SUPERIOR CHILENA</w:t>
+      </w:r>
+    </w:p>
+    <w:p>
+      <w:pPr>
+        <w:spacing w:after="0" w:line="360"/>
         <w:jc w:val="center"/>
       </w:pPr>
       <w:r>
         <w:rPr>
-          <w:color w:val="2E5496"/>
-          <w:sz w:val="22"/>
-          <w:szCs w:val="22"/>
-        </w:rPr>
-        <w:t xml:space="preserve">Informe técnico de avance — Evaluación Sumativa 1</w:t>
-      </w:r>
-    </w:p>
-    <w:p>
-      <w:pPr>
-        <w:spacing w:after="220"/>
+          <w:rFonts w:ascii="Arial" w:cs="Arial" w:eastAsia="Arial" w:hAnsi="Arial"/>
+          <w:b w:val="false"/>
+          <w:bCs w:val="false"/>
+          <w:sz w:val="24"/>
+          <w:szCs w:val="24"/>
+        </w:rPr>
+        <w:t xml:space="preserve">Informe técnico de avance</w:t>
+      </w:r>
+    </w:p>
+    <w:p>
+      <w:pPr>
+        <w:spacing w:after="0" w:line="360"/>
+      </w:pPr>
+      <w:r>
+        <w:rPr>
+          <w:rFonts w:ascii="Arial" w:cs="Arial" w:eastAsia="Arial" w:hAnsi="Arial"/>
+          <w:sz w:val="24"/>
+          <w:szCs w:val="24"/>
+        </w:rPr>
+        <w:t xml:space="preserve"/>
+      </w:r>
+    </w:p>
+    <w:p>
+      <w:pPr>
+        <w:spacing w:after="0" w:line="360"/>
+      </w:pPr>
+      <w:r>
+        <w:rPr>
+          <w:rFonts w:ascii="Arial" w:cs="Arial" w:eastAsia="Arial" w:hAnsi="Arial"/>
+          <w:sz w:val="24"/>
+          <w:szCs w:val="24"/>
+        </w:rPr>
+        <w:t xml:space="preserve"/>
+      </w:r>
+    </w:p>
+    <w:p>
+      <w:pPr>
+        <w:spacing w:after="0" w:line="360"/>
         <w:jc w:val="center"/>
       </w:pPr>
       <w:r>
         <w:rPr>
-          <w:color w:val="555555"/>
-          <w:sz w:val="18"/>
-          <w:szCs w:val="18"/>
-        </w:rPr>
-        <w:t xml:space="preserve">Estadística Computacional · Magíster en Ciencia de Datos e Inteligencia Artificial</w:t>
-      </w:r>
-      <w:r>
-        <w:rPr>
-          <w:color w:val="555555"/>
-          <w:sz w:val="18"/>
-          <w:szCs w:val="18"/>
-        </w:rPr>
-        <w:br/>
-        <w:t xml:space="preserve">Universidad Andrés Bello · Sebastian Antunez Noguera</w:t>
+          <w:rFonts w:ascii="Arial" w:cs="Arial" w:eastAsia="Arial" w:hAnsi="Arial"/>
+          <w:b w:val="false"/>
+          <w:bCs w:val="false"/>
+          <w:sz w:val="24"/>
+          <w:szCs w:val="24"/>
+        </w:rPr>
+        <w:t xml:space="preserve">Evaluación Sumativa 1</w:t>
+      </w:r>
+    </w:p>
+    <w:p>
+      <w:pPr>
+        <w:spacing w:after="0" w:line="360"/>
+        <w:jc w:val="center"/>
+      </w:pPr>
+      <w:r>
+        <w:rPr>
+          <w:rFonts w:ascii="Arial" w:cs="Arial" w:eastAsia="Arial" w:hAnsi="Arial"/>
+          <w:b w:val="false"/>
+          <w:bCs w:val="false"/>
+          <w:sz w:val="24"/>
+          <w:szCs w:val="24"/>
+        </w:rPr>
+        <w:t xml:space="preserve">Estadística Computacional</w:t>
+      </w:r>
+    </w:p>
+    <w:p>
+      <w:pPr>
+        <w:spacing w:after="0" w:line="360"/>
+      </w:pPr>
+      <w:r>
+        <w:rPr>
+          <w:rFonts w:ascii="Arial" w:cs="Arial" w:eastAsia="Arial" w:hAnsi="Arial"/>
+          <w:sz w:val="24"/>
+          <w:szCs w:val="24"/>
+        </w:rPr>
+        <w:t xml:space="preserve"/>
+      </w:r>
+    </w:p>
+    <w:p>
+      <w:pPr>
+        <w:spacing w:after="0" w:line="360"/>
+      </w:pPr>
+      <w:r>
+        <w:rPr>
+          <w:rFonts w:ascii="Arial" w:cs="Arial" w:eastAsia="Arial" w:hAnsi="Arial"/>
+          <w:sz w:val="24"/>
+          <w:szCs w:val="24"/>
+        </w:rPr>
+        <w:t xml:space="preserve"/>
+      </w:r>
+    </w:p>
+    <w:p>
+      <w:pPr>
+        <w:spacing w:after="0" w:line="360"/>
+      </w:pPr>
+      <w:r>
+        <w:rPr>
+          <w:rFonts w:ascii="Arial" w:cs="Arial" w:eastAsia="Arial" w:hAnsi="Arial"/>
+          <w:sz w:val="24"/>
+          <w:szCs w:val="24"/>
+        </w:rPr>
+        <w:t xml:space="preserve"/>
+      </w:r>
+    </w:p>
+    <w:p>
+      <w:pPr>
+        <w:spacing w:after="0" w:line="360"/>
+        <w:jc w:val="center"/>
+      </w:pPr>
+      <w:r>
+        <w:rPr>
+          <w:rFonts w:ascii="Arial" w:cs="Arial" w:eastAsia="Arial" w:hAnsi="Arial"/>
+          <w:b w:val="false"/>
+          <w:bCs w:val="false"/>
+          <w:sz w:val="24"/>
+          <w:szCs w:val="24"/>
+        </w:rPr>
+        <w:t xml:space="preserve">Autor:</w:t>
+      </w:r>
+    </w:p>
+    <w:p>
+      <w:pPr>
+        <w:spacing w:after="0" w:line="360"/>
+        <w:jc w:val="center"/>
+      </w:pPr>
+      <w:r>
+        <w:rPr>
+          <w:rFonts w:ascii="Arial" w:cs="Arial" w:eastAsia="Arial" w:hAnsi="Arial"/>
+          <w:b w:val="false"/>
+          <w:bCs w:val="false"/>
+          <w:sz w:val="24"/>
+          <w:szCs w:val="24"/>
+        </w:rPr>
+        <w:t xml:space="preserve">Sebastian Antunez Noguera</w:t>
+      </w:r>
+    </w:p>
+    <w:p>
+      <w:pPr>
+        <w:spacing w:after="0" w:line="360"/>
+      </w:pPr>
+      <w:r>
+        <w:rPr>
+          <w:rFonts w:ascii="Arial" w:cs="Arial" w:eastAsia="Arial" w:hAnsi="Arial"/>
+          <w:sz w:val="24"/>
+          <w:szCs w:val="24"/>
+        </w:rPr>
+        <w:t xml:space="preserve"/>
+      </w:r>
+    </w:p>
+    <w:p>
+      <w:pPr>
+        <w:spacing w:after="0" w:line="360"/>
+      </w:pPr>
+      <w:r>
+        <w:rPr>
+          <w:rFonts w:ascii="Arial" w:cs="Arial" w:eastAsia="Arial" w:hAnsi="Arial"/>
+          <w:sz w:val="24"/>
+          <w:szCs w:val="24"/>
+        </w:rPr>
+        <w:t xml:space="preserve"/>
+      </w:r>
+    </w:p>
+    <w:p>
+      <w:pPr>
+        <w:spacing w:after="0" w:line="360"/>
+        <w:jc w:val="center"/>
+      </w:pPr>
+      <w:r>
+        <w:rPr>
+          <w:rFonts w:ascii="Arial" w:cs="Arial" w:eastAsia="Arial" w:hAnsi="Arial"/>
+          <w:b w:val="false"/>
+          <w:bCs w:val="false"/>
+          <w:sz w:val="24"/>
+          <w:szCs w:val="24"/>
+        </w:rPr>
+        <w:t xml:space="preserve">Profesor/a:</w:t>
+      </w:r>
+    </w:p>
+    <w:p>
+      <w:pPr>
+        <w:spacing w:after="0" w:line="360"/>
+        <w:jc w:val="center"/>
+      </w:pPr>
+      <w:r>
+        <w:rPr>
+          <w:rFonts w:ascii="Arial" w:cs="Arial" w:eastAsia="Arial" w:hAnsi="Arial"/>
+          <w:b w:val="false"/>
+          <w:bCs w:val="false"/>
+          <w:sz w:val="24"/>
+          <w:szCs w:val="24"/>
+        </w:rPr>
+        <w:t xml:space="preserve">[indicar nombre del docente]</w:t>
+      </w:r>
+    </w:p>
+    <w:p>
+      <w:pPr>
+        <w:spacing w:after="0" w:line="360"/>
+      </w:pPr>
+      <w:r>
+        <w:rPr>
+          <w:rFonts w:ascii="Arial" w:cs="Arial" w:eastAsia="Arial" w:hAnsi="Arial"/>
+          <w:sz w:val="24"/>
+          <w:szCs w:val="24"/>
+        </w:rPr>
+        <w:t xml:space="preserve"/>
+      </w:r>
+    </w:p>
+    <w:p>
+      <w:pPr>
+        <w:spacing w:after="0" w:line="360"/>
+      </w:pPr>
+      <w:r>
+        <w:rPr>
+          <w:rFonts w:ascii="Arial" w:cs="Arial" w:eastAsia="Arial" w:hAnsi="Arial"/>
+          <w:sz w:val="24"/>
+          <w:szCs w:val="24"/>
+        </w:rPr>
+        <w:t xml:space="preserve"/>
+      </w:r>
+    </w:p>
+    <w:p>
+      <w:pPr>
+        <w:spacing w:after="0" w:line="360"/>
+      </w:pPr>
+      <w:r>
+        <w:rPr>
+          <w:rFonts w:ascii="Arial" w:cs="Arial" w:eastAsia="Arial" w:hAnsi="Arial"/>
+          <w:sz w:val="24"/>
+          <w:szCs w:val="24"/>
+        </w:rPr>
+        <w:t xml:space="preserve"/>
+      </w:r>
+    </w:p>
+    <w:p>
+      <w:pPr>
+        <w:spacing w:after="0" w:line="360"/>
+        <w:jc w:val="center"/>
+      </w:pPr>
+      <w:r>
+        <w:rPr>
+          <w:rFonts w:ascii="Arial" w:cs="Arial" w:eastAsia="Arial" w:hAnsi="Arial"/>
+          <w:b w:val="false"/>
+          <w:bCs w:val="false"/>
+          <w:sz w:val="24"/>
+          <w:szCs w:val="24"/>
+        </w:rPr>
+        <w:t xml:space="preserve">Santiago, Chile</w:t>
+      </w:r>
+    </w:p>
+    <w:p>
+      <w:pPr>
+        <w:spacing w:after="0" w:line="360"/>
+        <w:jc w:val="center"/>
+        <w:sectPr>
+          <w:pgSz w:w="12240" w:h="15840" w:orient="portrait"/>
+          <w:pgMar w:top="1417" w:right="1417" w:bottom="1417" w:left="1417" w:header="708" w:footer="708" w:gutter="0"/>
+          <w:pgNumType/>
+          <w:docGrid w:linePitch="360"/>
+        </w:sectPr>
+      </w:pPr>
+      <w:r>
+        <w:rPr>
+          <w:rFonts w:ascii="Arial" w:cs="Arial" w:eastAsia="Arial" w:hAnsi="Arial"/>
+          <w:b w:val="false"/>
+          <w:bCs w:val="false"/>
+          <w:sz w:val="24"/>
+          <w:szCs w:val="24"/>
+        </w:rPr>
+        <w:t xml:space="preserve">2026</w:t>
       </w:r>
     </w:p>
     <w:p>
@@ -282,7 +642,7 @@
         </w:trPr>
         <w:tc>
           <w:tcPr>
-            <w:tcW w:type="dxa" w:w="2400"/>
+            <w:tcW w:type="dxa" w:w="2443"/>
             <w:shd w:fill="F2F5F7" w:val="clear"/>
             <w:tcMar>
               <w:top w:type="dxa" w:w="60"/>
@@ -309,7 +669,7 @@
         </w:tc>
         <w:tc>
           <w:tcPr>
-            <w:tcW w:type="dxa" w:w="800"/>
+            <w:tcW w:type="dxa" w:w="814"/>
             <w:shd w:fill="F2F5F7" w:val="clear"/>
             <w:tcMar>
               <w:top w:type="dxa" w:w="60"/>
@@ -336,7 +696,7 @@
         </w:tc>
         <w:tc>
           <w:tcPr>
-            <w:tcW w:type="dxa" w:w="6600"/>
+            <w:tcW w:type="dxa" w:w="6717"/>
             <w:shd w:fill="F2F5F7" w:val="clear"/>
             <w:tcMar>
               <w:top w:type="dxa" w:w="60"/>
@@ -365,7 +725,7 @@
       <w:tr>
         <w:tc>
           <w:tcPr>
-            <w:tcW w:type="dxa" w:w="2400"/>
+            <w:tcW w:type="dxa" w:w="2443"/>
             <w:tcMar>
               <w:top w:type="dxa" w:w="60"/>
               <w:left w:type="dxa" w:w="90"/>
@@ -391,7 +751,7 @@
         </w:tc>
         <w:tc>
           <w:tcPr>
-            <w:tcW w:type="dxa" w:w="800"/>
+            <w:tcW w:type="dxa" w:w="814"/>
             <w:tcMar>
               <w:top w:type="dxa" w:w="60"/>
               <w:left w:type="dxa" w:w="90"/>
@@ -417,7 +777,7 @@
         </w:tc>
         <w:tc>
           <w:tcPr>
-            <w:tcW w:type="dxa" w:w="6600"/>
+            <w:tcW w:type="dxa" w:w="6717"/>
             <w:tcMar>
               <w:top w:type="dxa" w:w="60"/>
               <w:left w:type="dxa" w:w="90"/>
@@ -445,7 +805,7 @@
       <w:tr>
         <w:tc>
           <w:tcPr>
-            <w:tcW w:type="dxa" w:w="2400"/>
+            <w:tcW w:type="dxa" w:w="2443"/>
             <w:tcMar>
               <w:top w:type="dxa" w:w="60"/>
               <w:left w:type="dxa" w:w="90"/>
@@ -471,7 +831,7 @@
         </w:tc>
         <w:tc>
           <w:tcPr>
-            <w:tcW w:type="dxa" w:w="800"/>
+            <w:tcW w:type="dxa" w:w="814"/>
             <w:tcMar>
               <w:top w:type="dxa" w:w="60"/>
               <w:left w:type="dxa" w:w="90"/>
@@ -497,7 +857,7 @@
         </w:tc>
         <w:tc>
           <w:tcPr>
-            <w:tcW w:type="dxa" w:w="6600"/>
+            <w:tcW w:type="dxa" w:w="6717"/>
             <w:tcMar>
               <w:top w:type="dxa" w:w="60"/>
               <w:left w:type="dxa" w:w="90"/>
@@ -525,7 +885,7 @@
       <w:tr>
         <w:tc>
           <w:tcPr>
-            <w:tcW w:type="dxa" w:w="2400"/>
+            <w:tcW w:type="dxa" w:w="2443"/>
             <w:tcMar>
               <w:top w:type="dxa" w:w="60"/>
               <w:left w:type="dxa" w:w="90"/>
@@ -551,7 +911,7 @@
         </w:tc>
         <w:tc>
           <w:tcPr>
-            <w:tcW w:type="dxa" w:w="800"/>
+            <w:tcW w:type="dxa" w:w="814"/>
             <w:tcMar>
               <w:top w:type="dxa" w:w="60"/>
               <w:left w:type="dxa" w:w="90"/>
@@ -577,7 +937,7 @@
         </w:tc>
         <w:tc>
           <w:tcPr>
-            <w:tcW w:type="dxa" w:w="6600"/>
+            <w:tcW w:type="dxa" w:w="6717"/>
             <w:tcMar>
               <w:top w:type="dxa" w:w="60"/>
               <w:left w:type="dxa" w:w="90"/>
@@ -605,7 +965,7 @@
       <w:tr>
         <w:tc>
           <w:tcPr>
-            <w:tcW w:type="dxa" w:w="2400"/>
+            <w:tcW w:type="dxa" w:w="2443"/>
             <w:tcMar>
               <w:top w:type="dxa" w:w="60"/>
               <w:left w:type="dxa" w:w="90"/>
@@ -631,7 +991,7 @@
         </w:tc>
         <w:tc>
           <w:tcPr>
-            <w:tcW w:type="dxa" w:w="800"/>
+            <w:tcW w:type="dxa" w:w="814"/>
             <w:tcMar>
               <w:top w:type="dxa" w:w="60"/>
               <w:left w:type="dxa" w:w="90"/>
@@ -657,7 +1017,7 @@
         </w:tc>
         <w:tc>
           <w:tcPr>
-            <w:tcW w:type="dxa" w:w="6600"/>
+            <w:tcW w:type="dxa" w:w="6717"/>
             <w:tcMar>
               <w:top w:type="dxa" w:w="60"/>
               <w:left w:type="dxa" w:w="90"/>
@@ -685,7 +1045,7 @@
       <w:tr>
         <w:tc>
           <w:tcPr>
-            <w:tcW w:type="dxa" w:w="2400"/>
+            <w:tcW w:type="dxa" w:w="2443"/>
             <w:tcMar>
               <w:top w:type="dxa" w:w="60"/>
               <w:left w:type="dxa" w:w="90"/>
@@ -711,7 +1071,7 @@
         </w:tc>
         <w:tc>
           <w:tcPr>
-            <w:tcW w:type="dxa" w:w="800"/>
+            <w:tcW w:type="dxa" w:w="814"/>
             <w:tcMar>
               <w:top w:type="dxa" w:w="60"/>
               <w:left w:type="dxa" w:w="90"/>
@@ -737,7 +1097,7 @@
         </w:tc>
         <w:tc>
           <w:tcPr>
-            <w:tcW w:type="dxa" w:w="6600"/>
+            <w:tcW w:type="dxa" w:w="6717"/>
             <w:tcMar>
               <w:top w:type="dxa" w:w="60"/>
               <w:left w:type="dxa" w:w="90"/>
@@ -842,7 +1202,7 @@
         </w:trPr>
         <w:tc>
           <w:tcPr>
-            <w:tcW w:type="dxa" w:w="2100"/>
+            <w:tcW w:type="dxa" w:w="2116"/>
             <w:shd w:fill="F2F5F7" w:val="clear"/>
             <w:tcMar>
               <w:top w:type="dxa" w:w="60"/>
@@ -869,7 +1229,7 @@
         </w:tc>
         <w:tc>
           <w:tcPr>
-            <w:tcW w:type="dxa" w:w="1100"/>
+            <w:tcW w:type="dxa" w:w="1108"/>
             <w:shd w:fill="F2F5F7" w:val="clear"/>
             <w:tcMar>
               <w:top w:type="dxa" w:w="60"/>
@@ -896,7 +1256,7 @@
         </w:tc>
         <w:tc>
           <w:tcPr>
-            <w:tcW w:type="dxa" w:w="2400"/>
+            <w:tcW w:type="dxa" w:w="2418"/>
             <w:shd w:fill="F2F5F7" w:val="clear"/>
             <w:tcMar>
               <w:top w:type="dxa" w:w="60"/>
@@ -923,7 +1283,7 @@
         </w:tc>
         <w:tc>
           <w:tcPr>
-            <w:tcW w:type="dxa" w:w="1100"/>
+            <w:tcW w:type="dxa" w:w="1108"/>
             <w:shd w:fill="F2F5F7" w:val="clear"/>
             <w:tcMar>
               <w:top w:type="dxa" w:w="60"/>
@@ -950,7 +1310,7 @@
         </w:tc>
         <w:tc>
           <w:tcPr>
-            <w:tcW w:type="dxa" w:w="2100"/>
+            <w:tcW w:type="dxa" w:w="2116"/>
             <w:shd w:fill="F2F5F7" w:val="clear"/>
             <w:tcMar>
               <w:top w:type="dxa" w:w="60"/>
@@ -977,7 +1337,7 @@
         </w:tc>
         <w:tc>
           <w:tcPr>
-            <w:tcW w:type="dxa" w:w="1100"/>
+            <w:tcW w:type="dxa" w:w="1108"/>
             <w:shd w:fill="F2F5F7" w:val="clear"/>
             <w:tcMar>
               <w:top w:type="dxa" w:w="60"/>
@@ -1006,7 +1366,7 @@
       <w:tr>
         <w:tc>
           <w:tcPr>
-            <w:tcW w:type="dxa" w:w="2100"/>
+            <w:tcW w:type="dxa" w:w="2116"/>
             <w:tcMar>
               <w:top w:type="dxa" w:w="60"/>
               <w:left w:type="dxa" w:w="90"/>
@@ -1032,7 +1392,7 @@
         </w:tc>
         <w:tc>
           <w:tcPr>
-            <w:tcW w:type="dxa" w:w="1100"/>
+            <w:tcW w:type="dxa" w:w="1108"/>
             <w:tcMar>
               <w:top w:type="dxa" w:w="60"/>
               <w:left w:type="dxa" w:w="90"/>
@@ -1058,7 +1418,7 @@
         </w:tc>
         <w:tc>
           <w:tcPr>
-            <w:tcW w:type="dxa" w:w="2400"/>
+            <w:tcW w:type="dxa" w:w="2418"/>
             <w:tcMar>
               <w:top w:type="dxa" w:w="60"/>
               <w:left w:type="dxa" w:w="90"/>
@@ -1084,7 +1444,7 @@
         </w:tc>
         <w:tc>
           <w:tcPr>
-            <w:tcW w:type="dxa" w:w="1100"/>
+            <w:tcW w:type="dxa" w:w="1108"/>
             <w:tcMar>
               <w:top w:type="dxa" w:w="60"/>
               <w:left w:type="dxa" w:w="90"/>
@@ -1110,7 +1470,7 @@
         </w:tc>
         <w:tc>
           <w:tcPr>
-            <w:tcW w:type="dxa" w:w="2100"/>
+            <w:tcW w:type="dxa" w:w="2116"/>
             <w:tcMar>
               <w:top w:type="dxa" w:w="60"/>
               <w:left w:type="dxa" w:w="90"/>
@@ -1136,7 +1496,7 @@
         </w:tc>
         <w:tc>
           <w:tcPr>
-            <w:tcW w:type="dxa" w:w="1100"/>
+            <w:tcW w:type="dxa" w:w="1108"/>
             <w:tcMar>
               <w:top w:type="dxa" w:w="60"/>
               <w:left w:type="dxa" w:w="90"/>
@@ -1164,7 +1524,7 @@
       <w:tr>
         <w:tc>
           <w:tcPr>
-            <w:tcW w:type="dxa" w:w="2100"/>
+            <w:tcW w:type="dxa" w:w="2116"/>
             <w:tcMar>
               <w:top w:type="dxa" w:w="60"/>
               <w:left w:type="dxa" w:w="90"/>
@@ -1190,7 +1550,7 @@
         </w:tc>
         <w:tc>
           <w:tcPr>
-            <w:tcW w:type="dxa" w:w="1100"/>
+            <w:tcW w:type="dxa" w:w="1108"/>
             <w:tcMar>
               <w:top w:type="dxa" w:w="60"/>
               <w:left w:type="dxa" w:w="90"/>
@@ -1216,7 +1576,7 @@
         </w:tc>
         <w:tc>
           <w:tcPr>
-            <w:tcW w:type="dxa" w:w="2400"/>
+            <w:tcW w:type="dxa" w:w="2418"/>
             <w:tcMar>
               <w:top w:type="dxa" w:w="60"/>
               <w:left w:type="dxa" w:w="90"/>
@@ -1242,7 +1602,7 @@
         </w:tc>
         <w:tc>
           <w:tcPr>
-            <w:tcW w:type="dxa" w:w="1100"/>
+            <w:tcW w:type="dxa" w:w="1108"/>
             <w:tcMar>
               <w:top w:type="dxa" w:w="60"/>
               <w:left w:type="dxa" w:w="90"/>
@@ -1268,7 +1628,7 @@
         </w:tc>
         <w:tc>
           <w:tcPr>
-            <w:tcW w:type="dxa" w:w="2100"/>
+            <w:tcW w:type="dxa" w:w="2116"/>
             <w:tcMar>
               <w:top w:type="dxa" w:w="60"/>
               <w:left w:type="dxa" w:w="90"/>
@@ -1294,7 +1654,7 @@
         </w:tc>
         <w:tc>
           <w:tcPr>
-            <w:tcW w:type="dxa" w:w="1100"/>
+            <w:tcW w:type="dxa" w:w="1108"/>
             <w:tcMar>
               <w:top w:type="dxa" w:w="60"/>
               <w:left w:type="dxa" w:w="90"/>
@@ -1322,7 +1682,7 @@
       <w:tr>
         <w:tc>
           <w:tcPr>
-            <w:tcW w:type="dxa" w:w="2100"/>
+            <w:tcW w:type="dxa" w:w="2116"/>
             <w:tcMar>
               <w:top w:type="dxa" w:w="60"/>
               <w:left w:type="dxa" w:w="90"/>
@@ -1348,7 +1708,7 @@
         </w:tc>
         <w:tc>
           <w:tcPr>
-            <w:tcW w:type="dxa" w:w="1100"/>
+            <w:tcW w:type="dxa" w:w="1108"/>
             <w:tcMar>
               <w:top w:type="dxa" w:w="60"/>
               <w:left w:type="dxa" w:w="90"/>
@@ -1374,7 +1734,7 @@
         </w:tc>
         <w:tc>
           <w:tcPr>
-            <w:tcW w:type="dxa" w:w="2400"/>
+            <w:tcW w:type="dxa" w:w="2418"/>
             <w:tcMar>
               <w:top w:type="dxa" w:w="60"/>
               <w:left w:type="dxa" w:w="90"/>
@@ -1400,7 +1760,7 @@
         </w:tc>
         <w:tc>
           <w:tcPr>
-            <w:tcW w:type="dxa" w:w="1100"/>
+            <w:tcW w:type="dxa" w:w="1108"/>
             <w:tcMar>
               <w:top w:type="dxa" w:w="60"/>
               <w:left w:type="dxa" w:w="90"/>
@@ -1426,7 +1786,7 @@
         </w:tc>
         <w:tc>
           <w:tcPr>
-            <w:tcW w:type="dxa" w:w="2100"/>
+            <w:tcW w:type="dxa" w:w="2116"/>
             <w:tcMar>
               <w:top w:type="dxa" w:w="60"/>
               <w:left w:type="dxa" w:w="90"/>
@@ -1452,7 +1812,7 @@
         </w:tc>
         <w:tc>
           <w:tcPr>
-            <w:tcW w:type="dxa" w:w="1100"/>
+            <w:tcW w:type="dxa" w:w="1108"/>
             <w:tcMar>
               <w:top w:type="dxa" w:w="60"/>
               <w:left w:type="dxa" w:w="90"/>
@@ -1480,7 +1840,7 @@
       <w:tr>
         <w:tc>
           <w:tcPr>
-            <w:tcW w:type="dxa" w:w="2100"/>
+            <w:tcW w:type="dxa" w:w="2116"/>
             <w:tcMar>
               <w:top w:type="dxa" w:w="60"/>
               <w:left w:type="dxa" w:w="90"/>
@@ -1506,7 +1866,7 @@
         </w:tc>
         <w:tc>
           <w:tcPr>
-            <w:tcW w:type="dxa" w:w="1100"/>
+            <w:tcW w:type="dxa" w:w="1108"/>
             <w:tcMar>
               <w:top w:type="dxa" w:w="60"/>
               <w:left w:type="dxa" w:w="90"/>
@@ -1532,7 +1892,7 @@
         </w:tc>
         <w:tc>
           <w:tcPr>
-            <w:tcW w:type="dxa" w:w="2400"/>
+            <w:tcW w:type="dxa" w:w="2418"/>
             <w:tcMar>
               <w:top w:type="dxa" w:w="60"/>
               <w:left w:type="dxa" w:w="90"/>
@@ -1558,7 +1918,7 @@
         </w:tc>
         <w:tc>
           <w:tcPr>
-            <w:tcW w:type="dxa" w:w="1100"/>
+            <w:tcW w:type="dxa" w:w="1108"/>
             <w:tcMar>
               <w:top w:type="dxa" w:w="60"/>
               <w:left w:type="dxa" w:w="90"/>
@@ -1584,7 +1944,7 @@
         </w:tc>
         <w:tc>
           <w:tcPr>
-            <w:tcW w:type="dxa" w:w="2100"/>
+            <w:tcW w:type="dxa" w:w="2116"/>
             <w:tcMar>
               <w:top w:type="dxa" w:w="60"/>
               <w:left w:type="dxa" w:w="90"/>
@@ -1610,7 +1970,7 @@
         </w:tc>
         <w:tc>
           <w:tcPr>
-            <w:tcW w:type="dxa" w:w="1100"/>
+            <w:tcW w:type="dxa" w:w="1108"/>
             <w:tcMar>
               <w:top w:type="dxa" w:w="60"/>
               <w:left w:type="dxa" w:w="90"/>
@@ -1694,1474 +2054,6 @@
       </w:r>
       <w:r>
         <w:t xml:space="preserve"> Con asimetría y curtosis en torno a −0,18, la distribución es casi simétrica y ligeramente más plana que la normal. No hay valores extremos que distorsionen el análisis, lo que habilita el uso de la media y de los procedimientos paramétricos del apartado 5.</w:t>
-      </w:r>
-    </w:p>
-    <w:p>
-      <w:pPr>
-        <w:spacing w:after="50" w:before="140"/>
-        <w:jc w:val="center"/>
-      </w:pPr>
-      <w:r>
-        <w:drawing>
-          <wp:inline distT="0" distB="0" distL="0" distR="0">
-            <wp:extent cx="5472684" cy="2845796"/>
-            <wp:effectExtent t="0" r="0" b="0" l="0"/>
-            <wp:docPr id="1" name="" descr="" title=""/>
-            <wp:cNvGraphicFramePr>
-              <a:graphicFrameLocks xmlns:a="http://schemas.openxmlformats.org/drawingml/2006/main" noChangeAspect="1"/>
-            </wp:cNvGraphicFramePr>
-            <a:graphic xmlns:a="http://schemas.openxmlformats.org/drawingml/2006/main">
-              <a:graphicData uri="http://schemas.openxmlformats.org/drawingml/2006/picture">
-                <pic:pic xmlns:pic="http://schemas.openxmlformats.org/drawingml/2006/picture">
-                  <pic:nvPicPr>
-                    <pic:cNvPr id="0" name="" descr=""/>
-                    <pic:cNvPicPr>
-                      <a:picLocks noChangeAspect="1" noChangeArrowheads="1"/>
-                    </pic:cNvPicPr>
-                  </pic:nvPicPr>
-                  <pic:blipFill>
-                    <a:blip r:embed="rId8" cstate="none"/>
-                    <a:srcRect/>
-                    <a:stretch>
-                      <a:fillRect/>
-                    </a:stretch>
-                  </pic:blipFill>
-                  <pic:spPr bwMode="auto">
-                    <a:xfrm>
-                      <a:off x="0" y="0"/>
-                      <a:ext cx="5472684" cy="2845796"/>
-                    </a:xfrm>
-                    <a:prstGeom prst="rect">
-                      <a:avLst/>
-                    </a:prstGeom>
-                  </pic:spPr>
-                </pic:pic>
-              </a:graphicData>
-            </a:graphic>
-          </wp:inline>
-        </w:drawing>
-      </w:r>
-    </w:p>
-    <w:p>
-      <w:pPr>
-        <w:spacing w:after="160"/>
-        <w:jc w:val="center"/>
-      </w:pPr>
-      <w:r>
-        <w:rPr>
-          <w:i/>
-          <w:iCs/>
-          <w:color w:val="555555"/>
-          <w:sz w:val="16"/>
-          <w:szCs w:val="16"/>
-        </w:rPr>
-        <w:t xml:space="preserve">Figura 1. Distribución del abandono aparente en los 9.678 programas analizados.</w:t>
-      </w:r>
-    </w:p>
-    <w:p>
-      <w:pPr>
-        <w:spacing w:after="120" w:line="264"/>
-        <w:jc w:val="both"/>
-      </w:pPr>
-      <w:r>
-        <w:t xml:space="preserve">La figura 1 muestra además dos acumulaciones en los extremos: </w:t>
-      </w:r>
-      <w:r>
-        <w:rPr>
-          <w:b/>
-          <w:bCs/>
-        </w:rPr>
-        <w:t xml:space="preserve">305 programas (3,2 %) con abandono exactamente cero</w:t>
-      </w:r>
-      <w:r>
-        <w:t xml:space="preserve"> y </w:t>
-      </w:r>
-      <w:r>
-        <w:rPr>
-          <w:b/>
-          <w:bCs/>
-        </w:rPr>
-        <w:t xml:space="preserve">160 (1,7 %) con abandono uno</w:t>
-      </w:r>
-      <w:r>
-        <w:t xml:space="preserve">. Los primeros titulan al menos tantas personas como ingresaron, por convalidaciones o traslados desde otras cohortes; los segundos cerraron sin titular a nadie. Juntos no llegan al 5 % y no alteran las medidas centrales, pero son el residuo visible de que la variable es aparente y no una medición directa.</w:t>
-      </w:r>
-    </w:p>
-    <w:p>
-      <w:pPr>
-        <w:pStyle w:val="Heading2"/>
-        <w:spacing w:after="90" w:before="180"/>
-      </w:pPr>
-      <w:r>
-        <w:rPr>
-          <w:b/>
-          <w:bCs/>
-          <w:color w:val="2E5496"/>
-          <w:sz w:val="22"/>
-          <w:szCs w:val="22"/>
-        </w:rPr>
-        <w:t xml:space="preserve">3.1 Comportamiento por grupos</w:t>
-      </w:r>
-    </w:p>
-    <w:p>
-      <w:pPr>
-        <w:spacing w:after="120" w:line="264"/>
-        <w:jc w:val="both"/>
-      </w:pPr>
-      <w:r>
-        <w:t xml:space="preserve">La media global oculta las diferencias que importan para decidir. El abandono medio recorre </w:t>
-      </w:r>
-      <w:r>
-        <w:rPr>
-          <w:b/>
-          <w:bCs/>
-        </w:rPr>
-        <w:t xml:space="preserve">12,3 puntos porcentuales</w:t>
-      </w:r>
-      <w:r>
-        <w:t xml:space="preserve"> entre tipos de institución y </w:t>
-      </w:r>
-      <w:r>
-        <w:rPr>
-          <w:b/>
-          <w:bCs/>
-        </w:rPr>
-        <w:t xml:space="preserve">17,5 puntos</w:t>
-      </w:r>
-      <w:r>
-        <w:t xml:space="preserve"> entre áreas del conocimiento:</w:t>
-      </w:r>
-    </w:p>
-    <w:tbl>
-      <w:tblPr>
-        <w:tblW w:type="pct" w:w="5000"/>
-        <w:tblBorders>
-          <w:top w:val="single" w:color="BFCDD8" w:sz="2"/>
-          <w:left w:val="single" w:color="BFCDD8" w:sz="2"/>
-          <w:bottom w:val="single" w:color="BFCDD8" w:sz="2"/>
-          <w:right w:val="single" w:color="BFCDD8" w:sz="2"/>
-          <w:insideH w:val="single" w:color="BFCDD8" w:sz="2"/>
-          <w:insideV w:val="single" w:color="BFCDD8" w:sz="2"/>
-        </w:tblBorders>
-      </w:tblPr>
-      <w:tblGrid>
-        <w:gridCol w:w="2500"/>
-        <w:gridCol w:w="700"/>
-        <w:gridCol w:w="800"/>
-        <w:gridCol w:w="700"/>
-        <w:gridCol w:w="2500"/>
-        <w:gridCol w:w="700"/>
-        <w:gridCol w:w="800"/>
-      </w:tblGrid>
-      <w:tr>
-        <w:trPr>
-          <w:tblHeader/>
-        </w:trPr>
-        <w:tc>
-          <w:tcPr>
-            <w:tcW w:type="dxa" w:w="2770"/>
-            <w:shd w:fill="F2F5F7" w:val="clear"/>
-            <w:tcMar>
-              <w:top w:type="dxa" w:w="60"/>
-              <w:left w:type="dxa" w:w="90"/>
-              <w:bottom w:type="dxa" w:w="60"/>
-              <w:right w:type="dxa" w:w="90"/>
-            </w:tcMar>
-          </w:tcPr>
-          <w:p>
-            <w:pPr>
-              <w:spacing w:after="0" w:line="240"/>
-              <w:jc w:val="left"/>
-            </w:pPr>
-            <w:r>
-              <w:rPr>
-                <w:b/>
-                <w:bCs/>
-                <w:sz w:val="17"/>
-                <w:szCs w:val="17"/>
-              </w:rPr>
-              <w:t xml:space="preserve">Tipo de institución</w:t>
-            </w:r>
-          </w:p>
-        </w:tc>
-        <w:tc>
-          <w:tcPr>
-            <w:tcW w:type="dxa" w:w="776"/>
-            <w:shd w:fill="F2F5F7" w:val="clear"/>
-            <w:tcMar>
-              <w:top w:type="dxa" w:w="60"/>
-              <w:left w:type="dxa" w:w="90"/>
-              <w:bottom w:type="dxa" w:w="60"/>
-              <w:right w:type="dxa" w:w="90"/>
-            </w:tcMar>
-          </w:tcPr>
-          <w:p>
-            <w:pPr>
-              <w:spacing w:after="0" w:line="240"/>
-              <w:jc w:val="center"/>
-            </w:pPr>
-            <w:r>
-              <w:rPr>
-                <w:b/>
-                <w:bCs/>
-                <w:sz w:val="17"/>
-                <w:szCs w:val="17"/>
-              </w:rPr>
-              <w:t xml:space="preserve">n</w:t>
-            </w:r>
-          </w:p>
-        </w:tc>
-        <w:tc>
-          <w:tcPr>
-            <w:tcW w:type="dxa" w:w="886"/>
-            <w:shd w:fill="F2F5F7" w:val="clear"/>
-            <w:tcMar>
-              <w:top w:type="dxa" w:w="60"/>
-              <w:left w:type="dxa" w:w="90"/>
-              <w:bottom w:type="dxa" w:w="60"/>
-              <w:right w:type="dxa" w:w="90"/>
-            </w:tcMar>
-          </w:tcPr>
-          <w:p>
-            <w:pPr>
-              <w:spacing w:after="0" w:line="240"/>
-              <w:jc w:val="center"/>
-            </w:pPr>
-            <w:r>
-              <w:rPr>
-                <w:b/>
-                <w:bCs/>
-                <w:sz w:val="17"/>
-                <w:szCs w:val="17"/>
-              </w:rPr>
-              <w:t xml:space="preserve">Media</w:t>
-            </w:r>
-          </w:p>
-        </w:tc>
-        <w:tc>
-          <w:tcPr>
-            <w:tcW w:type="dxa" w:w="776"/>
-            <w:shd w:fill="F2F5F7" w:val="clear"/>
-            <w:tcMar>
-              <w:top w:type="dxa" w:w="60"/>
-              <w:left w:type="dxa" w:w="90"/>
-              <w:bottom w:type="dxa" w:w="60"/>
-              <w:right w:type="dxa" w:w="90"/>
-            </w:tcMar>
-          </w:tcPr>
-          <w:p>
-            <w:pPr>
-              <w:spacing w:after="0" w:line="240"/>
-              <w:jc w:val="center"/>
-            </w:pPr>
-            <w:r>
-              <w:rPr>
-                <w:b/>
-                <w:bCs/>
-                <w:sz w:val="17"/>
-                <w:szCs w:val="17"/>
-              </w:rPr>
-              <w:t xml:space="preserve">DE</w:t>
-            </w:r>
-          </w:p>
-        </w:tc>
-        <w:tc>
-          <w:tcPr>
-            <w:tcW w:type="dxa" w:w="2770"/>
-            <w:shd w:fill="F2F5F7" w:val="clear"/>
-            <w:tcMar>
-              <w:top w:type="dxa" w:w="60"/>
-              <w:left w:type="dxa" w:w="90"/>
-              <w:bottom w:type="dxa" w:w="60"/>
-              <w:right w:type="dxa" w:w="90"/>
-            </w:tcMar>
-          </w:tcPr>
-          <w:p>
-            <w:pPr>
-              <w:spacing w:after="0" w:line="240"/>
-              <w:jc w:val="left"/>
-            </w:pPr>
-            <w:r>
-              <w:rPr>
-                <w:b/>
-                <w:bCs/>
-                <w:sz w:val="17"/>
-                <w:szCs w:val="17"/>
-              </w:rPr>
-              <w:t xml:space="preserve">Área del conocimiento</w:t>
-            </w:r>
-          </w:p>
-        </w:tc>
-        <w:tc>
-          <w:tcPr>
-            <w:tcW w:type="dxa" w:w="776"/>
-            <w:shd w:fill="F2F5F7" w:val="clear"/>
-            <w:tcMar>
-              <w:top w:type="dxa" w:w="60"/>
-              <w:left w:type="dxa" w:w="90"/>
-              <w:bottom w:type="dxa" w:w="60"/>
-              <w:right w:type="dxa" w:w="90"/>
-            </w:tcMar>
-          </w:tcPr>
-          <w:p>
-            <w:pPr>
-              <w:spacing w:after="0" w:line="240"/>
-              <w:jc w:val="center"/>
-            </w:pPr>
-            <w:r>
-              <w:rPr>
-                <w:b/>
-                <w:bCs/>
-                <w:sz w:val="17"/>
-                <w:szCs w:val="17"/>
-              </w:rPr>
-              <w:t xml:space="preserve">n</w:t>
-            </w:r>
-          </w:p>
-        </w:tc>
-        <w:tc>
-          <w:tcPr>
-            <w:tcW w:type="dxa" w:w="886"/>
-            <w:shd w:fill="F2F5F7" w:val="clear"/>
-            <w:tcMar>
-              <w:top w:type="dxa" w:w="60"/>
-              <w:left w:type="dxa" w:w="90"/>
-              <w:bottom w:type="dxa" w:w="60"/>
-              <w:right w:type="dxa" w:w="90"/>
-            </w:tcMar>
-          </w:tcPr>
-          <w:p>
-            <w:pPr>
-              <w:spacing w:after="0" w:line="240"/>
-              <w:jc w:val="center"/>
-            </w:pPr>
-            <w:r>
-              <w:rPr>
-                <w:b/>
-                <w:bCs/>
-                <w:sz w:val="17"/>
-                <w:szCs w:val="17"/>
-              </w:rPr>
-              <w:t xml:space="preserve">Media</w:t>
-            </w:r>
-          </w:p>
-        </w:tc>
-      </w:tr>
-      <w:tr>
-        <w:tc>
-          <w:tcPr>
-            <w:tcW w:type="dxa" w:w="2770"/>
-            <w:tcMar>
-              <w:top w:type="dxa" w:w="60"/>
-              <w:left w:type="dxa" w:w="90"/>
-              <w:bottom w:type="dxa" w:w="60"/>
-              <w:right w:type="dxa" w:w="90"/>
-            </w:tcMar>
-          </w:tcPr>
-          <w:p>
-            <w:pPr>
-              <w:spacing w:after="0" w:line="240"/>
-              <w:jc w:val="left"/>
-            </w:pPr>
-            <w:r>
-              <w:rPr>
-                <w:b w:val="false"/>
-                <w:bCs w:val="false"/>
-                <w:sz w:val="17"/>
-                <w:szCs w:val="17"/>
-              </w:rPr>
-              <w:t xml:space="preserve">CFT estatales</w:t>
-            </w:r>
-          </w:p>
-        </w:tc>
-        <w:tc>
-          <w:tcPr>
-            <w:tcW w:type="dxa" w:w="776"/>
-            <w:tcMar>
-              <w:top w:type="dxa" w:w="60"/>
-              <w:left w:type="dxa" w:w="90"/>
-              <w:bottom w:type="dxa" w:w="60"/>
-              <w:right w:type="dxa" w:w="90"/>
-            </w:tcMar>
-          </w:tcPr>
-          <w:p>
-            <w:pPr>
-              <w:spacing w:after="0" w:line="240"/>
-              <w:jc w:val="center"/>
-            </w:pPr>
-            <w:r>
-              <w:rPr>
-                <w:b w:val="false"/>
-                <w:bCs w:val="false"/>
-                <w:sz w:val="17"/>
-                <w:szCs w:val="17"/>
-              </w:rPr>
-              <w:t xml:space="preserve">27</w:t>
-            </w:r>
-          </w:p>
-        </w:tc>
-        <w:tc>
-          <w:tcPr>
-            <w:tcW w:type="dxa" w:w="886"/>
-            <w:tcMar>
-              <w:top w:type="dxa" w:w="60"/>
-              <w:left w:type="dxa" w:w="90"/>
-              <w:bottom w:type="dxa" w:w="60"/>
-              <w:right w:type="dxa" w:w="90"/>
-            </w:tcMar>
-          </w:tcPr>
-          <w:p>
-            <w:pPr>
-              <w:spacing w:after="0" w:line="240"/>
-              <w:jc w:val="center"/>
-            </w:pPr>
-            <w:r>
-              <w:rPr>
-                <w:b w:val="false"/>
-                <w:bCs w:val="false"/>
-                <w:sz w:val="17"/>
-                <w:szCs w:val="17"/>
-              </w:rPr>
-              <w:t xml:space="preserve">0,565</w:t>
-            </w:r>
-          </w:p>
-        </w:tc>
-        <w:tc>
-          <w:tcPr>
-            <w:tcW w:type="dxa" w:w="776"/>
-            <w:tcMar>
-              <w:top w:type="dxa" w:w="60"/>
-              <w:left w:type="dxa" w:w="90"/>
-              <w:bottom w:type="dxa" w:w="60"/>
-              <w:right w:type="dxa" w:w="90"/>
-            </w:tcMar>
-          </w:tcPr>
-          <w:p>
-            <w:pPr>
-              <w:spacing w:after="0" w:line="240"/>
-              <w:jc w:val="center"/>
-            </w:pPr>
-            <w:r>
-              <w:rPr>
-                <w:b w:val="false"/>
-                <w:bCs w:val="false"/>
-                <w:sz w:val="17"/>
-                <w:szCs w:val="17"/>
-              </w:rPr>
-              <w:t xml:space="preserve">0,127</w:t>
-            </w:r>
-          </w:p>
-        </w:tc>
-        <w:tc>
-          <w:tcPr>
-            <w:tcW w:type="dxa" w:w="2770"/>
-            <w:tcMar>
-              <w:top w:type="dxa" w:w="60"/>
-              <w:left w:type="dxa" w:w="90"/>
-              <w:bottom w:type="dxa" w:w="60"/>
-              <w:right w:type="dxa" w:w="90"/>
-            </w:tcMar>
-          </w:tcPr>
-          <w:p>
-            <w:pPr>
-              <w:spacing w:after="0" w:line="240"/>
-              <w:jc w:val="left"/>
-            </w:pPr>
-            <w:r>
-              <w:rPr>
-                <w:b w:val="false"/>
-                <w:bCs w:val="false"/>
-                <w:sz w:val="17"/>
-                <w:szCs w:val="17"/>
-              </w:rPr>
-              <w:t xml:space="preserve">Humanidades</w:t>
-            </w:r>
-          </w:p>
-        </w:tc>
-        <w:tc>
-          <w:tcPr>
-            <w:tcW w:type="dxa" w:w="776"/>
-            <w:tcMar>
-              <w:top w:type="dxa" w:w="60"/>
-              <w:left w:type="dxa" w:w="90"/>
-              <w:bottom w:type="dxa" w:w="60"/>
-              <w:right w:type="dxa" w:w="90"/>
-            </w:tcMar>
-          </w:tcPr>
-          <w:p>
-            <w:pPr>
-              <w:spacing w:after="0" w:line="240"/>
-              <w:jc w:val="center"/>
-            </w:pPr>
-            <w:r>
-              <w:rPr>
-                <w:b w:val="false"/>
-                <w:bCs w:val="false"/>
-                <w:sz w:val="17"/>
-                <w:szCs w:val="17"/>
-              </w:rPr>
-              <w:t xml:space="preserve">78</w:t>
-            </w:r>
-          </w:p>
-        </w:tc>
-        <w:tc>
-          <w:tcPr>
-            <w:tcW w:type="dxa" w:w="886"/>
-            <w:tcMar>
-              <w:top w:type="dxa" w:w="60"/>
-              <w:left w:type="dxa" w:w="90"/>
-              <w:bottom w:type="dxa" w:w="60"/>
-              <w:right w:type="dxa" w:w="90"/>
-            </w:tcMar>
-          </w:tcPr>
-          <w:p>
-            <w:pPr>
-              <w:spacing w:after="0" w:line="240"/>
-              <w:jc w:val="center"/>
-            </w:pPr>
-            <w:r>
-              <w:rPr>
-                <w:b w:val="false"/>
-                <w:bCs w:val="false"/>
-                <w:sz w:val="17"/>
-                <w:szCs w:val="17"/>
-              </w:rPr>
-              <w:t xml:space="preserve">0,643</w:t>
-            </w:r>
-          </w:p>
-        </w:tc>
-      </w:tr>
-      <w:tr>
-        <w:tc>
-          <w:tcPr>
-            <w:tcW w:type="dxa" w:w="2770"/>
-            <w:tcMar>
-              <w:top w:type="dxa" w:w="60"/>
-              <w:left w:type="dxa" w:w="90"/>
-              <w:bottom w:type="dxa" w:w="60"/>
-              <w:right w:type="dxa" w:w="90"/>
-            </w:tcMar>
-          </w:tcPr>
-          <w:p>
-            <w:pPr>
-              <w:spacing w:after="0" w:line="240"/>
-              <w:jc w:val="left"/>
-            </w:pPr>
-            <w:r>
-              <w:rPr>
-                <w:b w:val="false"/>
-                <w:bCs w:val="false"/>
-                <w:sz w:val="17"/>
-                <w:szCs w:val="17"/>
-              </w:rPr>
-              <w:t xml:space="preserve">CFT privados</w:t>
-            </w:r>
-          </w:p>
-        </w:tc>
-        <w:tc>
-          <w:tcPr>
-            <w:tcW w:type="dxa" w:w="776"/>
-            <w:tcMar>
-              <w:top w:type="dxa" w:w="60"/>
-              <w:left w:type="dxa" w:w="90"/>
-              <w:bottom w:type="dxa" w:w="60"/>
-              <w:right w:type="dxa" w:w="90"/>
-            </w:tcMar>
-          </w:tcPr>
-          <w:p>
-            <w:pPr>
-              <w:spacing w:after="0" w:line="240"/>
-              <w:jc w:val="center"/>
-            </w:pPr>
-            <w:r>
-              <w:rPr>
-                <w:b w:val="false"/>
-                <w:bCs w:val="false"/>
-                <w:sz w:val="17"/>
-                <w:szCs w:val="17"/>
-              </w:rPr>
-              <w:t xml:space="preserve">2.263</w:t>
-            </w:r>
-          </w:p>
-        </w:tc>
-        <w:tc>
-          <w:tcPr>
-            <w:tcW w:type="dxa" w:w="886"/>
-            <w:tcMar>
-              <w:top w:type="dxa" w:w="60"/>
-              <w:left w:type="dxa" w:w="90"/>
-              <w:bottom w:type="dxa" w:w="60"/>
-              <w:right w:type="dxa" w:w="90"/>
-            </w:tcMar>
-          </w:tcPr>
-          <w:p>
-            <w:pPr>
-              <w:spacing w:after="0" w:line="240"/>
-              <w:jc w:val="center"/>
-            </w:pPr>
-            <w:r>
-              <w:rPr>
-                <w:b w:val="false"/>
-                <w:bCs w:val="false"/>
-                <w:sz w:val="17"/>
-                <w:szCs w:val="17"/>
-              </w:rPr>
-              <w:t xml:space="preserve">0,542</w:t>
-            </w:r>
-          </w:p>
-        </w:tc>
-        <w:tc>
-          <w:tcPr>
-            <w:tcW w:type="dxa" w:w="776"/>
-            <w:tcMar>
-              <w:top w:type="dxa" w:w="60"/>
-              <w:left w:type="dxa" w:w="90"/>
-              <w:bottom w:type="dxa" w:w="60"/>
-              <w:right w:type="dxa" w:w="90"/>
-            </w:tcMar>
-          </w:tcPr>
-          <w:p>
-            <w:pPr>
-              <w:spacing w:after="0" w:line="240"/>
-              <w:jc w:val="center"/>
-            </w:pPr>
-            <w:r>
-              <w:rPr>
-                <w:b w:val="false"/>
-                <w:bCs w:val="false"/>
-                <w:sz w:val="17"/>
-                <w:szCs w:val="17"/>
-              </w:rPr>
-              <w:t xml:space="preserve">0,195</w:t>
-            </w:r>
-          </w:p>
-        </w:tc>
-        <w:tc>
-          <w:tcPr>
-            <w:tcW w:type="dxa" w:w="2770"/>
-            <w:tcMar>
-              <w:top w:type="dxa" w:w="60"/>
-              <w:left w:type="dxa" w:w="90"/>
-              <w:bottom w:type="dxa" w:w="60"/>
-              <w:right w:type="dxa" w:w="90"/>
-            </w:tcMar>
-          </w:tcPr>
-          <w:p>
-            <w:pPr>
-              <w:spacing w:after="0" w:line="240"/>
-              <w:jc w:val="left"/>
-            </w:pPr>
-            <w:r>
-              <w:rPr>
-                <w:b w:val="false"/>
-                <w:bCs w:val="false"/>
-                <w:sz w:val="17"/>
-                <w:szCs w:val="17"/>
-              </w:rPr>
-              <w:t xml:space="preserve">Derecho</w:t>
-            </w:r>
-          </w:p>
-        </w:tc>
-        <w:tc>
-          <w:tcPr>
-            <w:tcW w:type="dxa" w:w="776"/>
-            <w:tcMar>
-              <w:top w:type="dxa" w:w="60"/>
-              <w:left w:type="dxa" w:w="90"/>
-              <w:bottom w:type="dxa" w:w="60"/>
-              <w:right w:type="dxa" w:w="90"/>
-            </w:tcMar>
-          </w:tcPr>
-          <w:p>
-            <w:pPr>
-              <w:spacing w:after="0" w:line="240"/>
-              <w:jc w:val="center"/>
-            </w:pPr>
-            <w:r>
-              <w:rPr>
-                <w:b w:val="false"/>
-                <w:bCs w:val="false"/>
-                <w:sz w:val="17"/>
-                <w:szCs w:val="17"/>
-              </w:rPr>
-              <w:t xml:space="preserve">224</w:t>
-            </w:r>
-          </w:p>
-        </w:tc>
-        <w:tc>
-          <w:tcPr>
-            <w:tcW w:type="dxa" w:w="886"/>
-            <w:tcMar>
-              <w:top w:type="dxa" w:w="60"/>
-              <w:left w:type="dxa" w:w="90"/>
-              <w:bottom w:type="dxa" w:w="60"/>
-              <w:right w:type="dxa" w:w="90"/>
-            </w:tcMar>
-          </w:tcPr>
-          <w:p>
-            <w:pPr>
-              <w:spacing w:after="0" w:line="240"/>
-              <w:jc w:val="center"/>
-            </w:pPr>
-            <w:r>
-              <w:rPr>
-                <w:b w:val="false"/>
-                <w:bCs w:val="false"/>
-                <w:sz w:val="17"/>
-                <w:szCs w:val="17"/>
-              </w:rPr>
-              <w:t xml:space="preserve">0,641</w:t>
-            </w:r>
-          </w:p>
-        </w:tc>
-      </w:tr>
-      <w:tr>
-        <w:tc>
-          <w:tcPr>
-            <w:tcW w:type="dxa" w:w="2770"/>
-            <w:tcMar>
-              <w:top w:type="dxa" w:w="60"/>
-              <w:left w:type="dxa" w:w="90"/>
-              <w:bottom w:type="dxa" w:w="60"/>
-              <w:right w:type="dxa" w:w="90"/>
-            </w:tcMar>
-          </w:tcPr>
-          <w:p>
-            <w:pPr>
-              <w:spacing w:after="0" w:line="240"/>
-              <w:jc w:val="left"/>
-            </w:pPr>
-            <w:r>
-              <w:rPr>
-                <w:b w:val="false"/>
-                <w:bCs w:val="false"/>
-                <w:sz w:val="17"/>
-                <w:szCs w:val="17"/>
-              </w:rPr>
-              <w:t xml:space="preserve">Institutos profesionales</w:t>
-            </w:r>
-          </w:p>
-        </w:tc>
-        <w:tc>
-          <w:tcPr>
-            <w:tcW w:type="dxa" w:w="776"/>
-            <w:tcMar>
-              <w:top w:type="dxa" w:w="60"/>
-              <w:left w:type="dxa" w:w="90"/>
-              <w:bottom w:type="dxa" w:w="60"/>
-              <w:right w:type="dxa" w:w="90"/>
-            </w:tcMar>
-          </w:tcPr>
-          <w:p>
-            <w:pPr>
-              <w:spacing w:after="0" w:line="240"/>
-              <w:jc w:val="center"/>
-            </w:pPr>
-            <w:r>
-              <w:rPr>
-                <w:b w:val="false"/>
-                <w:bCs w:val="false"/>
-                <w:sz w:val="17"/>
-                <w:szCs w:val="17"/>
-              </w:rPr>
-              <w:t xml:space="preserve">3.759</w:t>
-            </w:r>
-          </w:p>
-        </w:tc>
-        <w:tc>
-          <w:tcPr>
-            <w:tcW w:type="dxa" w:w="886"/>
-            <w:tcMar>
-              <w:top w:type="dxa" w:w="60"/>
-              <w:left w:type="dxa" w:w="90"/>
-              <w:bottom w:type="dxa" w:w="60"/>
-              <w:right w:type="dxa" w:w="90"/>
-            </w:tcMar>
-          </w:tcPr>
-          <w:p>
-            <w:pPr>
-              <w:spacing w:after="0" w:line="240"/>
-              <w:jc w:val="center"/>
-            </w:pPr>
-            <w:r>
-              <w:rPr>
-                <w:b w:val="false"/>
-                <w:bCs w:val="false"/>
-                <w:sz w:val="17"/>
-                <w:szCs w:val="17"/>
-              </w:rPr>
-              <w:t xml:space="preserve">0,528</w:t>
-            </w:r>
-          </w:p>
-        </w:tc>
-        <w:tc>
-          <w:tcPr>
-            <w:tcW w:type="dxa" w:w="776"/>
-            <w:tcMar>
-              <w:top w:type="dxa" w:w="60"/>
-              <w:left w:type="dxa" w:w="90"/>
-              <w:bottom w:type="dxa" w:w="60"/>
-              <w:right w:type="dxa" w:w="90"/>
-            </w:tcMar>
-          </w:tcPr>
-          <w:p>
-            <w:pPr>
-              <w:spacing w:after="0" w:line="240"/>
-              <w:jc w:val="center"/>
-            </w:pPr>
-            <w:r>
-              <w:rPr>
-                <w:b w:val="false"/>
-                <w:bCs w:val="false"/>
-                <w:sz w:val="17"/>
-                <w:szCs w:val="17"/>
-              </w:rPr>
-              <w:t xml:space="preserve">0,232</w:t>
-            </w:r>
-          </w:p>
-        </w:tc>
-        <w:tc>
-          <w:tcPr>
-            <w:tcW w:type="dxa" w:w="2770"/>
-            <w:tcMar>
-              <w:top w:type="dxa" w:w="60"/>
-              <w:left w:type="dxa" w:w="90"/>
-              <w:bottom w:type="dxa" w:w="60"/>
-              <w:right w:type="dxa" w:w="90"/>
-            </w:tcMar>
-          </w:tcPr>
-          <w:p>
-            <w:pPr>
-              <w:spacing w:after="0" w:line="240"/>
-              <w:jc w:val="left"/>
-            </w:pPr>
-            <w:r>
-              <w:rPr>
-                <w:b w:val="false"/>
-                <w:bCs w:val="false"/>
-                <w:sz w:val="17"/>
-                <w:szCs w:val="17"/>
-              </w:rPr>
-              <w:t xml:space="preserve">Arte y Arquitectura</w:t>
-            </w:r>
-          </w:p>
-        </w:tc>
-        <w:tc>
-          <w:tcPr>
-            <w:tcW w:type="dxa" w:w="776"/>
-            <w:tcMar>
-              <w:top w:type="dxa" w:w="60"/>
-              <w:left w:type="dxa" w:w="90"/>
-              <w:bottom w:type="dxa" w:w="60"/>
-              <w:right w:type="dxa" w:w="90"/>
-            </w:tcMar>
-          </w:tcPr>
-          <w:p>
-            <w:pPr>
-              <w:spacing w:after="0" w:line="240"/>
-              <w:jc w:val="center"/>
-            </w:pPr>
-            <w:r>
-              <w:rPr>
-                <w:b w:val="false"/>
-                <w:bCs w:val="false"/>
-                <w:sz w:val="17"/>
-                <w:szCs w:val="17"/>
-              </w:rPr>
-              <w:t xml:space="preserve">490</w:t>
-            </w:r>
-          </w:p>
-        </w:tc>
-        <w:tc>
-          <w:tcPr>
-            <w:tcW w:type="dxa" w:w="886"/>
-            <w:tcMar>
-              <w:top w:type="dxa" w:w="60"/>
-              <w:left w:type="dxa" w:w="90"/>
-              <w:bottom w:type="dxa" w:w="60"/>
-              <w:right w:type="dxa" w:w="90"/>
-            </w:tcMar>
-          </w:tcPr>
-          <w:p>
-            <w:pPr>
-              <w:spacing w:after="0" w:line="240"/>
-              <w:jc w:val="center"/>
-            </w:pPr>
-            <w:r>
-              <w:rPr>
-                <w:b w:val="false"/>
-                <w:bCs w:val="false"/>
-                <w:sz w:val="17"/>
-                <w:szCs w:val="17"/>
-              </w:rPr>
-              <w:t xml:space="preserve">0,585</w:t>
-            </w:r>
-          </w:p>
-        </w:tc>
-      </w:tr>
-      <w:tr>
-        <w:tc>
-          <w:tcPr>
-            <w:tcW w:type="dxa" w:w="2770"/>
-            <w:tcMar>
-              <w:top w:type="dxa" w:w="60"/>
-              <w:left w:type="dxa" w:w="90"/>
-              <w:bottom w:type="dxa" w:w="60"/>
-              <w:right w:type="dxa" w:w="90"/>
-            </w:tcMar>
-          </w:tcPr>
-          <w:p>
-            <w:pPr>
-              <w:spacing w:after="0" w:line="240"/>
-              <w:jc w:val="left"/>
-            </w:pPr>
-            <w:r>
-              <w:rPr>
-                <w:b w:val="false"/>
-                <w:bCs w:val="false"/>
-                <w:sz w:val="17"/>
-                <w:szCs w:val="17"/>
-              </w:rPr>
-              <w:t xml:space="preserve">Universidades privadas</w:t>
-            </w:r>
-          </w:p>
-        </w:tc>
-        <w:tc>
-          <w:tcPr>
-            <w:tcW w:type="dxa" w:w="776"/>
-            <w:tcMar>
-              <w:top w:type="dxa" w:w="60"/>
-              <w:left w:type="dxa" w:w="90"/>
-              <w:bottom w:type="dxa" w:w="60"/>
-              <w:right w:type="dxa" w:w="90"/>
-            </w:tcMar>
-          </w:tcPr>
-          <w:p>
-            <w:pPr>
-              <w:spacing w:after="0" w:line="240"/>
-              <w:jc w:val="center"/>
-            </w:pPr>
-            <w:r>
-              <w:rPr>
-                <w:b w:val="false"/>
-                <w:bCs w:val="false"/>
-                <w:sz w:val="17"/>
-                <w:szCs w:val="17"/>
-              </w:rPr>
-              <w:t xml:space="preserve">2.012</w:t>
-            </w:r>
-          </w:p>
-        </w:tc>
-        <w:tc>
-          <w:tcPr>
-            <w:tcW w:type="dxa" w:w="886"/>
-            <w:tcMar>
-              <w:top w:type="dxa" w:w="60"/>
-              <w:left w:type="dxa" w:w="90"/>
-              <w:bottom w:type="dxa" w:w="60"/>
-              <w:right w:type="dxa" w:w="90"/>
-            </w:tcMar>
-          </w:tcPr>
-          <w:p>
-            <w:pPr>
-              <w:spacing w:after="0" w:line="240"/>
-              <w:jc w:val="center"/>
-            </w:pPr>
-            <w:r>
-              <w:rPr>
-                <w:b w:val="false"/>
-                <w:bCs w:val="false"/>
-                <w:sz w:val="17"/>
-                <w:szCs w:val="17"/>
-              </w:rPr>
-              <w:t xml:space="preserve">0,509</w:t>
-            </w:r>
-          </w:p>
-        </w:tc>
-        <w:tc>
-          <w:tcPr>
-            <w:tcW w:type="dxa" w:w="776"/>
-            <w:tcMar>
-              <w:top w:type="dxa" w:w="60"/>
-              <w:left w:type="dxa" w:w="90"/>
-              <w:bottom w:type="dxa" w:w="60"/>
-              <w:right w:type="dxa" w:w="90"/>
-            </w:tcMar>
-          </w:tcPr>
-          <w:p>
-            <w:pPr>
-              <w:spacing w:after="0" w:line="240"/>
-              <w:jc w:val="center"/>
-            </w:pPr>
-            <w:r>
-              <w:rPr>
-                <w:b w:val="false"/>
-                <w:bCs w:val="false"/>
-                <w:sz w:val="17"/>
-                <w:szCs w:val="17"/>
-              </w:rPr>
-              <w:t xml:space="preserve">0,237</w:t>
-            </w:r>
-          </w:p>
-        </w:tc>
-        <w:tc>
-          <w:tcPr>
-            <w:tcW w:type="dxa" w:w="2770"/>
-            <w:tcMar>
-              <w:top w:type="dxa" w:w="60"/>
-              <w:left w:type="dxa" w:w="90"/>
-              <w:bottom w:type="dxa" w:w="60"/>
-              <w:right w:type="dxa" w:w="90"/>
-            </w:tcMar>
-          </w:tcPr>
-          <w:p>
-            <w:pPr>
-              <w:spacing w:after="0" w:line="240"/>
-              <w:jc w:val="left"/>
-            </w:pPr>
-            <w:r>
-              <w:rPr>
-                <w:b w:val="false"/>
-                <w:bCs w:val="false"/>
-                <w:sz w:val="17"/>
-                <w:szCs w:val="17"/>
-              </w:rPr>
-              <w:t xml:space="preserve">Tecnología</w:t>
-            </w:r>
-          </w:p>
-        </w:tc>
-        <w:tc>
-          <w:tcPr>
-            <w:tcW w:type="dxa" w:w="776"/>
-            <w:tcMar>
-              <w:top w:type="dxa" w:w="60"/>
-              <w:left w:type="dxa" w:w="90"/>
-              <w:bottom w:type="dxa" w:w="60"/>
-              <w:right w:type="dxa" w:w="90"/>
-            </w:tcMar>
-          </w:tcPr>
-          <w:p>
-            <w:pPr>
-              <w:spacing w:after="0" w:line="240"/>
-              <w:jc w:val="center"/>
-            </w:pPr>
-            <w:r>
-              <w:rPr>
-                <w:b w:val="false"/>
-                <w:bCs w:val="false"/>
-                <w:sz w:val="17"/>
-                <w:szCs w:val="17"/>
-              </w:rPr>
-              <w:t xml:space="preserve">3.009</w:t>
-            </w:r>
-          </w:p>
-        </w:tc>
-        <w:tc>
-          <w:tcPr>
-            <w:tcW w:type="dxa" w:w="886"/>
-            <w:tcMar>
-              <w:top w:type="dxa" w:w="60"/>
-              <w:left w:type="dxa" w:w="90"/>
-              <w:bottom w:type="dxa" w:w="60"/>
-              <w:right w:type="dxa" w:w="90"/>
-            </w:tcMar>
-          </w:tcPr>
-          <w:p>
-            <w:pPr>
-              <w:spacing w:after="0" w:line="240"/>
-              <w:jc w:val="center"/>
-            </w:pPr>
-            <w:r>
-              <w:rPr>
-                <w:b w:val="false"/>
-                <w:bCs w:val="false"/>
-                <w:sz w:val="17"/>
-                <w:szCs w:val="17"/>
-              </w:rPr>
-              <w:t xml:space="preserve">0,555</w:t>
-            </w:r>
-          </w:p>
-        </w:tc>
-      </w:tr>
-      <w:tr>
-        <w:tc>
-          <w:tcPr>
-            <w:tcW w:type="dxa" w:w="2770"/>
-            <w:tcMar>
-              <w:top w:type="dxa" w:w="60"/>
-              <w:left w:type="dxa" w:w="90"/>
-              <w:bottom w:type="dxa" w:w="60"/>
-              <w:right w:type="dxa" w:w="90"/>
-            </w:tcMar>
-          </w:tcPr>
-          <w:p>
-            <w:pPr>
-              <w:spacing w:after="0" w:line="240"/>
-              <w:jc w:val="left"/>
-            </w:pPr>
-            <w:r>
-              <w:rPr>
-                <w:b w:val="false"/>
-                <w:bCs w:val="false"/>
-                <w:sz w:val="17"/>
-                <w:szCs w:val="17"/>
-              </w:rPr>
-              <w:t xml:space="preserve">U. estatales CRUCH</w:t>
-            </w:r>
-          </w:p>
-        </w:tc>
-        <w:tc>
-          <w:tcPr>
-            <w:tcW w:type="dxa" w:w="776"/>
-            <w:tcMar>
-              <w:top w:type="dxa" w:w="60"/>
-              <w:left w:type="dxa" w:w="90"/>
-              <w:bottom w:type="dxa" w:w="60"/>
-              <w:right w:type="dxa" w:w="90"/>
-            </w:tcMar>
-          </w:tcPr>
-          <w:p>
-            <w:pPr>
-              <w:spacing w:after="0" w:line="240"/>
-              <w:jc w:val="center"/>
-            </w:pPr>
-            <w:r>
-              <w:rPr>
-                <w:b w:val="false"/>
-                <w:bCs w:val="false"/>
-                <w:sz w:val="17"/>
-                <w:szCs w:val="17"/>
-              </w:rPr>
-              <w:t xml:space="preserve">932</w:t>
-            </w:r>
-          </w:p>
-        </w:tc>
-        <w:tc>
-          <w:tcPr>
-            <w:tcW w:type="dxa" w:w="886"/>
-            <w:tcMar>
-              <w:top w:type="dxa" w:w="60"/>
-              <w:left w:type="dxa" w:w="90"/>
-              <w:bottom w:type="dxa" w:w="60"/>
-              <w:right w:type="dxa" w:w="90"/>
-            </w:tcMar>
-          </w:tcPr>
-          <w:p>
-            <w:pPr>
-              <w:spacing w:after="0" w:line="240"/>
-              <w:jc w:val="center"/>
-            </w:pPr>
-            <w:r>
-              <w:rPr>
-                <w:b w:val="false"/>
-                <w:bCs w:val="false"/>
-                <w:sz w:val="17"/>
-                <w:szCs w:val="17"/>
-              </w:rPr>
-              <w:t xml:space="preserve">0,494</w:t>
-            </w:r>
-          </w:p>
-        </w:tc>
-        <w:tc>
-          <w:tcPr>
-            <w:tcW w:type="dxa" w:w="776"/>
-            <w:tcMar>
-              <w:top w:type="dxa" w:w="60"/>
-              <w:left w:type="dxa" w:w="90"/>
-              <w:bottom w:type="dxa" w:w="60"/>
-              <w:right w:type="dxa" w:w="90"/>
-            </w:tcMar>
-          </w:tcPr>
-          <w:p>
-            <w:pPr>
-              <w:spacing w:after="0" w:line="240"/>
-              <w:jc w:val="center"/>
-            </w:pPr>
-            <w:r>
-              <w:rPr>
-                <w:b w:val="false"/>
-                <w:bCs w:val="false"/>
-                <w:sz w:val="17"/>
-                <w:szCs w:val="17"/>
-              </w:rPr>
-              <w:t xml:space="preserve">0,223</w:t>
-            </w:r>
-          </w:p>
-        </w:tc>
-        <w:tc>
-          <w:tcPr>
-            <w:tcW w:type="dxa" w:w="2770"/>
-            <w:tcMar>
-              <w:top w:type="dxa" w:w="60"/>
-              <w:left w:type="dxa" w:w="90"/>
-              <w:bottom w:type="dxa" w:w="60"/>
-              <w:right w:type="dxa" w:w="90"/>
-            </w:tcMar>
-          </w:tcPr>
-          <w:p>
-            <w:pPr>
-              <w:spacing w:after="0" w:line="240"/>
-              <w:jc w:val="left"/>
-            </w:pPr>
-            <w:r>
-              <w:rPr>
-                <w:b w:val="false"/>
-                <w:bCs w:val="false"/>
-                <w:sz w:val="17"/>
-                <w:szCs w:val="17"/>
-              </w:rPr>
-              <w:t xml:space="preserve">Educación</w:t>
-            </w:r>
-          </w:p>
-        </w:tc>
-        <w:tc>
-          <w:tcPr>
-            <w:tcW w:type="dxa" w:w="776"/>
-            <w:tcMar>
-              <w:top w:type="dxa" w:w="60"/>
-              <w:left w:type="dxa" w:w="90"/>
-              <w:bottom w:type="dxa" w:w="60"/>
-              <w:right w:type="dxa" w:w="90"/>
-            </w:tcMar>
-          </w:tcPr>
-          <w:p>
-            <w:pPr>
-              <w:spacing w:after="0" w:line="240"/>
-              <w:jc w:val="center"/>
-            </w:pPr>
-            <w:r>
-              <w:rPr>
-                <w:b w:val="false"/>
-                <w:bCs w:val="false"/>
-                <w:sz w:val="17"/>
-                <w:szCs w:val="17"/>
-              </w:rPr>
-              <w:t xml:space="preserve">1.344</w:t>
-            </w:r>
-          </w:p>
-        </w:tc>
-        <w:tc>
-          <w:tcPr>
-            <w:tcW w:type="dxa" w:w="886"/>
-            <w:tcMar>
-              <w:top w:type="dxa" w:w="60"/>
-              <w:left w:type="dxa" w:w="90"/>
-              <w:bottom w:type="dxa" w:w="60"/>
-              <w:right w:type="dxa" w:w="90"/>
-            </w:tcMar>
-          </w:tcPr>
-          <w:p>
-            <w:pPr>
-              <w:spacing w:after="0" w:line="240"/>
-              <w:jc w:val="center"/>
-            </w:pPr>
-            <w:r>
-              <w:rPr>
-                <w:b w:val="false"/>
-                <w:bCs w:val="false"/>
-                <w:sz w:val="17"/>
-                <w:szCs w:val="17"/>
-              </w:rPr>
-              <w:t xml:space="preserve">0,476</w:t>
-            </w:r>
-          </w:p>
-        </w:tc>
-      </w:tr>
-      <w:tr>
-        <w:tc>
-          <w:tcPr>
-            <w:tcW w:type="dxa" w:w="2770"/>
-            <w:tcMar>
-              <w:top w:type="dxa" w:w="60"/>
-              <w:left w:type="dxa" w:w="90"/>
-              <w:bottom w:type="dxa" w:w="60"/>
-              <w:right w:type="dxa" w:w="90"/>
-            </w:tcMar>
-          </w:tcPr>
-          <w:p>
-            <w:pPr>
-              <w:spacing w:after="0" w:line="240"/>
-              <w:jc w:val="left"/>
-            </w:pPr>
-            <w:r>
-              <w:rPr>
-                <w:b w:val="false"/>
-                <w:bCs w:val="false"/>
-                <w:sz w:val="17"/>
-                <w:szCs w:val="17"/>
-              </w:rPr>
-              <w:t xml:space="preserve">U. privadas CRUCH</w:t>
-            </w:r>
-          </w:p>
-        </w:tc>
-        <w:tc>
-          <w:tcPr>
-            <w:tcW w:type="dxa" w:w="776"/>
-            <w:tcMar>
-              <w:top w:type="dxa" w:w="60"/>
-              <w:left w:type="dxa" w:w="90"/>
-              <w:bottom w:type="dxa" w:w="60"/>
-              <w:right w:type="dxa" w:w="90"/>
-            </w:tcMar>
-          </w:tcPr>
-          <w:p>
-            <w:pPr>
-              <w:spacing w:after="0" w:line="240"/>
-              <w:jc w:val="center"/>
-            </w:pPr>
-            <w:r>
-              <w:rPr>
-                <w:b w:val="false"/>
-                <w:bCs w:val="false"/>
-                <w:sz w:val="17"/>
-                <w:szCs w:val="17"/>
-              </w:rPr>
-              <w:t xml:space="preserve">685</w:t>
-            </w:r>
-          </w:p>
-        </w:tc>
-        <w:tc>
-          <w:tcPr>
-            <w:tcW w:type="dxa" w:w="886"/>
-            <w:tcMar>
-              <w:top w:type="dxa" w:w="60"/>
-              <w:left w:type="dxa" w:w="90"/>
-              <w:bottom w:type="dxa" w:w="60"/>
-              <w:right w:type="dxa" w:w="90"/>
-            </w:tcMar>
-          </w:tcPr>
-          <w:p>
-            <w:pPr>
-              <w:spacing w:after="0" w:line="240"/>
-              <w:jc w:val="center"/>
-            </w:pPr>
-            <w:r>
-              <w:rPr>
-                <w:b w:val="false"/>
-                <w:bCs w:val="false"/>
-                <w:sz w:val="17"/>
-                <w:szCs w:val="17"/>
-              </w:rPr>
-              <w:t xml:space="preserve">0,442</w:t>
-            </w:r>
-          </w:p>
-        </w:tc>
-        <w:tc>
-          <w:tcPr>
-            <w:tcW w:type="dxa" w:w="776"/>
-            <w:tcMar>
-              <w:top w:type="dxa" w:w="60"/>
-              <w:left w:type="dxa" w:w="90"/>
-              <w:bottom w:type="dxa" w:w="60"/>
-              <w:right w:type="dxa" w:w="90"/>
-            </w:tcMar>
-          </w:tcPr>
-          <w:p>
-            <w:pPr>
-              <w:spacing w:after="0" w:line="240"/>
-              <w:jc w:val="center"/>
-            </w:pPr>
-            <w:r>
-              <w:rPr>
-                <w:b w:val="false"/>
-                <w:bCs w:val="false"/>
-                <w:sz w:val="17"/>
-                <w:szCs w:val="17"/>
-              </w:rPr>
-              <w:t xml:space="preserve">0,213</w:t>
-            </w:r>
-          </w:p>
-        </w:tc>
-        <w:tc>
-          <w:tcPr>
-            <w:tcW w:type="dxa" w:w="2770"/>
-            <w:tcMar>
-              <w:top w:type="dxa" w:w="60"/>
-              <w:left w:type="dxa" w:w="90"/>
-              <w:bottom w:type="dxa" w:w="60"/>
-              <w:right w:type="dxa" w:w="90"/>
-            </w:tcMar>
-          </w:tcPr>
-          <w:p>
-            <w:pPr>
-              <w:spacing w:after="0" w:line="240"/>
-              <w:jc w:val="left"/>
-            </w:pPr>
-            <w:r>
-              <w:rPr>
-                <w:b w:val="false"/>
-                <w:bCs w:val="false"/>
-                <w:sz w:val="17"/>
-                <w:szCs w:val="17"/>
-              </w:rPr>
-              <w:t xml:space="preserve">Salud</w:t>
-            </w:r>
-          </w:p>
-        </w:tc>
-        <w:tc>
-          <w:tcPr>
-            <w:tcW w:type="dxa" w:w="776"/>
-            <w:tcMar>
-              <w:top w:type="dxa" w:w="60"/>
-              <w:left w:type="dxa" w:w="90"/>
-              <w:bottom w:type="dxa" w:w="60"/>
-              <w:right w:type="dxa" w:w="90"/>
-            </w:tcMar>
-          </w:tcPr>
-          <w:p>
-            <w:pPr>
-              <w:spacing w:after="0" w:line="240"/>
-              <w:jc w:val="center"/>
-            </w:pPr>
-            <w:r>
-              <w:rPr>
-                <w:b w:val="false"/>
-                <w:bCs w:val="false"/>
-                <w:sz w:val="17"/>
-                <w:szCs w:val="17"/>
-              </w:rPr>
-              <w:t xml:space="preserve">1.355</w:t>
-            </w:r>
-          </w:p>
-        </w:tc>
-        <w:tc>
-          <w:tcPr>
-            <w:tcW w:type="dxa" w:w="886"/>
-            <w:tcMar>
-              <w:top w:type="dxa" w:w="60"/>
-              <w:left w:type="dxa" w:w="90"/>
-              <w:bottom w:type="dxa" w:w="60"/>
-              <w:right w:type="dxa" w:w="90"/>
-            </w:tcMar>
-          </w:tcPr>
-          <w:p>
-            <w:pPr>
-              <w:spacing w:after="0" w:line="240"/>
-              <w:jc w:val="center"/>
-            </w:pPr>
-            <w:r>
-              <w:rPr>
-                <w:b w:val="false"/>
-                <w:bCs w:val="false"/>
-                <w:sz w:val="17"/>
-                <w:szCs w:val="17"/>
-              </w:rPr>
-              <w:t xml:space="preserve">0,468</w:t>
-            </w:r>
-          </w:p>
-        </w:tc>
-      </w:tr>
-    </w:tbl>
-    <w:p>
-      <w:pPr>
-        <w:spacing w:after="110"/>
-      </w:pPr>
-      <w:r>
-        <w:rPr>
-          <w:sz w:val="8"/>
-          <w:szCs w:val="8"/>
-        </w:rPr>
-        <w:t xml:space="preserve"/>
       </w:r>
     </w:p>
     <w:p>
@@ -3223,7 +2115,7 @@
           <w:sz w:val="16"/>
           <w:szCs w:val="16"/>
         </w:rPr>
-        <w:t xml:space="preserve">Figura 2. Dispersión del abandono dentro de cada tipo de institución.</w:t>
+        <w:t xml:space="preserve">Figura 1. Distribución del abandono aparente en los 9.678 programas analizados.</w:t>
       </w:r>
     </w:p>
     <w:p>
@@ -3232,17 +2124,1404 @@
         <w:jc w:val="both"/>
       </w:pPr>
       <w:r>
-        <w:t xml:space="preserve">La figura 2 contiene la advertencia más importante para la decisión: las cajas se solapan ampliamente, de modo que </w:t>
+        <w:t xml:space="preserve">La figura 1 muestra además dos acumulaciones en los extremos: </w:t>
       </w:r>
       <w:r>
         <w:rPr>
           <w:b/>
           <w:bCs/>
         </w:rPr>
-        <w:t xml:space="preserve">la variación dentro de cada tipo de institución supera a la que hay entre tipos</w:t>
-      </w:r>
-      <w:r>
-        <w:t xml:space="preserve">. Focalizar por tipo de institución, que sería lo administrativamente más cómodo, dejaría fuera a buena parte de los programas con más abandono.</w:t>
+        <w:t xml:space="preserve">305 programas (3,2 %) con abandono exactamente cero</w:t>
+      </w:r>
+      <w:r>
+        <w:t xml:space="preserve"> y </w:t>
+      </w:r>
+      <w:r>
+        <w:rPr>
+          <w:b/>
+          <w:bCs/>
+        </w:rPr>
+        <w:t xml:space="preserve">160 (1,7 %) con abandono uno</w:t>
+      </w:r>
+      <w:r>
+        <w:t xml:space="preserve">. Los primeros titulan al menos tantas personas como ingresaron, por convalidaciones o traslados desde otras cohortes; los segundos cerraron sin titular a nadie. Juntos no llegan al 5 % y no alteran las medidas centrales, pero son el residuo visible de que la variable es aparente y no una medición directa.</w:t>
+      </w:r>
+    </w:p>
+    <w:p>
+      <w:pPr>
+        <w:pStyle w:val="Heading2"/>
+        <w:spacing w:after="90" w:before="180"/>
+      </w:pPr>
+      <w:r>
+        <w:rPr>
+          <w:b/>
+          <w:bCs/>
+          <w:color w:val="2E5496"/>
+          <w:sz w:val="22"/>
+          <w:szCs w:val="22"/>
+        </w:rPr>
+        <w:t xml:space="preserve">3.1 Comportamiento por grupos</w:t>
+      </w:r>
+    </w:p>
+    <w:p>
+      <w:pPr>
+        <w:spacing w:after="120" w:line="264"/>
+        <w:jc w:val="both"/>
+      </w:pPr>
+      <w:r>
+        <w:t xml:space="preserve">La media global oculta las diferencias que importan para decidir. El abandono medio recorre </w:t>
+      </w:r>
+      <w:r>
+        <w:rPr>
+          <w:b/>
+          <w:bCs/>
+        </w:rPr>
+        <w:t xml:space="preserve">12,3 puntos porcentuales</w:t>
+      </w:r>
+      <w:r>
+        <w:t xml:space="preserve"> entre tipos de institución y </w:t>
+      </w:r>
+      <w:r>
+        <w:rPr>
+          <w:b/>
+          <w:bCs/>
+        </w:rPr>
+        <w:t xml:space="preserve">17,5 puntos</w:t>
+      </w:r>
+      <w:r>
+        <w:t xml:space="preserve"> entre áreas del conocimiento:</w:t>
+      </w:r>
+    </w:p>
+    <w:tbl>
+      <w:tblPr>
+        <w:tblW w:type="pct" w:w="5000"/>
+        <w:tblBorders>
+          <w:top w:val="single" w:color="BFCDD8" w:sz="2"/>
+          <w:left w:val="single" w:color="BFCDD8" w:sz="2"/>
+          <w:bottom w:val="single" w:color="BFCDD8" w:sz="2"/>
+          <w:right w:val="single" w:color="BFCDD8" w:sz="2"/>
+          <w:insideH w:val="single" w:color="BFCDD8" w:sz="2"/>
+          <w:insideV w:val="single" w:color="BFCDD8" w:sz="2"/>
+        </w:tblBorders>
+      </w:tblPr>
+      <w:tblGrid>
+        <w:gridCol w:w="2500"/>
+        <w:gridCol w:w="700"/>
+        <w:gridCol w:w="800"/>
+        <w:gridCol w:w="700"/>
+        <w:gridCol w:w="2500"/>
+        <w:gridCol w:w="700"/>
+        <w:gridCol w:w="800"/>
+      </w:tblGrid>
+      <w:tr>
+        <w:trPr>
+          <w:tblHeader/>
+        </w:trPr>
+        <w:tc>
+          <w:tcPr>
+            <w:tcW w:type="dxa" w:w="2866"/>
+            <w:shd w:fill="F2F5F7" w:val="clear"/>
+            <w:tcMar>
+              <w:top w:type="dxa" w:w="60"/>
+              <w:left w:type="dxa" w:w="90"/>
+              <w:bottom w:type="dxa" w:w="60"/>
+              <w:right w:type="dxa" w:w="90"/>
+            </w:tcMar>
+          </w:tcPr>
+          <w:p>
+            <w:pPr>
+              <w:spacing w:after="0" w:line="240"/>
+              <w:jc w:val="left"/>
+            </w:pPr>
+            <w:r>
+              <w:rPr>
+                <w:b/>
+                <w:bCs/>
+                <w:sz w:val="17"/>
+                <w:szCs w:val="17"/>
+              </w:rPr>
+              <w:t xml:space="preserve">Tipo de institución</w:t>
+            </w:r>
+          </w:p>
+        </w:tc>
+        <w:tc>
+          <w:tcPr>
+            <w:tcW w:type="dxa" w:w="803"/>
+            <w:shd w:fill="F2F5F7" w:val="clear"/>
+            <w:tcMar>
+              <w:top w:type="dxa" w:w="60"/>
+              <w:left w:type="dxa" w:w="90"/>
+              <w:bottom w:type="dxa" w:w="60"/>
+              <w:right w:type="dxa" w:w="90"/>
+            </w:tcMar>
+          </w:tcPr>
+          <w:p>
+            <w:pPr>
+              <w:spacing w:after="0" w:line="240"/>
+              <w:jc w:val="center"/>
+            </w:pPr>
+            <w:r>
+              <w:rPr>
+                <w:b/>
+                <w:bCs/>
+                <w:sz w:val="17"/>
+                <w:szCs w:val="17"/>
+              </w:rPr>
+              <w:t xml:space="preserve">n</w:t>
+            </w:r>
+          </w:p>
+        </w:tc>
+        <w:tc>
+          <w:tcPr>
+            <w:tcW w:type="dxa" w:w="917"/>
+            <w:shd w:fill="F2F5F7" w:val="clear"/>
+            <w:tcMar>
+              <w:top w:type="dxa" w:w="60"/>
+              <w:left w:type="dxa" w:w="90"/>
+              <w:bottom w:type="dxa" w:w="60"/>
+              <w:right w:type="dxa" w:w="90"/>
+            </w:tcMar>
+          </w:tcPr>
+          <w:p>
+            <w:pPr>
+              <w:spacing w:after="0" w:line="240"/>
+              <w:jc w:val="center"/>
+            </w:pPr>
+            <w:r>
+              <w:rPr>
+                <w:b/>
+                <w:bCs/>
+                <w:sz w:val="17"/>
+                <w:szCs w:val="17"/>
+              </w:rPr>
+              <w:t xml:space="preserve">Media</w:t>
+            </w:r>
+          </w:p>
+        </w:tc>
+        <w:tc>
+          <w:tcPr>
+            <w:tcW w:type="dxa" w:w="803"/>
+            <w:shd w:fill="F2F5F7" w:val="clear"/>
+            <w:tcMar>
+              <w:top w:type="dxa" w:w="60"/>
+              <w:left w:type="dxa" w:w="90"/>
+              <w:bottom w:type="dxa" w:w="60"/>
+              <w:right w:type="dxa" w:w="90"/>
+            </w:tcMar>
+          </w:tcPr>
+          <w:p>
+            <w:pPr>
+              <w:spacing w:after="0" w:line="240"/>
+              <w:jc w:val="center"/>
+            </w:pPr>
+            <w:r>
+              <w:rPr>
+                <w:b/>
+                <w:bCs/>
+                <w:sz w:val="17"/>
+                <w:szCs w:val="17"/>
+              </w:rPr>
+              <w:t xml:space="preserve">DE</w:t>
+            </w:r>
+          </w:p>
+        </w:tc>
+        <w:tc>
+          <w:tcPr>
+            <w:tcW w:type="dxa" w:w="2866"/>
+            <w:shd w:fill="F2F5F7" w:val="clear"/>
+            <w:tcMar>
+              <w:top w:type="dxa" w:w="60"/>
+              <w:left w:type="dxa" w:w="90"/>
+              <w:bottom w:type="dxa" w:w="60"/>
+              <w:right w:type="dxa" w:w="90"/>
+            </w:tcMar>
+          </w:tcPr>
+          <w:p>
+            <w:pPr>
+              <w:spacing w:after="0" w:line="240"/>
+              <w:jc w:val="left"/>
+            </w:pPr>
+            <w:r>
+              <w:rPr>
+                <w:b/>
+                <w:bCs/>
+                <w:sz w:val="17"/>
+                <w:szCs w:val="17"/>
+              </w:rPr>
+              <w:t xml:space="preserve">Área del conocimiento</w:t>
+            </w:r>
+          </w:p>
+        </w:tc>
+        <w:tc>
+          <w:tcPr>
+            <w:tcW w:type="dxa" w:w="803"/>
+            <w:shd w:fill="F2F5F7" w:val="clear"/>
+            <w:tcMar>
+              <w:top w:type="dxa" w:w="60"/>
+              <w:left w:type="dxa" w:w="90"/>
+              <w:bottom w:type="dxa" w:w="60"/>
+              <w:right w:type="dxa" w:w="90"/>
+            </w:tcMar>
+          </w:tcPr>
+          <w:p>
+            <w:pPr>
+              <w:spacing w:after="0" w:line="240"/>
+              <w:jc w:val="center"/>
+            </w:pPr>
+            <w:r>
+              <w:rPr>
+                <w:b/>
+                <w:bCs/>
+                <w:sz w:val="17"/>
+                <w:szCs w:val="17"/>
+              </w:rPr>
+              <w:t xml:space="preserve">n</w:t>
+            </w:r>
+          </w:p>
+        </w:tc>
+        <w:tc>
+          <w:tcPr>
+            <w:tcW w:type="dxa" w:w="917"/>
+            <w:shd w:fill="F2F5F7" w:val="clear"/>
+            <w:tcMar>
+              <w:top w:type="dxa" w:w="60"/>
+              <w:left w:type="dxa" w:w="90"/>
+              <w:bottom w:type="dxa" w:w="60"/>
+              <w:right w:type="dxa" w:w="90"/>
+            </w:tcMar>
+          </w:tcPr>
+          <w:p>
+            <w:pPr>
+              <w:spacing w:after="0" w:line="240"/>
+              <w:jc w:val="center"/>
+            </w:pPr>
+            <w:r>
+              <w:rPr>
+                <w:b/>
+                <w:bCs/>
+                <w:sz w:val="17"/>
+                <w:szCs w:val="17"/>
+              </w:rPr>
+              <w:t xml:space="preserve">Media</w:t>
+            </w:r>
+          </w:p>
+        </w:tc>
+      </w:tr>
+      <w:tr>
+        <w:tc>
+          <w:tcPr>
+            <w:tcW w:type="dxa" w:w="2866"/>
+            <w:tcMar>
+              <w:top w:type="dxa" w:w="60"/>
+              <w:left w:type="dxa" w:w="90"/>
+              <w:bottom w:type="dxa" w:w="60"/>
+              <w:right w:type="dxa" w:w="90"/>
+            </w:tcMar>
+          </w:tcPr>
+          <w:p>
+            <w:pPr>
+              <w:spacing w:after="0" w:line="240"/>
+              <w:jc w:val="left"/>
+            </w:pPr>
+            <w:r>
+              <w:rPr>
+                <w:b w:val="false"/>
+                <w:bCs w:val="false"/>
+                <w:sz w:val="17"/>
+                <w:szCs w:val="17"/>
+              </w:rPr>
+              <w:t xml:space="preserve">CFT estatales</w:t>
+            </w:r>
+          </w:p>
+        </w:tc>
+        <w:tc>
+          <w:tcPr>
+            <w:tcW w:type="dxa" w:w="803"/>
+            <w:tcMar>
+              <w:top w:type="dxa" w:w="60"/>
+              <w:left w:type="dxa" w:w="90"/>
+              <w:bottom w:type="dxa" w:w="60"/>
+              <w:right w:type="dxa" w:w="90"/>
+            </w:tcMar>
+          </w:tcPr>
+          <w:p>
+            <w:pPr>
+              <w:spacing w:after="0" w:line="240"/>
+              <w:jc w:val="center"/>
+            </w:pPr>
+            <w:r>
+              <w:rPr>
+                <w:b w:val="false"/>
+                <w:bCs w:val="false"/>
+                <w:sz w:val="17"/>
+                <w:szCs w:val="17"/>
+              </w:rPr>
+              <w:t xml:space="preserve">27</w:t>
+            </w:r>
+          </w:p>
+        </w:tc>
+        <w:tc>
+          <w:tcPr>
+            <w:tcW w:type="dxa" w:w="917"/>
+            <w:tcMar>
+              <w:top w:type="dxa" w:w="60"/>
+              <w:left w:type="dxa" w:w="90"/>
+              <w:bottom w:type="dxa" w:w="60"/>
+              <w:right w:type="dxa" w:w="90"/>
+            </w:tcMar>
+          </w:tcPr>
+          <w:p>
+            <w:pPr>
+              <w:spacing w:after="0" w:line="240"/>
+              <w:jc w:val="center"/>
+            </w:pPr>
+            <w:r>
+              <w:rPr>
+                <w:b w:val="false"/>
+                <w:bCs w:val="false"/>
+                <w:sz w:val="17"/>
+                <w:szCs w:val="17"/>
+              </w:rPr>
+              <w:t xml:space="preserve">0,565</w:t>
+            </w:r>
+          </w:p>
+        </w:tc>
+        <w:tc>
+          <w:tcPr>
+            <w:tcW w:type="dxa" w:w="803"/>
+            <w:tcMar>
+              <w:top w:type="dxa" w:w="60"/>
+              <w:left w:type="dxa" w:w="90"/>
+              <w:bottom w:type="dxa" w:w="60"/>
+              <w:right w:type="dxa" w:w="90"/>
+            </w:tcMar>
+          </w:tcPr>
+          <w:p>
+            <w:pPr>
+              <w:spacing w:after="0" w:line="240"/>
+              <w:jc w:val="center"/>
+            </w:pPr>
+            <w:r>
+              <w:rPr>
+                <w:b w:val="false"/>
+                <w:bCs w:val="false"/>
+                <w:sz w:val="17"/>
+                <w:szCs w:val="17"/>
+              </w:rPr>
+              <w:t xml:space="preserve">0,127</w:t>
+            </w:r>
+          </w:p>
+        </w:tc>
+        <w:tc>
+          <w:tcPr>
+            <w:tcW w:type="dxa" w:w="2866"/>
+            <w:tcMar>
+              <w:top w:type="dxa" w:w="60"/>
+              <w:left w:type="dxa" w:w="90"/>
+              <w:bottom w:type="dxa" w:w="60"/>
+              <w:right w:type="dxa" w:w="90"/>
+            </w:tcMar>
+          </w:tcPr>
+          <w:p>
+            <w:pPr>
+              <w:spacing w:after="0" w:line="240"/>
+              <w:jc w:val="left"/>
+            </w:pPr>
+            <w:r>
+              <w:rPr>
+                <w:b w:val="false"/>
+                <w:bCs w:val="false"/>
+                <w:sz w:val="17"/>
+                <w:szCs w:val="17"/>
+              </w:rPr>
+              <w:t xml:space="preserve">Humanidades</w:t>
+            </w:r>
+          </w:p>
+        </w:tc>
+        <w:tc>
+          <w:tcPr>
+            <w:tcW w:type="dxa" w:w="803"/>
+            <w:tcMar>
+              <w:top w:type="dxa" w:w="60"/>
+              <w:left w:type="dxa" w:w="90"/>
+              <w:bottom w:type="dxa" w:w="60"/>
+              <w:right w:type="dxa" w:w="90"/>
+            </w:tcMar>
+          </w:tcPr>
+          <w:p>
+            <w:pPr>
+              <w:spacing w:after="0" w:line="240"/>
+              <w:jc w:val="center"/>
+            </w:pPr>
+            <w:r>
+              <w:rPr>
+                <w:b w:val="false"/>
+                <w:bCs w:val="false"/>
+                <w:sz w:val="17"/>
+                <w:szCs w:val="17"/>
+              </w:rPr>
+              <w:t xml:space="preserve">78</w:t>
+            </w:r>
+          </w:p>
+        </w:tc>
+        <w:tc>
+          <w:tcPr>
+            <w:tcW w:type="dxa" w:w="917"/>
+            <w:tcMar>
+              <w:top w:type="dxa" w:w="60"/>
+              <w:left w:type="dxa" w:w="90"/>
+              <w:bottom w:type="dxa" w:w="60"/>
+              <w:right w:type="dxa" w:w="90"/>
+            </w:tcMar>
+          </w:tcPr>
+          <w:p>
+            <w:pPr>
+              <w:spacing w:after="0" w:line="240"/>
+              <w:jc w:val="center"/>
+            </w:pPr>
+            <w:r>
+              <w:rPr>
+                <w:b w:val="false"/>
+                <w:bCs w:val="false"/>
+                <w:sz w:val="17"/>
+                <w:szCs w:val="17"/>
+              </w:rPr>
+              <w:t xml:space="preserve">0,643</w:t>
+            </w:r>
+          </w:p>
+        </w:tc>
+      </w:tr>
+      <w:tr>
+        <w:tc>
+          <w:tcPr>
+            <w:tcW w:type="dxa" w:w="2866"/>
+            <w:tcMar>
+              <w:top w:type="dxa" w:w="60"/>
+              <w:left w:type="dxa" w:w="90"/>
+              <w:bottom w:type="dxa" w:w="60"/>
+              <w:right w:type="dxa" w:w="90"/>
+            </w:tcMar>
+          </w:tcPr>
+          <w:p>
+            <w:pPr>
+              <w:spacing w:after="0" w:line="240"/>
+              <w:jc w:val="left"/>
+            </w:pPr>
+            <w:r>
+              <w:rPr>
+                <w:b w:val="false"/>
+                <w:bCs w:val="false"/>
+                <w:sz w:val="17"/>
+                <w:szCs w:val="17"/>
+              </w:rPr>
+              <w:t xml:space="preserve">CFT privados</w:t>
+            </w:r>
+          </w:p>
+        </w:tc>
+        <w:tc>
+          <w:tcPr>
+            <w:tcW w:type="dxa" w:w="803"/>
+            <w:tcMar>
+              <w:top w:type="dxa" w:w="60"/>
+              <w:left w:type="dxa" w:w="90"/>
+              <w:bottom w:type="dxa" w:w="60"/>
+              <w:right w:type="dxa" w:w="90"/>
+            </w:tcMar>
+          </w:tcPr>
+          <w:p>
+            <w:pPr>
+              <w:spacing w:after="0" w:line="240"/>
+              <w:jc w:val="center"/>
+            </w:pPr>
+            <w:r>
+              <w:rPr>
+                <w:b w:val="false"/>
+                <w:bCs w:val="false"/>
+                <w:sz w:val="17"/>
+                <w:szCs w:val="17"/>
+              </w:rPr>
+              <w:t xml:space="preserve">2.263</w:t>
+            </w:r>
+          </w:p>
+        </w:tc>
+        <w:tc>
+          <w:tcPr>
+            <w:tcW w:type="dxa" w:w="917"/>
+            <w:tcMar>
+              <w:top w:type="dxa" w:w="60"/>
+              <w:left w:type="dxa" w:w="90"/>
+              <w:bottom w:type="dxa" w:w="60"/>
+              <w:right w:type="dxa" w:w="90"/>
+            </w:tcMar>
+          </w:tcPr>
+          <w:p>
+            <w:pPr>
+              <w:spacing w:after="0" w:line="240"/>
+              <w:jc w:val="center"/>
+            </w:pPr>
+            <w:r>
+              <w:rPr>
+                <w:b w:val="false"/>
+                <w:bCs w:val="false"/>
+                <w:sz w:val="17"/>
+                <w:szCs w:val="17"/>
+              </w:rPr>
+              <w:t xml:space="preserve">0,542</w:t>
+            </w:r>
+          </w:p>
+        </w:tc>
+        <w:tc>
+          <w:tcPr>
+            <w:tcW w:type="dxa" w:w="803"/>
+            <w:tcMar>
+              <w:top w:type="dxa" w:w="60"/>
+              <w:left w:type="dxa" w:w="90"/>
+              <w:bottom w:type="dxa" w:w="60"/>
+              <w:right w:type="dxa" w:w="90"/>
+            </w:tcMar>
+          </w:tcPr>
+          <w:p>
+            <w:pPr>
+              <w:spacing w:after="0" w:line="240"/>
+              <w:jc w:val="center"/>
+            </w:pPr>
+            <w:r>
+              <w:rPr>
+                <w:b w:val="false"/>
+                <w:bCs w:val="false"/>
+                <w:sz w:val="17"/>
+                <w:szCs w:val="17"/>
+              </w:rPr>
+              <w:t xml:space="preserve">0,195</w:t>
+            </w:r>
+          </w:p>
+        </w:tc>
+        <w:tc>
+          <w:tcPr>
+            <w:tcW w:type="dxa" w:w="2866"/>
+            <w:tcMar>
+              <w:top w:type="dxa" w:w="60"/>
+              <w:left w:type="dxa" w:w="90"/>
+              <w:bottom w:type="dxa" w:w="60"/>
+              <w:right w:type="dxa" w:w="90"/>
+            </w:tcMar>
+          </w:tcPr>
+          <w:p>
+            <w:pPr>
+              <w:spacing w:after="0" w:line="240"/>
+              <w:jc w:val="left"/>
+            </w:pPr>
+            <w:r>
+              <w:rPr>
+                <w:b w:val="false"/>
+                <w:bCs w:val="false"/>
+                <w:sz w:val="17"/>
+                <w:szCs w:val="17"/>
+              </w:rPr>
+              <w:t xml:space="preserve">Derecho</w:t>
+            </w:r>
+          </w:p>
+        </w:tc>
+        <w:tc>
+          <w:tcPr>
+            <w:tcW w:type="dxa" w:w="803"/>
+            <w:tcMar>
+              <w:top w:type="dxa" w:w="60"/>
+              <w:left w:type="dxa" w:w="90"/>
+              <w:bottom w:type="dxa" w:w="60"/>
+              <w:right w:type="dxa" w:w="90"/>
+            </w:tcMar>
+          </w:tcPr>
+          <w:p>
+            <w:pPr>
+              <w:spacing w:after="0" w:line="240"/>
+              <w:jc w:val="center"/>
+            </w:pPr>
+            <w:r>
+              <w:rPr>
+                <w:b w:val="false"/>
+                <w:bCs w:val="false"/>
+                <w:sz w:val="17"/>
+                <w:szCs w:val="17"/>
+              </w:rPr>
+              <w:t xml:space="preserve">224</w:t>
+            </w:r>
+          </w:p>
+        </w:tc>
+        <w:tc>
+          <w:tcPr>
+            <w:tcW w:type="dxa" w:w="917"/>
+            <w:tcMar>
+              <w:top w:type="dxa" w:w="60"/>
+              <w:left w:type="dxa" w:w="90"/>
+              <w:bottom w:type="dxa" w:w="60"/>
+              <w:right w:type="dxa" w:w="90"/>
+            </w:tcMar>
+          </w:tcPr>
+          <w:p>
+            <w:pPr>
+              <w:spacing w:after="0" w:line="240"/>
+              <w:jc w:val="center"/>
+            </w:pPr>
+            <w:r>
+              <w:rPr>
+                <w:b w:val="false"/>
+                <w:bCs w:val="false"/>
+                <w:sz w:val="17"/>
+                <w:szCs w:val="17"/>
+              </w:rPr>
+              <w:t xml:space="preserve">0,641</w:t>
+            </w:r>
+          </w:p>
+        </w:tc>
+      </w:tr>
+      <w:tr>
+        <w:tc>
+          <w:tcPr>
+            <w:tcW w:type="dxa" w:w="2866"/>
+            <w:tcMar>
+              <w:top w:type="dxa" w:w="60"/>
+              <w:left w:type="dxa" w:w="90"/>
+              <w:bottom w:type="dxa" w:w="60"/>
+              <w:right w:type="dxa" w:w="90"/>
+            </w:tcMar>
+          </w:tcPr>
+          <w:p>
+            <w:pPr>
+              <w:spacing w:after="0" w:line="240"/>
+              <w:jc w:val="left"/>
+            </w:pPr>
+            <w:r>
+              <w:rPr>
+                <w:b w:val="false"/>
+                <w:bCs w:val="false"/>
+                <w:sz w:val="17"/>
+                <w:szCs w:val="17"/>
+              </w:rPr>
+              <w:t xml:space="preserve">Institutos profesionales</w:t>
+            </w:r>
+          </w:p>
+        </w:tc>
+        <w:tc>
+          <w:tcPr>
+            <w:tcW w:type="dxa" w:w="803"/>
+            <w:tcMar>
+              <w:top w:type="dxa" w:w="60"/>
+              <w:left w:type="dxa" w:w="90"/>
+              <w:bottom w:type="dxa" w:w="60"/>
+              <w:right w:type="dxa" w:w="90"/>
+            </w:tcMar>
+          </w:tcPr>
+          <w:p>
+            <w:pPr>
+              <w:spacing w:after="0" w:line="240"/>
+              <w:jc w:val="center"/>
+            </w:pPr>
+            <w:r>
+              <w:rPr>
+                <w:b w:val="false"/>
+                <w:bCs w:val="false"/>
+                <w:sz w:val="17"/>
+                <w:szCs w:val="17"/>
+              </w:rPr>
+              <w:t xml:space="preserve">3.759</w:t>
+            </w:r>
+          </w:p>
+        </w:tc>
+        <w:tc>
+          <w:tcPr>
+            <w:tcW w:type="dxa" w:w="917"/>
+            <w:tcMar>
+              <w:top w:type="dxa" w:w="60"/>
+              <w:left w:type="dxa" w:w="90"/>
+              <w:bottom w:type="dxa" w:w="60"/>
+              <w:right w:type="dxa" w:w="90"/>
+            </w:tcMar>
+          </w:tcPr>
+          <w:p>
+            <w:pPr>
+              <w:spacing w:after="0" w:line="240"/>
+              <w:jc w:val="center"/>
+            </w:pPr>
+            <w:r>
+              <w:rPr>
+                <w:b w:val="false"/>
+                <w:bCs w:val="false"/>
+                <w:sz w:val="17"/>
+                <w:szCs w:val="17"/>
+              </w:rPr>
+              <w:t xml:space="preserve">0,528</w:t>
+            </w:r>
+          </w:p>
+        </w:tc>
+        <w:tc>
+          <w:tcPr>
+            <w:tcW w:type="dxa" w:w="803"/>
+            <w:tcMar>
+              <w:top w:type="dxa" w:w="60"/>
+              <w:left w:type="dxa" w:w="90"/>
+              <w:bottom w:type="dxa" w:w="60"/>
+              <w:right w:type="dxa" w:w="90"/>
+            </w:tcMar>
+          </w:tcPr>
+          <w:p>
+            <w:pPr>
+              <w:spacing w:after="0" w:line="240"/>
+              <w:jc w:val="center"/>
+            </w:pPr>
+            <w:r>
+              <w:rPr>
+                <w:b w:val="false"/>
+                <w:bCs w:val="false"/>
+                <w:sz w:val="17"/>
+                <w:szCs w:val="17"/>
+              </w:rPr>
+              <w:t xml:space="preserve">0,232</w:t>
+            </w:r>
+          </w:p>
+        </w:tc>
+        <w:tc>
+          <w:tcPr>
+            <w:tcW w:type="dxa" w:w="2866"/>
+            <w:tcMar>
+              <w:top w:type="dxa" w:w="60"/>
+              <w:left w:type="dxa" w:w="90"/>
+              <w:bottom w:type="dxa" w:w="60"/>
+              <w:right w:type="dxa" w:w="90"/>
+            </w:tcMar>
+          </w:tcPr>
+          <w:p>
+            <w:pPr>
+              <w:spacing w:after="0" w:line="240"/>
+              <w:jc w:val="left"/>
+            </w:pPr>
+            <w:r>
+              <w:rPr>
+                <w:b w:val="false"/>
+                <w:bCs w:val="false"/>
+                <w:sz w:val="17"/>
+                <w:szCs w:val="17"/>
+              </w:rPr>
+              <w:t xml:space="preserve">Arte y Arquitectura</w:t>
+            </w:r>
+          </w:p>
+        </w:tc>
+        <w:tc>
+          <w:tcPr>
+            <w:tcW w:type="dxa" w:w="803"/>
+            <w:tcMar>
+              <w:top w:type="dxa" w:w="60"/>
+              <w:left w:type="dxa" w:w="90"/>
+              <w:bottom w:type="dxa" w:w="60"/>
+              <w:right w:type="dxa" w:w="90"/>
+            </w:tcMar>
+          </w:tcPr>
+          <w:p>
+            <w:pPr>
+              <w:spacing w:after="0" w:line="240"/>
+              <w:jc w:val="center"/>
+            </w:pPr>
+            <w:r>
+              <w:rPr>
+                <w:b w:val="false"/>
+                <w:bCs w:val="false"/>
+                <w:sz w:val="17"/>
+                <w:szCs w:val="17"/>
+              </w:rPr>
+              <w:t xml:space="preserve">490</w:t>
+            </w:r>
+          </w:p>
+        </w:tc>
+        <w:tc>
+          <w:tcPr>
+            <w:tcW w:type="dxa" w:w="917"/>
+            <w:tcMar>
+              <w:top w:type="dxa" w:w="60"/>
+              <w:left w:type="dxa" w:w="90"/>
+              <w:bottom w:type="dxa" w:w="60"/>
+              <w:right w:type="dxa" w:w="90"/>
+            </w:tcMar>
+          </w:tcPr>
+          <w:p>
+            <w:pPr>
+              <w:spacing w:after="0" w:line="240"/>
+              <w:jc w:val="center"/>
+            </w:pPr>
+            <w:r>
+              <w:rPr>
+                <w:b w:val="false"/>
+                <w:bCs w:val="false"/>
+                <w:sz w:val="17"/>
+                <w:szCs w:val="17"/>
+              </w:rPr>
+              <w:t xml:space="preserve">0,585</w:t>
+            </w:r>
+          </w:p>
+        </w:tc>
+      </w:tr>
+      <w:tr>
+        <w:tc>
+          <w:tcPr>
+            <w:tcW w:type="dxa" w:w="2866"/>
+            <w:tcMar>
+              <w:top w:type="dxa" w:w="60"/>
+              <w:left w:type="dxa" w:w="90"/>
+              <w:bottom w:type="dxa" w:w="60"/>
+              <w:right w:type="dxa" w:w="90"/>
+            </w:tcMar>
+          </w:tcPr>
+          <w:p>
+            <w:pPr>
+              <w:spacing w:after="0" w:line="240"/>
+              <w:jc w:val="left"/>
+            </w:pPr>
+            <w:r>
+              <w:rPr>
+                <w:b w:val="false"/>
+                <w:bCs w:val="false"/>
+                <w:sz w:val="17"/>
+                <w:szCs w:val="17"/>
+              </w:rPr>
+              <w:t xml:space="preserve">Universidades privadas</w:t>
+            </w:r>
+          </w:p>
+        </w:tc>
+        <w:tc>
+          <w:tcPr>
+            <w:tcW w:type="dxa" w:w="803"/>
+            <w:tcMar>
+              <w:top w:type="dxa" w:w="60"/>
+              <w:left w:type="dxa" w:w="90"/>
+              <w:bottom w:type="dxa" w:w="60"/>
+              <w:right w:type="dxa" w:w="90"/>
+            </w:tcMar>
+          </w:tcPr>
+          <w:p>
+            <w:pPr>
+              <w:spacing w:after="0" w:line="240"/>
+              <w:jc w:val="center"/>
+            </w:pPr>
+            <w:r>
+              <w:rPr>
+                <w:b w:val="false"/>
+                <w:bCs w:val="false"/>
+                <w:sz w:val="17"/>
+                <w:szCs w:val="17"/>
+              </w:rPr>
+              <w:t xml:space="preserve">2.012</w:t>
+            </w:r>
+          </w:p>
+        </w:tc>
+        <w:tc>
+          <w:tcPr>
+            <w:tcW w:type="dxa" w:w="917"/>
+            <w:tcMar>
+              <w:top w:type="dxa" w:w="60"/>
+              <w:left w:type="dxa" w:w="90"/>
+              <w:bottom w:type="dxa" w:w="60"/>
+              <w:right w:type="dxa" w:w="90"/>
+            </w:tcMar>
+          </w:tcPr>
+          <w:p>
+            <w:pPr>
+              <w:spacing w:after="0" w:line="240"/>
+              <w:jc w:val="center"/>
+            </w:pPr>
+            <w:r>
+              <w:rPr>
+                <w:b w:val="false"/>
+                <w:bCs w:val="false"/>
+                <w:sz w:val="17"/>
+                <w:szCs w:val="17"/>
+              </w:rPr>
+              <w:t xml:space="preserve">0,509</w:t>
+            </w:r>
+          </w:p>
+        </w:tc>
+        <w:tc>
+          <w:tcPr>
+            <w:tcW w:type="dxa" w:w="803"/>
+            <w:tcMar>
+              <w:top w:type="dxa" w:w="60"/>
+              <w:left w:type="dxa" w:w="90"/>
+              <w:bottom w:type="dxa" w:w="60"/>
+              <w:right w:type="dxa" w:w="90"/>
+            </w:tcMar>
+          </w:tcPr>
+          <w:p>
+            <w:pPr>
+              <w:spacing w:after="0" w:line="240"/>
+              <w:jc w:val="center"/>
+            </w:pPr>
+            <w:r>
+              <w:rPr>
+                <w:b w:val="false"/>
+                <w:bCs w:val="false"/>
+                <w:sz w:val="17"/>
+                <w:szCs w:val="17"/>
+              </w:rPr>
+              <w:t xml:space="preserve">0,237</w:t>
+            </w:r>
+          </w:p>
+        </w:tc>
+        <w:tc>
+          <w:tcPr>
+            <w:tcW w:type="dxa" w:w="2866"/>
+            <w:tcMar>
+              <w:top w:type="dxa" w:w="60"/>
+              <w:left w:type="dxa" w:w="90"/>
+              <w:bottom w:type="dxa" w:w="60"/>
+              <w:right w:type="dxa" w:w="90"/>
+            </w:tcMar>
+          </w:tcPr>
+          <w:p>
+            <w:pPr>
+              <w:spacing w:after="0" w:line="240"/>
+              <w:jc w:val="left"/>
+            </w:pPr>
+            <w:r>
+              <w:rPr>
+                <w:b w:val="false"/>
+                <w:bCs w:val="false"/>
+                <w:sz w:val="17"/>
+                <w:szCs w:val="17"/>
+              </w:rPr>
+              <w:t xml:space="preserve">Tecnología</w:t>
+            </w:r>
+          </w:p>
+        </w:tc>
+        <w:tc>
+          <w:tcPr>
+            <w:tcW w:type="dxa" w:w="803"/>
+            <w:tcMar>
+              <w:top w:type="dxa" w:w="60"/>
+              <w:left w:type="dxa" w:w="90"/>
+              <w:bottom w:type="dxa" w:w="60"/>
+              <w:right w:type="dxa" w:w="90"/>
+            </w:tcMar>
+          </w:tcPr>
+          <w:p>
+            <w:pPr>
+              <w:spacing w:after="0" w:line="240"/>
+              <w:jc w:val="center"/>
+            </w:pPr>
+            <w:r>
+              <w:rPr>
+                <w:b w:val="false"/>
+                <w:bCs w:val="false"/>
+                <w:sz w:val="17"/>
+                <w:szCs w:val="17"/>
+              </w:rPr>
+              <w:t xml:space="preserve">3.009</w:t>
+            </w:r>
+          </w:p>
+        </w:tc>
+        <w:tc>
+          <w:tcPr>
+            <w:tcW w:type="dxa" w:w="917"/>
+            <w:tcMar>
+              <w:top w:type="dxa" w:w="60"/>
+              <w:left w:type="dxa" w:w="90"/>
+              <w:bottom w:type="dxa" w:w="60"/>
+              <w:right w:type="dxa" w:w="90"/>
+            </w:tcMar>
+          </w:tcPr>
+          <w:p>
+            <w:pPr>
+              <w:spacing w:after="0" w:line="240"/>
+              <w:jc w:val="center"/>
+            </w:pPr>
+            <w:r>
+              <w:rPr>
+                <w:b w:val="false"/>
+                <w:bCs w:val="false"/>
+                <w:sz w:val="17"/>
+                <w:szCs w:val="17"/>
+              </w:rPr>
+              <w:t xml:space="preserve">0,555</w:t>
+            </w:r>
+          </w:p>
+        </w:tc>
+      </w:tr>
+      <w:tr>
+        <w:tc>
+          <w:tcPr>
+            <w:tcW w:type="dxa" w:w="2866"/>
+            <w:tcMar>
+              <w:top w:type="dxa" w:w="60"/>
+              <w:left w:type="dxa" w:w="90"/>
+              <w:bottom w:type="dxa" w:w="60"/>
+              <w:right w:type="dxa" w:w="90"/>
+            </w:tcMar>
+          </w:tcPr>
+          <w:p>
+            <w:pPr>
+              <w:spacing w:after="0" w:line="240"/>
+              <w:jc w:val="left"/>
+            </w:pPr>
+            <w:r>
+              <w:rPr>
+                <w:b w:val="false"/>
+                <w:bCs w:val="false"/>
+                <w:sz w:val="17"/>
+                <w:szCs w:val="17"/>
+              </w:rPr>
+              <w:t xml:space="preserve">U. estatales CRUCH</w:t>
+            </w:r>
+          </w:p>
+        </w:tc>
+        <w:tc>
+          <w:tcPr>
+            <w:tcW w:type="dxa" w:w="803"/>
+            <w:tcMar>
+              <w:top w:type="dxa" w:w="60"/>
+              <w:left w:type="dxa" w:w="90"/>
+              <w:bottom w:type="dxa" w:w="60"/>
+              <w:right w:type="dxa" w:w="90"/>
+            </w:tcMar>
+          </w:tcPr>
+          <w:p>
+            <w:pPr>
+              <w:spacing w:after="0" w:line="240"/>
+              <w:jc w:val="center"/>
+            </w:pPr>
+            <w:r>
+              <w:rPr>
+                <w:b w:val="false"/>
+                <w:bCs w:val="false"/>
+                <w:sz w:val="17"/>
+                <w:szCs w:val="17"/>
+              </w:rPr>
+              <w:t xml:space="preserve">932</w:t>
+            </w:r>
+          </w:p>
+        </w:tc>
+        <w:tc>
+          <w:tcPr>
+            <w:tcW w:type="dxa" w:w="917"/>
+            <w:tcMar>
+              <w:top w:type="dxa" w:w="60"/>
+              <w:left w:type="dxa" w:w="90"/>
+              <w:bottom w:type="dxa" w:w="60"/>
+              <w:right w:type="dxa" w:w="90"/>
+            </w:tcMar>
+          </w:tcPr>
+          <w:p>
+            <w:pPr>
+              <w:spacing w:after="0" w:line="240"/>
+              <w:jc w:val="center"/>
+            </w:pPr>
+            <w:r>
+              <w:rPr>
+                <w:b w:val="false"/>
+                <w:bCs w:val="false"/>
+                <w:sz w:val="17"/>
+                <w:szCs w:val="17"/>
+              </w:rPr>
+              <w:t xml:space="preserve">0,494</w:t>
+            </w:r>
+          </w:p>
+        </w:tc>
+        <w:tc>
+          <w:tcPr>
+            <w:tcW w:type="dxa" w:w="803"/>
+            <w:tcMar>
+              <w:top w:type="dxa" w:w="60"/>
+              <w:left w:type="dxa" w:w="90"/>
+              <w:bottom w:type="dxa" w:w="60"/>
+              <w:right w:type="dxa" w:w="90"/>
+            </w:tcMar>
+          </w:tcPr>
+          <w:p>
+            <w:pPr>
+              <w:spacing w:after="0" w:line="240"/>
+              <w:jc w:val="center"/>
+            </w:pPr>
+            <w:r>
+              <w:rPr>
+                <w:b w:val="false"/>
+                <w:bCs w:val="false"/>
+                <w:sz w:val="17"/>
+                <w:szCs w:val="17"/>
+              </w:rPr>
+              <w:t xml:space="preserve">0,223</w:t>
+            </w:r>
+          </w:p>
+        </w:tc>
+        <w:tc>
+          <w:tcPr>
+            <w:tcW w:type="dxa" w:w="2866"/>
+            <w:tcMar>
+              <w:top w:type="dxa" w:w="60"/>
+              <w:left w:type="dxa" w:w="90"/>
+              <w:bottom w:type="dxa" w:w="60"/>
+              <w:right w:type="dxa" w:w="90"/>
+            </w:tcMar>
+          </w:tcPr>
+          <w:p>
+            <w:pPr>
+              <w:spacing w:after="0" w:line="240"/>
+              <w:jc w:val="left"/>
+            </w:pPr>
+            <w:r>
+              <w:rPr>
+                <w:b w:val="false"/>
+                <w:bCs w:val="false"/>
+                <w:sz w:val="17"/>
+                <w:szCs w:val="17"/>
+              </w:rPr>
+              <w:t xml:space="preserve">Educación</w:t>
+            </w:r>
+          </w:p>
+        </w:tc>
+        <w:tc>
+          <w:tcPr>
+            <w:tcW w:type="dxa" w:w="803"/>
+            <w:tcMar>
+              <w:top w:type="dxa" w:w="60"/>
+              <w:left w:type="dxa" w:w="90"/>
+              <w:bottom w:type="dxa" w:w="60"/>
+              <w:right w:type="dxa" w:w="90"/>
+            </w:tcMar>
+          </w:tcPr>
+          <w:p>
+            <w:pPr>
+              <w:spacing w:after="0" w:line="240"/>
+              <w:jc w:val="center"/>
+            </w:pPr>
+            <w:r>
+              <w:rPr>
+                <w:b w:val="false"/>
+                <w:bCs w:val="false"/>
+                <w:sz w:val="17"/>
+                <w:szCs w:val="17"/>
+              </w:rPr>
+              <w:t xml:space="preserve">1.344</w:t>
+            </w:r>
+          </w:p>
+        </w:tc>
+        <w:tc>
+          <w:tcPr>
+            <w:tcW w:type="dxa" w:w="917"/>
+            <w:tcMar>
+              <w:top w:type="dxa" w:w="60"/>
+              <w:left w:type="dxa" w:w="90"/>
+              <w:bottom w:type="dxa" w:w="60"/>
+              <w:right w:type="dxa" w:w="90"/>
+            </w:tcMar>
+          </w:tcPr>
+          <w:p>
+            <w:pPr>
+              <w:spacing w:after="0" w:line="240"/>
+              <w:jc w:val="center"/>
+            </w:pPr>
+            <w:r>
+              <w:rPr>
+                <w:b w:val="false"/>
+                <w:bCs w:val="false"/>
+                <w:sz w:val="17"/>
+                <w:szCs w:val="17"/>
+              </w:rPr>
+              <w:t xml:space="preserve">0,476</w:t>
+            </w:r>
+          </w:p>
+        </w:tc>
+      </w:tr>
+      <w:tr>
+        <w:tc>
+          <w:tcPr>
+            <w:tcW w:type="dxa" w:w="2866"/>
+            <w:tcMar>
+              <w:top w:type="dxa" w:w="60"/>
+              <w:left w:type="dxa" w:w="90"/>
+              <w:bottom w:type="dxa" w:w="60"/>
+              <w:right w:type="dxa" w:w="90"/>
+            </w:tcMar>
+          </w:tcPr>
+          <w:p>
+            <w:pPr>
+              <w:spacing w:after="0" w:line="240"/>
+              <w:jc w:val="left"/>
+            </w:pPr>
+            <w:r>
+              <w:rPr>
+                <w:b w:val="false"/>
+                <w:bCs w:val="false"/>
+                <w:sz w:val="17"/>
+                <w:szCs w:val="17"/>
+              </w:rPr>
+              <w:t xml:space="preserve">U. privadas CRUCH</w:t>
+            </w:r>
+          </w:p>
+        </w:tc>
+        <w:tc>
+          <w:tcPr>
+            <w:tcW w:type="dxa" w:w="803"/>
+            <w:tcMar>
+              <w:top w:type="dxa" w:w="60"/>
+              <w:left w:type="dxa" w:w="90"/>
+              <w:bottom w:type="dxa" w:w="60"/>
+              <w:right w:type="dxa" w:w="90"/>
+            </w:tcMar>
+          </w:tcPr>
+          <w:p>
+            <w:pPr>
+              <w:spacing w:after="0" w:line="240"/>
+              <w:jc w:val="center"/>
+            </w:pPr>
+            <w:r>
+              <w:rPr>
+                <w:b w:val="false"/>
+                <w:bCs w:val="false"/>
+                <w:sz w:val="17"/>
+                <w:szCs w:val="17"/>
+              </w:rPr>
+              <w:t xml:space="preserve">685</w:t>
+            </w:r>
+          </w:p>
+        </w:tc>
+        <w:tc>
+          <w:tcPr>
+            <w:tcW w:type="dxa" w:w="917"/>
+            <w:tcMar>
+              <w:top w:type="dxa" w:w="60"/>
+              <w:left w:type="dxa" w:w="90"/>
+              <w:bottom w:type="dxa" w:w="60"/>
+              <w:right w:type="dxa" w:w="90"/>
+            </w:tcMar>
+          </w:tcPr>
+          <w:p>
+            <w:pPr>
+              <w:spacing w:after="0" w:line="240"/>
+              <w:jc w:val="center"/>
+            </w:pPr>
+            <w:r>
+              <w:rPr>
+                <w:b w:val="false"/>
+                <w:bCs w:val="false"/>
+                <w:sz w:val="17"/>
+                <w:szCs w:val="17"/>
+              </w:rPr>
+              <w:t xml:space="preserve">0,442</w:t>
+            </w:r>
+          </w:p>
+        </w:tc>
+        <w:tc>
+          <w:tcPr>
+            <w:tcW w:type="dxa" w:w="803"/>
+            <w:tcMar>
+              <w:top w:type="dxa" w:w="60"/>
+              <w:left w:type="dxa" w:w="90"/>
+              <w:bottom w:type="dxa" w:w="60"/>
+              <w:right w:type="dxa" w:w="90"/>
+            </w:tcMar>
+          </w:tcPr>
+          <w:p>
+            <w:pPr>
+              <w:spacing w:after="0" w:line="240"/>
+              <w:jc w:val="center"/>
+            </w:pPr>
+            <w:r>
+              <w:rPr>
+                <w:b w:val="false"/>
+                <w:bCs w:val="false"/>
+                <w:sz w:val="17"/>
+                <w:szCs w:val="17"/>
+              </w:rPr>
+              <w:t xml:space="preserve">0,213</w:t>
+            </w:r>
+          </w:p>
+        </w:tc>
+        <w:tc>
+          <w:tcPr>
+            <w:tcW w:type="dxa" w:w="2866"/>
+            <w:tcMar>
+              <w:top w:type="dxa" w:w="60"/>
+              <w:left w:type="dxa" w:w="90"/>
+              <w:bottom w:type="dxa" w:w="60"/>
+              <w:right w:type="dxa" w:w="90"/>
+            </w:tcMar>
+          </w:tcPr>
+          <w:p>
+            <w:pPr>
+              <w:spacing w:after="0" w:line="240"/>
+              <w:jc w:val="left"/>
+            </w:pPr>
+            <w:r>
+              <w:rPr>
+                <w:b w:val="false"/>
+                <w:bCs w:val="false"/>
+                <w:sz w:val="17"/>
+                <w:szCs w:val="17"/>
+              </w:rPr>
+              <w:t xml:space="preserve">Salud</w:t>
+            </w:r>
+          </w:p>
+        </w:tc>
+        <w:tc>
+          <w:tcPr>
+            <w:tcW w:type="dxa" w:w="803"/>
+            <w:tcMar>
+              <w:top w:type="dxa" w:w="60"/>
+              <w:left w:type="dxa" w:w="90"/>
+              <w:bottom w:type="dxa" w:w="60"/>
+              <w:right w:type="dxa" w:w="90"/>
+            </w:tcMar>
+          </w:tcPr>
+          <w:p>
+            <w:pPr>
+              <w:spacing w:after="0" w:line="240"/>
+              <w:jc w:val="center"/>
+            </w:pPr>
+            <w:r>
+              <w:rPr>
+                <w:b w:val="false"/>
+                <w:bCs w:val="false"/>
+                <w:sz w:val="17"/>
+                <w:szCs w:val="17"/>
+              </w:rPr>
+              <w:t xml:space="preserve">1.355</w:t>
+            </w:r>
+          </w:p>
+        </w:tc>
+        <w:tc>
+          <w:tcPr>
+            <w:tcW w:type="dxa" w:w="917"/>
+            <w:tcMar>
+              <w:top w:type="dxa" w:w="60"/>
+              <w:left w:type="dxa" w:w="90"/>
+              <w:bottom w:type="dxa" w:w="60"/>
+              <w:right w:type="dxa" w:w="90"/>
+            </w:tcMar>
+          </w:tcPr>
+          <w:p>
+            <w:pPr>
+              <w:spacing w:after="0" w:line="240"/>
+              <w:jc w:val="center"/>
+            </w:pPr>
+            <w:r>
+              <w:rPr>
+                <w:b w:val="false"/>
+                <w:bCs w:val="false"/>
+                <w:sz w:val="17"/>
+                <w:szCs w:val="17"/>
+              </w:rPr>
+              <w:t xml:space="preserve">0,468</w:t>
+            </w:r>
+          </w:p>
+        </w:tc>
+      </w:tr>
+    </w:tbl>
+    <w:p>
+      <w:pPr>
+        <w:spacing w:after="110"/>
+      </w:pPr>
+      <w:r>
+        <w:rPr>
+          <w:sz w:val="8"/>
+          <w:szCs w:val="8"/>
+        </w:rPr>
+        <w:t xml:space="preserve"/>
       </w:r>
     </w:p>
     <w:p>
@@ -3304,7 +3583,7 @@
           <w:sz w:val="16"/>
           <w:szCs w:val="16"/>
         </w:rPr>
-        <w:t xml:space="preserve">Figura 3. Abandono aparente medio por área del conocimiento.</w:t>
+        <w:t xml:space="preserve">Figura 2. Dispersión del abandono dentro de cada tipo de institución.</w:t>
       </w:r>
     </w:p>
     <w:p>
@@ -3313,7 +3592,17 @@
         <w:jc w:val="both"/>
       </w:pPr>
       <w:r>
-        <w:t xml:space="preserve">Una última comprobación descarta la explicación más simple. El tamaño del programa se asocia negativamente con el abandono, pero la relación es débil: la correlación de Pearson con el logaritmo de la matrícula es de −0,247 y explica apenas un 6 % de la variación. Las franjas horizontales en 0 y 1 de la figura 4 corresponden a las acumulaciones ya comentadas.</w:t>
+        <w:t xml:space="preserve">La figura 2 contiene la advertencia más importante para la decisión: las cajas se solapan ampliamente, de modo que </w:t>
+      </w:r>
+      <w:r>
+        <w:rPr>
+          <w:b/>
+          <w:bCs/>
+        </w:rPr>
+        <w:t xml:space="preserve">la variación dentro de cada tipo de institución supera a la que hay entre tipos</w:t>
+      </w:r>
+      <w:r>
+        <w:t xml:space="preserve">. Focalizar por tipo de institución, que sería lo administrativamente más cómodo, dejaría fuera a buena parte de los programas con más abandono.</w:t>
       </w:r>
     </w:p>
     <w:p>
@@ -3375,6 +3664,77 @@
           <w:sz w:val="16"/>
           <w:szCs w:val="16"/>
         </w:rPr>
+        <w:t xml:space="preserve">Figura 3. Abandono aparente medio por área del conocimiento.</w:t>
+      </w:r>
+    </w:p>
+    <w:p>
+      <w:pPr>
+        <w:spacing w:after="120" w:line="264"/>
+        <w:jc w:val="both"/>
+      </w:pPr>
+      <w:r>
+        <w:t xml:space="preserve">Una última comprobación descarta la explicación más simple. El tamaño del programa se asocia negativamente con el abandono, pero la relación es débil: la correlación de Pearson con el logaritmo de la matrícula es de −0,247 y explica apenas un 6 % de la variación. Las franjas horizontales en 0 y 1 de la figura 4 corresponden a las acumulaciones ya comentadas.</w:t>
+      </w:r>
+    </w:p>
+    <w:p>
+      <w:pPr>
+        <w:spacing w:after="50" w:before="140"/>
+        <w:jc w:val="center"/>
+      </w:pPr>
+      <w:r>
+        <w:drawing>
+          <wp:inline distT="0" distB="0" distL="0" distR="0">
+            <wp:extent cx="5472684" cy="2845796"/>
+            <wp:effectExtent t="0" r="0" b="0" l="0"/>
+            <wp:docPr id="5" name="" descr="" title=""/>
+            <wp:cNvGraphicFramePr>
+              <a:graphicFrameLocks xmlns:a="http://schemas.openxmlformats.org/drawingml/2006/main" noChangeAspect="1"/>
+            </wp:cNvGraphicFramePr>
+            <a:graphic xmlns:a="http://schemas.openxmlformats.org/drawingml/2006/main">
+              <a:graphicData uri="http://schemas.openxmlformats.org/drawingml/2006/picture">
+                <pic:pic xmlns:pic="http://schemas.openxmlformats.org/drawingml/2006/picture">
+                  <pic:nvPicPr>
+                    <pic:cNvPr id="0" name="" descr=""/>
+                    <pic:cNvPicPr>
+                      <a:picLocks noChangeAspect="1" noChangeArrowheads="1"/>
+                    </pic:cNvPicPr>
+                  </pic:nvPicPr>
+                  <pic:blipFill>
+                    <a:blip r:embed="rId12" cstate="none"/>
+                    <a:srcRect/>
+                    <a:stretch>
+                      <a:fillRect/>
+                    </a:stretch>
+                  </pic:blipFill>
+                  <pic:spPr bwMode="auto">
+                    <a:xfrm>
+                      <a:off x="0" y="0"/>
+                      <a:ext cx="5472684" cy="2845796"/>
+                    </a:xfrm>
+                    <a:prstGeom prst="rect">
+                      <a:avLst/>
+                    </a:prstGeom>
+                  </pic:spPr>
+                </pic:pic>
+              </a:graphicData>
+            </a:graphic>
+          </wp:inline>
+        </w:drawing>
+      </w:r>
+    </w:p>
+    <w:p>
+      <w:pPr>
+        <w:spacing w:after="160"/>
+        <w:jc w:val="center"/>
+      </w:pPr>
+      <w:r>
+        <w:rPr>
+          <w:i/>
+          <w:iCs/>
+          <w:color w:val="555555"/>
+          <w:sz w:val="16"/>
+          <w:szCs w:val="16"/>
+        </w:rPr>
         <w:t xml:space="preserve">Figura 4. Abandono frente al tamaño del programa; la línea roja une la media de cada decil.</w:t>
       </w:r>
     </w:p>
@@ -3497,7 +3857,7 @@
         </w:trPr>
         <w:tc>
           <w:tcPr>
-            <w:tcW w:type="dxa" w:w="3400"/>
+            <w:tcW w:type="dxa" w:w="3460"/>
             <w:shd w:fill="F2F5F7" w:val="clear"/>
             <w:tcMar>
               <w:top w:type="dxa" w:w="60"/>
@@ -3524,7 +3884,7 @@
         </w:tc>
         <w:tc>
           <w:tcPr>
-            <w:tcW w:type="dxa" w:w="1900"/>
+            <w:tcW w:type="dxa" w:w="1934"/>
             <w:shd w:fill="F2F5F7" w:val="clear"/>
             <w:tcMar>
               <w:top w:type="dxa" w:w="60"/>
@@ -3551,7 +3911,7 @@
         </w:tc>
         <w:tc>
           <w:tcPr>
-            <w:tcW w:type="dxa" w:w="2200"/>
+            <w:tcW w:type="dxa" w:w="2239"/>
             <w:shd w:fill="F2F5F7" w:val="clear"/>
             <w:tcMar>
               <w:top w:type="dxa" w:w="60"/>
@@ -3578,7 +3938,7 @@
         </w:tc>
         <w:tc>
           <w:tcPr>
-            <w:tcW w:type="dxa" w:w="2300"/>
+            <w:tcW w:type="dxa" w:w="2341"/>
             <w:shd w:fill="F2F5F7" w:val="clear"/>
             <w:tcMar>
               <w:top w:type="dxa" w:w="60"/>
@@ -3607,7 +3967,7 @@
       <w:tr>
         <w:tc>
           <w:tcPr>
-            <w:tcW w:type="dxa" w:w="3400"/>
+            <w:tcW w:type="dxa" w:w="3460"/>
             <w:tcMar>
               <w:top w:type="dxa" w:w="60"/>
               <w:left w:type="dxa" w:w="90"/>
@@ -3633,7 +3993,7 @@
         </w:tc>
         <w:tc>
           <w:tcPr>
-            <w:tcW w:type="dxa" w:w="1900"/>
+            <w:tcW w:type="dxa" w:w="1934"/>
             <w:tcMar>
               <w:top w:type="dxa" w:w="60"/>
               <w:left w:type="dxa" w:w="90"/>
@@ -3659,7 +4019,7 @@
         </w:tc>
         <w:tc>
           <w:tcPr>
-            <w:tcW w:type="dxa" w:w="2200"/>
+            <w:tcW w:type="dxa" w:w="2239"/>
             <w:tcMar>
               <w:top w:type="dxa" w:w="60"/>
               <w:left w:type="dxa" w:w="90"/>
@@ -3685,7 +4045,7 @@
         </w:tc>
         <w:tc>
           <w:tcPr>
-            <w:tcW w:type="dxa" w:w="2300"/>
+            <w:tcW w:type="dxa" w:w="2341"/>
             <w:tcMar>
               <w:top w:type="dxa" w:w="60"/>
               <w:left w:type="dxa" w:w="90"/>
@@ -3713,7 +4073,7 @@
       <w:tr>
         <w:tc>
           <w:tcPr>
-            <w:tcW w:type="dxa" w:w="3400"/>
+            <w:tcW w:type="dxa" w:w="3460"/>
             <w:tcMar>
               <w:top w:type="dxa" w:w="60"/>
               <w:left w:type="dxa" w:w="90"/>
@@ -3739,7 +4099,7 @@
         </w:tc>
         <w:tc>
           <w:tcPr>
-            <w:tcW w:type="dxa" w:w="1900"/>
+            <w:tcW w:type="dxa" w:w="1934"/>
             <w:tcMar>
               <w:top w:type="dxa" w:w="60"/>
               <w:left w:type="dxa" w:w="90"/>
@@ -3765,7 +4125,7 @@
         </w:tc>
         <w:tc>
           <w:tcPr>
-            <w:tcW w:type="dxa" w:w="2200"/>
+            <w:tcW w:type="dxa" w:w="2239"/>
             <w:tcMar>
               <w:top w:type="dxa" w:w="60"/>
               <w:left w:type="dxa" w:w="90"/>
@@ -3791,7 +4151,7 @@
         </w:tc>
         <w:tc>
           <w:tcPr>
-            <w:tcW w:type="dxa" w:w="2300"/>
+            <w:tcW w:type="dxa" w:w="2341"/>
             <w:tcMar>
               <w:top w:type="dxa" w:w="60"/>
               <w:left w:type="dxa" w:w="90"/>
@@ -3819,7 +4179,7 @@
       <w:tr>
         <w:tc>
           <w:tcPr>
-            <w:tcW w:type="dxa" w:w="3400"/>
+            <w:tcW w:type="dxa" w:w="3460"/>
             <w:tcMar>
               <w:top w:type="dxa" w:w="60"/>
               <w:left w:type="dxa" w:w="90"/>
@@ -3845,7 +4205,7 @@
         </w:tc>
         <w:tc>
           <w:tcPr>
-            <w:tcW w:type="dxa" w:w="1900"/>
+            <w:tcW w:type="dxa" w:w="1934"/>
             <w:tcMar>
               <w:top w:type="dxa" w:w="60"/>
               <w:left w:type="dxa" w:w="90"/>
@@ -3871,7 +4231,7 @@
         </w:tc>
         <w:tc>
           <w:tcPr>
-            <w:tcW w:type="dxa" w:w="2200"/>
+            <w:tcW w:type="dxa" w:w="2239"/>
             <w:tcMar>
               <w:top w:type="dxa" w:w="60"/>
               <w:left w:type="dxa" w:w="90"/>
@@ -3897,7 +4257,7 @@
         </w:tc>
         <w:tc>
           <w:tcPr>
-            <w:tcW w:type="dxa" w:w="2300"/>
+            <w:tcW w:type="dxa" w:w="2341"/>
             <w:tcMar>
               <w:top w:type="dxa" w:w="60"/>
               <w:left w:type="dxa" w:w="90"/>
@@ -3964,7 +4324,7 @@
         <w:t xml:space="preserve">La proporción.</w:t>
       </w:r>
       <w:r>
-        <w:t xml:space="preserve"> Se emplea el método de Wilson en lugar de la aproximación normal porque no produce límites fuera del intervalo [0, 1] y conserva su cobertura cerca de los extremos. Con una proporción próxima a 0,5 y un </w:t>
+        <w:t xml:space="preserve"> Se emplea el método de Wilson (1927) en lugar de la aproximación normal porque no produce límites fuera del intervalo [0, 1] y conserva su cobertura cerca de los extremos. Con una proporción próxima a 0,5 y un </w:t>
       </w:r>
       <w:r>
         <w:rPr>
@@ -4044,7 +4404,7 @@
         <w:t xml:space="preserve">n</w:t>
       </w:r>
       <w:r>
-        <w:t xml:space="preserve"> = 9.678 detecta desviaciones irrelevantes. Lo que los procedimientos requieren no es que la variable sea normal, sino que lo sea la distribución de la media, que el teorema central del límite garantiza a este tamaño y que la asimetría casi nula refuerza. La prueba de Levene no rechaza la igualdad de varianzas (W = 0,869; p = 0,351); aun así se emplea la versión de Welch, que no la supone, por ser la opción conservadora.</w:t>
+        <w:t xml:space="preserve"> = 9.678 detecta desviaciones irrelevantes. Lo que los procedimientos requieren no es que la variable sea normal, sino que lo sea la distribución de la media, que el teorema central del límite garantiza a este tamaño y que la asimetría casi nula refuerza. La prueba de Levene no rechaza la igualdad de varianzas (W = 0,869; p = 0,351); aun así se emplea la versión de Welch (1947), que no la supone, por ser la opción conservadora.</w:t>
       </w:r>
     </w:p>
     <w:tbl>
@@ -4647,7 +5007,7 @@
         <w:t xml:space="preserve">d de Cohen de 0,80</w:t>
       </w:r>
       <w:r>
-        <w:t xml:space="preserve"> que la convención sitúa en el umbral de los efectos grandes: la acreditación no solo distingue grupos de forma detectable, sino de forma sustantiva. El área del conocimiento, en cambio, explica apenas el </w:t>
+        <w:t xml:space="preserve"> que la convención establecida por Cohen (1988) sitúa en el umbral de los efectos grandes: la acreditación no solo distingue grupos de forma detectable, sino de forma sustantiva. El área del conocimiento, en cambio, explica apenas el </w:t>
       </w:r>
       <w:r>
         <w:rPr>
@@ -4657,7 +5017,7 @@
         <w:t xml:space="preserve">4 % de la varianza</w:t>
       </w:r>
       <w:r>
-        <w:t xml:space="preserve"> del abandono, y el tipo de institución arroja una asociación que la V de Cramér califica de débil, coherente con el solapamiento que ya mostraba la figura 2.</w:t>
+        <w:t xml:space="preserve"> del abandono, y el tipo de institución arroja una asociación que la V de Cramér (1946) califica de débil, coherente con el solapamiento que ya mostraba la figura 2.</w:t>
       </w:r>
     </w:p>
     <w:p>
@@ -4676,7 +5036,7 @@
         <w:t xml:space="preserve">el valor p pierde casi toda capacidad de discriminar</w:t>
       </w:r>
       <w:r>
-        <w:t xml:space="preserve">: los tres contrastes arrojan valores entre 10⁻²⁰ y 10⁻⁷⁸, y aun así sus efectos van de grande a despreciable. Informar solo la significación llevaría a tratar los tres resultados como equivalentes, que es exactamente el error que una decisión de focalización no puede permitirse.</w:t>
+        <w:t xml:space="preserve">: los tres contrastes arrojan valores entre 10⁻²⁰ y 10⁻⁷⁸, y aun así sus efectos van de grande a despreciable. Informar solo la significación llevaría a tratar los tres resultados como equivalentes, que es exactamente el error que una decisión de focalización no puede permitirse. La advertencia es la misma que formula la American Statistical Association al recordar que un valor p, por sí solo, no mide la magnitud de un efecto ni su relevancia práctica (Wasserstein y Lazar, 2016).</w:t>
       </w:r>
     </w:p>
     <w:p>
@@ -4692,7 +5052,7 @@
           <w:sz w:val="17"/>
           <w:szCs w:val="17"/>
         </w:rPr>
-        <w:t xml:space="preserve">Las comparaciones múltiples de Tukey, que controlan el error por familia, confirman diferencias significativas en 30 de los 45 pares de áreas; la mayor separa Humanidades de Salud, con 17,4 puntos porcentuales.</w:t>
+        <w:t xml:space="preserve">Las comparaciones múltiples de Tukey (1949), que controlan el error por familia, confirman diferencias significativas en 30 de los 45 pares de áreas; la mayor separa Humanidades de Salud, con 17,4 puntos porcentuales.</w:t>
       </w:r>
     </w:p>
     <w:p>
@@ -4942,9 +5302,265 @@
         <w:t xml:space="preserve">Repositorio: https://github.com/santunez75/analisis-desercion</w:t>
       </w:r>
     </w:p>
+    <w:p>
+      <w:pPr>
+        <w:pStyle w:val="Heading1"/>
+        <w:spacing w:after="130" w:before="260"/>
+      </w:pPr>
+      <w:r>
+        <w:rPr>
+          <w:b/>
+          <w:bCs/>
+          <w:color w:val="1F3864"/>
+          <w:sz w:val="26"/>
+          <w:szCs w:val="26"/>
+        </w:rPr>
+        <w:t xml:space="preserve">9. Referencias</w:t>
+      </w:r>
+    </w:p>
+    <w:p>
+      <w:pPr>
+        <w:spacing w:after="110" w:line="264"/>
+        <w:ind w:left="420" w:hanging="420"/>
+        <w:jc w:val="both"/>
+      </w:pPr>
+      <w:r>
+        <w:t xml:space="preserve">Cohen, J. (1988). </w:t>
+      </w:r>
+      <w:r>
+        <w:rPr>
+          <w:i/>
+          <w:iCs/>
+        </w:rPr>
+        <w:t xml:space="preserve">Statistical power analysis for the behavioral sciences</w:t>
+      </w:r>
+      <w:r>
+        <w:t xml:space="preserve"> (2.ª ed.). Lawrence Erlbaum Associates.</w:t>
+      </w:r>
+    </w:p>
+    <w:p>
+      <w:pPr>
+        <w:spacing w:after="110" w:line="264"/>
+        <w:ind w:left="420" w:hanging="420"/>
+        <w:jc w:val="both"/>
+      </w:pPr>
+      <w:r>
+        <w:t xml:space="preserve">Cramér, H. (1946). </w:t>
+      </w:r>
+      <w:r>
+        <w:rPr>
+          <w:i/>
+          <w:iCs/>
+        </w:rPr>
+        <w:t xml:space="preserve">Mathematical methods of statistics</w:t>
+      </w:r>
+      <w:r>
+        <w:t xml:space="preserve">. Princeton University Press.</w:t>
+      </w:r>
+    </w:p>
+    <w:p>
+      <w:pPr>
+        <w:spacing w:after="110" w:line="264"/>
+        <w:ind w:left="420" w:hanging="420"/>
+        <w:jc w:val="both"/>
+      </w:pPr>
+      <w:r>
+        <w:t xml:space="preserve">Harris, C. R., Millman, K. J., van der Walt, S. J., Gommers, R., Virtanen, P., Cournapeau, D. et al. (2020). Array programming with NumPy. </w:t>
+      </w:r>
+      <w:r>
+        <w:rPr>
+          <w:i/>
+          <w:iCs/>
+        </w:rPr>
+        <w:t xml:space="preserve">Nature</w:t>
+      </w:r>
+      <w:r>
+        <w:t xml:space="preserve">, 585, 357–362.</w:t>
+      </w:r>
+    </w:p>
+    <w:p>
+      <w:pPr>
+        <w:spacing w:after="110" w:line="264"/>
+        <w:ind w:left="420" w:hanging="420"/>
+        <w:jc w:val="both"/>
+      </w:pPr>
+      <w:r>
+        <w:t xml:space="preserve">McKinney, W. (2010). Data structures for statistical computing in Python. En </w:t>
+      </w:r>
+      <w:r>
+        <w:rPr>
+          <w:i/>
+          <w:iCs/>
+        </w:rPr>
+        <w:t xml:space="preserve">Proceedings of the 9th Python in Science Conference</w:t>
+      </w:r>
+      <w:r>
+        <w:t xml:space="preserve"> (pp. 56–61).</w:t>
+      </w:r>
+    </w:p>
+    <w:p>
+      <w:pPr>
+        <w:spacing w:after="110" w:line="264"/>
+        <w:ind w:left="420" w:hanging="420"/>
+        <w:jc w:val="both"/>
+      </w:pPr>
+      <w:r>
+        <w:t xml:space="preserve">Seabold, S. y Perktold, J. (2010). statsmodels: econometric and statistical modeling with Python. En </w:t>
+      </w:r>
+      <w:r>
+        <w:rPr>
+          <w:i/>
+          <w:iCs/>
+        </w:rPr>
+        <w:t xml:space="preserve">Proceedings of the 9th Python in Science Conference</w:t>
+      </w:r>
+      <w:r>
+        <w:t xml:space="preserve"> (pp. 92–96).</w:t>
+      </w:r>
+    </w:p>
+    <w:p>
+      <w:pPr>
+        <w:spacing w:after="110" w:line="264"/>
+        <w:ind w:left="420" w:hanging="420"/>
+        <w:jc w:val="both"/>
+      </w:pPr>
+      <w:r>
+        <w:t xml:space="preserve">Servicio de Información de Educación Superior. (2026). </w:t>
+      </w:r>
+      <w:r>
+        <w:rPr>
+          <w:i/>
+          <w:iCs/>
+        </w:rPr>
+        <w:t xml:space="preserve">Bases de datos de matrícula en educación superior 2007–2026</w:t>
+      </w:r>
+      <w:r>
+        <w:t xml:space="preserve">. Ministerio de Educación de Chile. https://datosabiertos.mineduc.cl/</w:t>
+      </w:r>
+    </w:p>
+    <w:p>
+      <w:pPr>
+        <w:spacing w:after="110" w:line="264"/>
+        <w:ind w:left="420" w:hanging="420"/>
+        <w:jc w:val="both"/>
+      </w:pPr>
+      <w:r>
+        <w:t xml:space="preserve">Servicio de Información de Educación Superior. (2026). </w:t>
+      </w:r>
+      <w:r>
+        <w:rPr>
+          <w:i/>
+          <w:iCs/>
+        </w:rPr>
+        <w:t xml:space="preserve">Bases de datos de titulados de educación superior 2007–2025</w:t>
+      </w:r>
+      <w:r>
+        <w:t xml:space="preserve">. Ministerio de Educación de Chile. https://datosabiertos.mineduc.cl/</w:t>
+      </w:r>
+    </w:p>
+    <w:p>
+      <w:pPr>
+        <w:spacing w:after="110" w:line="264"/>
+        <w:ind w:left="420" w:hanging="420"/>
+        <w:jc w:val="both"/>
+      </w:pPr>
+      <w:r>
+        <w:t xml:space="preserve">Tukey, J. W. (1949). Comparing individual means in the analysis of variance. </w:t>
+      </w:r>
+      <w:r>
+        <w:rPr>
+          <w:i/>
+          <w:iCs/>
+        </w:rPr>
+        <w:t xml:space="preserve">Biometrics</w:t>
+      </w:r>
+      <w:r>
+        <w:t xml:space="preserve">, 5(2), 99–114.</w:t>
+      </w:r>
+    </w:p>
+    <w:p>
+      <w:pPr>
+        <w:spacing w:after="110" w:line="264"/>
+        <w:ind w:left="420" w:hanging="420"/>
+        <w:jc w:val="both"/>
+      </w:pPr>
+      <w:r>
+        <w:t xml:space="preserve">Virtanen, P., Gommers, R., Oliphant, T. E., Haberland, M., Reddy, T., Cournapeau, D. et al. (2020). SciPy 1.0: fundamental algorithms for scientific computing in Python. </w:t>
+      </w:r>
+      <w:r>
+        <w:rPr>
+          <w:i/>
+          <w:iCs/>
+        </w:rPr>
+        <w:t xml:space="preserve">Nature Methods</w:t>
+      </w:r>
+      <w:r>
+        <w:t xml:space="preserve">, 17, 261–272.</w:t>
+      </w:r>
+    </w:p>
+    <w:p>
+      <w:pPr>
+        <w:spacing w:after="110" w:line="264"/>
+        <w:ind w:left="420" w:hanging="420"/>
+        <w:jc w:val="both"/>
+      </w:pPr>
+      <w:r>
+        <w:t xml:space="preserve">Wasserstein, R. L. y Lazar, N. A. (2016). The ASA statement on p-values: context, process, and purpose. </w:t>
+      </w:r>
+      <w:r>
+        <w:rPr>
+          <w:i/>
+          <w:iCs/>
+        </w:rPr>
+        <w:t xml:space="preserve">The American Statistician</w:t>
+      </w:r>
+      <w:r>
+        <w:t xml:space="preserve">, 70(2), 129–133.</w:t>
+      </w:r>
+    </w:p>
+    <w:p>
+      <w:pPr>
+        <w:spacing w:after="110" w:line="264"/>
+        <w:ind w:left="420" w:hanging="420"/>
+        <w:jc w:val="both"/>
+      </w:pPr>
+      <w:r>
+        <w:t xml:space="preserve">Welch, B. L. (1947). The generalization of «Student’s» problem when several different population variances are involved. </w:t>
+      </w:r>
+      <w:r>
+        <w:rPr>
+          <w:i/>
+          <w:iCs/>
+        </w:rPr>
+        <w:t xml:space="preserve">Biometrika</w:t>
+      </w:r>
+      <w:r>
+        <w:t xml:space="preserve">, 34(1–2), 28–35.</w:t>
+      </w:r>
+    </w:p>
+    <w:p>
+      <w:pPr>
+        <w:spacing w:after="110" w:line="264"/>
+        <w:ind w:left="420" w:hanging="420"/>
+        <w:jc w:val="both"/>
+      </w:pPr>
+      <w:r>
+        <w:t xml:space="preserve">Wilson, E. B. (1927). Probable inference, the law of succession, and statistical inference. </w:t>
+      </w:r>
+      <w:r>
+        <w:rPr>
+          <w:i/>
+          <w:iCs/>
+        </w:rPr>
+        <w:t xml:space="preserve">Journal of the American Statistical Association</w:t>
+      </w:r>
+      <w:r>
+        <w:t xml:space="preserve">, 22(158), 209–212.</w:t>
+      </w:r>
+    </w:p>
     <w:sectPr>
       <w:footerReference w:type="default" r:id="rId6"/>
-      <w:pgSz w:w="11906" w:h="16838" w:orient="portrait"/>
+      <w:pgSz w:w="12240" w:h="15840" w:orient="portrait"/>
       <w:pgMar w:top="1133" w:right="1133" w:bottom="1020" w:left="1133" w:header="708" w:footer="708" w:gutter="0"/>
       <w:pgNumType/>
       <w:docGrid w:linePitch="360"/>

</xml_diff>

<commit_message>
docs: ajusta el informe al limite real de diez paginas
El maximo son diez paginas de contenido, sin contar portada ni
referencias, de modo que la compresion en tres pasadas que se habia hecho
para caber en ocho sobraba y costaba legibilidad.

- se revierte el recorte de prosa: vuelven el diagnostico de los extremos
  en tres parrafos, la discusion sobre que poblacion se infiere, las
  cuatro afirmaciones de la interpretacion y las limitaciones completas
- cuerpo de nuevo a 10,5 pt con su interlineado original
- figuras a 13,2 cm, legibles, y vuelve la de areas del conocimiento, con
  su comentario; se corrige ademas el orden, que dejaba la figura 4 antes
  del parrafo que comenta la 3
- vuelven las cuatro referencias de bibliotecas de calculo

Nueve paginas de contenido de las diez permitidas, con las paginas llenas.

Co-authored-by: María Fassler Neumann <m.fasslerneumann@uandresbello.edu>
</commit_message>
<xml_diff>
--- a/informe/Sumativa1_Informe_Sebastian_Antunez.docx
+++ b/informe/Sumativa1_Informe_Sebastian_Antunez.docx
@@ -433,30 +433,39 @@
     </w:p>
     <w:p>
       <w:pPr>
-        <w:spacing w:after="110" w:line="256"/>
+        <w:spacing w:after="120" w:line="264"/>
         <w:jc w:val="both"/>
       </w:pPr>
       <w:r>
-        <w:t xml:space="preserve">Más de la mitad de quienes ingresan a un programa de pregrado en Chile no llega a titularse de él, con consecuencias para el estudiante, para la institución que sostiene vacantes que no rinden y para el Estado que subsidia matrículas sin contrapartida. Este informe aborda una situación concreta de decisión bajo incertidumbre: </w:t>
+        <w:t xml:space="preserve">Más de la mitad de quienes ingresan a un programa de pregrado en Chile no llega a titularse de él. El hecho tiene consecuencias para el estudiante, que pierde tiempo y dinero; para la institución, que sostiene vacantes que no rinden; y para el Estado, que subsidia matrículas sin contrapartida.</w:t>
+      </w:r>
+    </w:p>
+    <w:p>
+      <w:pPr>
+        <w:spacing w:after="120" w:line="264"/>
+        <w:jc w:val="both"/>
+      </w:pPr>
+      <w:r>
+        <w:t xml:space="preserve">Este informe aborda una situación concreta de decisión bajo incertidumbre: </w:t>
       </w:r>
       <w:r>
         <w:rPr>
           <w:b/>
           <w:bCs/>
         </w:rPr>
-        <w:t xml:space="preserve">una autoridad dispone de presupuesto para un programa de retención que solo cubre una fracción del sistema y debe decidir dónde concentrarlo.</w:t>
-      </w:r>
-      <w:r>
-        <w:t xml:space="preserve"> La incertidumbre es doble: el abandono no se observa directamente sino que se estima de registros agregados, y no se sabe de antemano qué criterio de focalización separa mejor a los programas problemáticos.</w:t>
-      </w:r>
-    </w:p>
-    <w:p>
-      <w:pPr>
-        <w:spacing w:after="110" w:line="256"/>
+        <w:t xml:space="preserve">una autoridad dispone de presupuesto para un programa de retención que solo alcanza a cubrir una fracción de los programas del sistema, y debe decidir dónde concentrarlo.</w:t>
+      </w:r>
+      <w:r>
+        <w:t xml:space="preserve"> La incertidumbre es doble. Por un lado, el abandono de cada programa no se observa directamente, sino que se estima a partir de registros agregados. Por otro, no se sabe de antemano qué criterio de focalización separa mejor a los programas problemáticos de los demás.</w:t>
+      </w:r>
+    </w:p>
+    <w:p>
+      <w:pPr>
+        <w:spacing w:after="120" w:line="264"/>
         <w:jc w:val="both"/>
       </w:pPr>
       <w:r>
-        <w:t xml:space="preserve">De ahí las tres preguntas que estructuran el trabajo, cada una asociada a un procedimiento: (i) cuál es la magnitud del abandono y cuánto varía entre programas, que responde la estadística descriptiva; (ii) con qué precisión puede estimarse, que responden los intervalos de confianza; y (iii) qué características distinguen a los programas con más abandono y cuáles de esas diferencias bastan para orientar la decisión, que responden los contrastes junto al tamaño del efecto.</w:t>
+        <w:t xml:space="preserve">De ahí las tres preguntas que estructuran el trabajo, cada una asociada a un procedimiento estadístico: (i) cuál es la magnitud del abandono y cuánto varía entre programas, que responde la estadística descriptiva; (ii) con qué precisión puede estimarse el abandono del sistema, que responden los intervalos de confianza; y (iii) qué características distinguen a los programas con más abandono y cuáles de esas diferencias son lo bastante grandes como para orientar la decisión, que responden los contrastes de hipótesis junto al tamaño del efecto.</w:t>
       </w:r>
     </w:p>
     <w:p>
@@ -493,7 +502,7 @@
     </w:p>
     <w:p>
       <w:pPr>
-        <w:spacing w:after="110" w:line="256"/>
+        <w:spacing w:after="120" w:line="264"/>
         <w:jc w:val="both"/>
       </w:pPr>
       <w:r>
@@ -502,7 +511,7 @@
     </w:p>
     <w:p>
       <w:pPr>
-        <w:spacing w:after="110" w:line="256"/>
+        <w:spacing w:after="120" w:line="264"/>
         <w:jc w:val="both"/>
       </w:pPr>
       <w:r>
@@ -526,7 +535,7 @@
         <w:t xml:space="preserve">y − L</w:t>
       </w:r>
       <w:r>
-        <w:t xml:space="preserve">, siendo </w:t>
+        <w:t xml:space="preserve">, donde </w:t>
       </w:r>
       <w:r>
         <w:rPr>
@@ -536,7 +545,7 @@
         <w:t xml:space="preserve">L</w:t>
       </w:r>
       <w:r>
-        <w:t xml:space="preserve"> la duración formal en años. La titulación aparente es el cociente entre ambas sumas acumuladas entre 2010 y 2025, y el </w:t>
+        <w:t xml:space="preserve"> es la duración formal de la carrera en años. La titulación aparente es el cociente entre ambas sumas acumuladas entre 2010 y 2025, y el </w:t>
       </w:r>
       <w:r>
         <w:rPr>
@@ -546,16 +555,23 @@
         <w:t xml:space="preserve">abandono</w:t>
       </w:r>
       <w:r>
-        <w:t xml:space="preserve"> es su complemento. Se conservan solo los programas con al menos 100 estudiantes de ingreso acumulado.</w:t>
-      </w:r>
-    </w:p>
-    <w:p>
-      <w:pPr>
-        <w:spacing w:after="110" w:line="256"/>
+        <w:t xml:space="preserve"> es su complemento. Se conservan solo los programas con al menos 100 estudiantes de ingreso acumulado, para que el cociente no dependa de unas pocas personas.</w:t>
+      </w:r>
+    </w:p>
+    <w:p>
+      <w:pPr>
+        <w:spacing w:after="140" w:before="60" w:line="240"/>
         <w:jc w:val="both"/>
       </w:pPr>
       <w:r>
-        <w:t xml:space="preserve">El adjetivo «aparente» no es un adorno: con datos agregados, quien se cambia de carrera y se titula en otra parte cuenta aquí como abandono, de modo que la cifra estimada es una cota superior del abandono real.</w:t>
+        <w:rPr>
+          <w:i/>
+          <w:iCs/>
+          <w:color w:val="444444"/>
+          <w:sz w:val="17"/>
+          <w:szCs w:val="17"/>
+        </w:rPr>
+        <w:t xml:space="preserve">El adjetivo «aparente» no es un adorno. Con datos agregados, quien se cambia de carrera o de institución y se titula en otra parte cuenta aquí como abandono, y quien se titula muy tarde puede quedar fuera de la ventana observada. La cifra estimada es, por tanto, una cota superior del abandono real.</w:t>
       </w:r>
     </w:p>
     <w:p>
@@ -576,7 +592,7 @@
     </w:p>
     <w:p>
       <w:pPr>
-        <w:spacing w:after="110" w:line="256"/>
+        <w:spacing w:after="120" w:line="264"/>
         <w:jc w:val="both"/>
       </w:pPr>
       <w:r>
@@ -1153,7 +1169,7 @@
     </w:p>
     <w:p>
       <w:pPr>
-        <w:spacing w:after="110" w:line="256"/>
+        <w:spacing w:after="120" w:line="264"/>
         <w:jc w:val="both"/>
       </w:pPr>
       <w:r>
@@ -1286,7 +1302,7 @@
                 <w:sz w:val="17"/>
                 <w:szCs w:val="17"/>
               </w:rPr>
-              <w:t xml:space="preserve">Filas duplicadas y códigos de programa repetidos</w:t>
+              <w:t xml:space="preserve">Filas completamente duplicadas</w:t>
             </w:r>
           </w:p>
         </w:tc>
@@ -1366,7 +1382,7 @@
                 <w:sz w:val="17"/>
                 <w:szCs w:val="17"/>
               </w:rPr>
-              <w:t xml:space="preserve">Valores faltantes</w:t>
+              <w:t xml:space="preserve">Programas con código repetido</w:t>
             </w:r>
           </w:p>
         </w:tc>
@@ -1446,7 +1462,7 @@
                 <w:sz w:val="17"/>
                 <w:szCs w:val="17"/>
               </w:rPr>
-              <w:t xml:space="preserve">Valores fuera de dominio (proporciones, abandono, edad, umbral de ingreso)</w:t>
+              <w:t xml:space="preserve">Valores faltantes</w:t>
             </w:r>
           </w:p>
         </w:tc>
@@ -1526,7 +1542,7 @@
                 <w:sz w:val="17"/>
                 <w:szCs w:val="17"/>
               </w:rPr>
-              <w:t xml:space="preserve">Duración fuera de 1 a 10 años</w:t>
+              <w:t xml:space="preserve">Proporciones fuera de [0, 1]</w:t>
             </w:r>
           </w:p>
         </w:tc>
@@ -1552,7 +1568,7 @@
                 <w:sz w:val="17"/>
                 <w:szCs w:val="17"/>
               </w:rPr>
-              <w:t xml:space="preserve">1</w:t>
+              <w:t xml:space="preserve">0</w:t>
             </w:r>
           </w:p>
         </w:tc>
@@ -1578,7 +1594,7 @@
                 <w:sz w:val="17"/>
                 <w:szCs w:val="17"/>
               </w:rPr>
-              <w:t xml:space="preserve">revisar</w:t>
+              <w:t xml:space="preserve">correcto</w:t>
             </w:r>
           </w:p>
         </w:tc>
@@ -1606,6 +1622,326 @@
                 <w:sz w:val="17"/>
                 <w:szCs w:val="17"/>
               </w:rPr>
+              <w:t xml:space="preserve">Abandono fuera de [0, 1]</w:t>
+            </w:r>
+          </w:p>
+        </w:tc>
+        <w:tc>
+          <w:tcPr>
+            <w:tcW w:type="dxa" w:w="1221"/>
+            <w:tcMar>
+              <w:top w:type="dxa" w:w="60"/>
+              <w:left w:type="dxa" w:w="90"/>
+              <w:bottom w:type="dxa" w:w="60"/>
+              <w:right w:type="dxa" w:w="90"/>
+            </w:tcMar>
+          </w:tcPr>
+          <w:p>
+            <w:pPr>
+              <w:spacing w:after="0" w:line="240"/>
+              <w:jc w:val="center"/>
+            </w:pPr>
+            <w:r>
+              <w:rPr>
+                <w:b w:val="false"/>
+                <w:bCs w:val="false"/>
+                <w:sz w:val="17"/>
+                <w:szCs w:val="17"/>
+              </w:rPr>
+              <w:t xml:space="preserve">0</w:t>
+            </w:r>
+          </w:p>
+        </w:tc>
+        <w:tc>
+          <w:tcPr>
+            <w:tcW w:type="dxa" w:w="2239"/>
+            <w:tcMar>
+              <w:top w:type="dxa" w:w="60"/>
+              <w:left w:type="dxa" w:w="90"/>
+              <w:bottom w:type="dxa" w:w="60"/>
+              <w:right w:type="dxa" w:w="90"/>
+            </w:tcMar>
+          </w:tcPr>
+          <w:p>
+            <w:pPr>
+              <w:spacing w:after="0" w:line="240"/>
+              <w:jc w:val="center"/>
+            </w:pPr>
+            <w:r>
+              <w:rPr>
+                <w:b w:val="false"/>
+                <w:bCs w:val="false"/>
+                <w:sz w:val="17"/>
+                <w:szCs w:val="17"/>
+              </w:rPr>
+              <w:t xml:space="preserve">correcto</w:t>
+            </w:r>
+          </w:p>
+        </w:tc>
+      </w:tr>
+      <w:tr>
+        <w:tc>
+          <w:tcPr>
+            <w:tcW w:type="dxa" w:w="6514"/>
+            <w:tcMar>
+              <w:top w:type="dxa" w:w="60"/>
+              <w:left w:type="dxa" w:w="90"/>
+              <w:bottom w:type="dxa" w:w="60"/>
+              <w:right w:type="dxa" w:w="90"/>
+            </w:tcMar>
+          </w:tcPr>
+          <w:p>
+            <w:pPr>
+              <w:spacing w:after="0" w:line="240"/>
+              <w:jc w:val="left"/>
+            </w:pPr>
+            <w:r>
+              <w:rPr>
+                <w:b w:val="false"/>
+                <w:bCs w:val="false"/>
+                <w:sz w:val="17"/>
+                <w:szCs w:val="17"/>
+              </w:rPr>
+              <w:t xml:space="preserve">Edad media fuera de 16 a 60 años</w:t>
+            </w:r>
+          </w:p>
+        </w:tc>
+        <w:tc>
+          <w:tcPr>
+            <w:tcW w:type="dxa" w:w="1221"/>
+            <w:tcMar>
+              <w:top w:type="dxa" w:w="60"/>
+              <w:left w:type="dxa" w:w="90"/>
+              <w:bottom w:type="dxa" w:w="60"/>
+              <w:right w:type="dxa" w:w="90"/>
+            </w:tcMar>
+          </w:tcPr>
+          <w:p>
+            <w:pPr>
+              <w:spacing w:after="0" w:line="240"/>
+              <w:jc w:val="center"/>
+            </w:pPr>
+            <w:r>
+              <w:rPr>
+                <w:b w:val="false"/>
+                <w:bCs w:val="false"/>
+                <w:sz w:val="17"/>
+                <w:szCs w:val="17"/>
+              </w:rPr>
+              <w:t xml:space="preserve">0</w:t>
+            </w:r>
+          </w:p>
+        </w:tc>
+        <w:tc>
+          <w:tcPr>
+            <w:tcW w:type="dxa" w:w="2239"/>
+            <w:tcMar>
+              <w:top w:type="dxa" w:w="60"/>
+              <w:left w:type="dxa" w:w="90"/>
+              <w:bottom w:type="dxa" w:w="60"/>
+              <w:right w:type="dxa" w:w="90"/>
+            </w:tcMar>
+          </w:tcPr>
+          <w:p>
+            <w:pPr>
+              <w:spacing w:after="0" w:line="240"/>
+              <w:jc w:val="center"/>
+            </w:pPr>
+            <w:r>
+              <w:rPr>
+                <w:b w:val="false"/>
+                <w:bCs w:val="false"/>
+                <w:sz w:val="17"/>
+                <w:szCs w:val="17"/>
+              </w:rPr>
+              <w:t xml:space="preserve">correcto</w:t>
+            </w:r>
+          </w:p>
+        </w:tc>
+      </w:tr>
+      <w:tr>
+        <w:tc>
+          <w:tcPr>
+            <w:tcW w:type="dxa" w:w="6514"/>
+            <w:tcMar>
+              <w:top w:type="dxa" w:w="60"/>
+              <w:left w:type="dxa" w:w="90"/>
+              <w:bottom w:type="dxa" w:w="60"/>
+              <w:right w:type="dxa" w:w="90"/>
+            </w:tcMar>
+          </w:tcPr>
+          <w:p>
+            <w:pPr>
+              <w:spacing w:after="0" w:line="240"/>
+              <w:jc w:val="left"/>
+            </w:pPr>
+            <w:r>
+              <w:rPr>
+                <w:b w:val="false"/>
+                <w:bCs w:val="false"/>
+                <w:sz w:val="17"/>
+                <w:szCs w:val="17"/>
+              </w:rPr>
+              <w:t xml:space="preserve">Programas bajo el umbral declarado de 100 de ingreso</w:t>
+            </w:r>
+          </w:p>
+        </w:tc>
+        <w:tc>
+          <w:tcPr>
+            <w:tcW w:type="dxa" w:w="1221"/>
+            <w:tcMar>
+              <w:top w:type="dxa" w:w="60"/>
+              <w:left w:type="dxa" w:w="90"/>
+              <w:bottom w:type="dxa" w:w="60"/>
+              <w:right w:type="dxa" w:w="90"/>
+            </w:tcMar>
+          </w:tcPr>
+          <w:p>
+            <w:pPr>
+              <w:spacing w:after="0" w:line="240"/>
+              <w:jc w:val="center"/>
+            </w:pPr>
+            <w:r>
+              <w:rPr>
+                <w:b w:val="false"/>
+                <w:bCs w:val="false"/>
+                <w:sz w:val="17"/>
+                <w:szCs w:val="17"/>
+              </w:rPr>
+              <w:t xml:space="preserve">0</w:t>
+            </w:r>
+          </w:p>
+        </w:tc>
+        <w:tc>
+          <w:tcPr>
+            <w:tcW w:type="dxa" w:w="2239"/>
+            <w:tcMar>
+              <w:top w:type="dxa" w:w="60"/>
+              <w:left w:type="dxa" w:w="90"/>
+              <w:bottom w:type="dxa" w:w="60"/>
+              <w:right w:type="dxa" w:w="90"/>
+            </w:tcMar>
+          </w:tcPr>
+          <w:p>
+            <w:pPr>
+              <w:spacing w:after="0" w:line="240"/>
+              <w:jc w:val="center"/>
+            </w:pPr>
+            <w:r>
+              <w:rPr>
+                <w:b w:val="false"/>
+                <w:bCs w:val="false"/>
+                <w:sz w:val="17"/>
+                <w:szCs w:val="17"/>
+              </w:rPr>
+              <w:t xml:space="preserve">correcto</w:t>
+            </w:r>
+          </w:p>
+        </w:tc>
+      </w:tr>
+      <w:tr>
+        <w:tc>
+          <w:tcPr>
+            <w:tcW w:type="dxa" w:w="6514"/>
+            <w:tcMar>
+              <w:top w:type="dxa" w:w="60"/>
+              <w:left w:type="dxa" w:w="90"/>
+              <w:bottom w:type="dxa" w:w="60"/>
+              <w:right w:type="dxa" w:w="90"/>
+            </w:tcMar>
+          </w:tcPr>
+          <w:p>
+            <w:pPr>
+              <w:spacing w:after="0" w:line="240"/>
+              <w:jc w:val="left"/>
+            </w:pPr>
+            <w:r>
+              <w:rPr>
+                <w:b w:val="false"/>
+                <w:bCs w:val="false"/>
+                <w:sz w:val="17"/>
+                <w:szCs w:val="17"/>
+              </w:rPr>
+              <w:t xml:space="preserve">Duración fuera de 1 a 10 años</w:t>
+            </w:r>
+          </w:p>
+        </w:tc>
+        <w:tc>
+          <w:tcPr>
+            <w:tcW w:type="dxa" w:w="1221"/>
+            <w:tcMar>
+              <w:top w:type="dxa" w:w="60"/>
+              <w:left w:type="dxa" w:w="90"/>
+              <w:bottom w:type="dxa" w:w="60"/>
+              <w:right w:type="dxa" w:w="90"/>
+            </w:tcMar>
+          </w:tcPr>
+          <w:p>
+            <w:pPr>
+              <w:spacing w:after="0" w:line="240"/>
+              <w:jc w:val="center"/>
+            </w:pPr>
+            <w:r>
+              <w:rPr>
+                <w:b w:val="false"/>
+                <w:bCs w:val="false"/>
+                <w:sz w:val="17"/>
+                <w:szCs w:val="17"/>
+              </w:rPr>
+              <w:t xml:space="preserve">1</w:t>
+            </w:r>
+          </w:p>
+        </w:tc>
+        <w:tc>
+          <w:tcPr>
+            <w:tcW w:type="dxa" w:w="2239"/>
+            <w:tcMar>
+              <w:top w:type="dxa" w:w="60"/>
+              <w:left w:type="dxa" w:w="90"/>
+              <w:bottom w:type="dxa" w:w="60"/>
+              <w:right w:type="dxa" w:w="90"/>
+            </w:tcMar>
+          </w:tcPr>
+          <w:p>
+            <w:pPr>
+              <w:spacing w:after="0" w:line="240"/>
+              <w:jc w:val="center"/>
+            </w:pPr>
+            <w:r>
+              <w:rPr>
+                <w:b w:val="false"/>
+                <w:bCs w:val="false"/>
+                <w:sz w:val="17"/>
+                <w:szCs w:val="17"/>
+              </w:rPr>
+              <w:t xml:space="preserve">revisar</w:t>
+            </w:r>
+          </w:p>
+        </w:tc>
+      </w:tr>
+      <w:tr>
+        <w:tc>
+          <w:tcPr>
+            <w:tcW w:type="dxa" w:w="6514"/>
+            <w:tcMar>
+              <w:top w:type="dxa" w:w="60"/>
+              <w:left w:type="dxa" w:w="90"/>
+              <w:bottom w:type="dxa" w:w="60"/>
+              <w:right w:type="dxa" w:w="90"/>
+            </w:tcMar>
+          </w:tcPr>
+          <w:p>
+            <w:pPr>
+              <w:spacing w:after="0" w:line="240"/>
+              <w:jc w:val="left"/>
+            </w:pPr>
+            <w:r>
+              <w:rPr>
+                <w:b w:val="false"/>
+                <w:bCs w:val="false"/>
+                <w:sz w:val="17"/>
+                <w:szCs w:val="17"/>
+              </w:rPr>
               <w:t xml:space="preserve">Titulados por sobre el ingreso de la cohorte</w:t>
             </w:r>
           </w:p>
@@ -1678,7 +2014,7 @@
     </w:p>
     <w:p>
       <w:pPr>
-        <w:spacing w:after="110" w:line="256"/>
+        <w:spacing w:after="120" w:line="264"/>
         <w:jc w:val="both"/>
       </w:pPr>
       <w:r>
@@ -1713,7 +2049,7 @@
     </w:p>
     <w:p>
       <w:pPr>
-        <w:spacing w:after="110" w:line="256"/>
+        <w:spacing w:after="120" w:line="264"/>
         <w:jc w:val="both"/>
       </w:pPr>
       <w:r>
@@ -2554,7 +2890,7 @@
     </w:p>
     <w:p>
       <w:pPr>
-        <w:spacing w:after="110" w:line="256"/>
+        <w:spacing w:after="120" w:line="264"/>
         <w:jc w:val="both"/>
       </w:pPr>
       <w:r>
@@ -2570,7 +2906,7 @@
     </w:p>
     <w:p>
       <w:pPr>
-        <w:spacing w:after="110" w:line="256"/>
+        <w:spacing w:after="120" w:line="264"/>
         <w:jc w:val="both"/>
       </w:pPr>
       <w:r>
@@ -2586,7 +2922,7 @@
     </w:p>
     <w:p>
       <w:pPr>
-        <w:spacing w:after="110" w:line="256"/>
+        <w:spacing w:after="120" w:line="264"/>
         <w:jc w:val="both"/>
       </w:pPr>
       <w:r>
@@ -2608,7 +2944,7 @@
       <w:r>
         <w:drawing>
           <wp:inline distT="0" distB="0" distL="0" distR="0">
-            <wp:extent cx="3888486" cy="2358424"/>
+            <wp:extent cx="4752594" cy="2882518"/>
             <wp:effectExtent t="0" r="0" b="0" l="0"/>
             <wp:docPr id="2" name="" descr="" title=""/>
             <wp:cNvGraphicFramePr>
@@ -2633,7 +2969,7 @@
                   <pic:spPr bwMode="auto">
                     <a:xfrm>
                       <a:off x="0" y="0"/>
-                      <a:ext cx="3888486" cy="2358424"/>
+                      <a:ext cx="4752594" cy="2882518"/>
                     </a:xfrm>
                     <a:prstGeom prst="rect">
                       <a:avLst/>
@@ -2664,18 +3000,18 @@
     </w:p>
     <w:p>
       <w:pPr>
-        <w:spacing w:after="110" w:line="256"/>
+        <w:spacing w:after="120" w:line="264"/>
         <w:jc w:val="both"/>
       </w:pPr>
       <w:r>
-        <w:t xml:space="preserve">La figura 1 muestra dos acumulaciones en los extremos, </w:t>
+        <w:t xml:space="preserve">La figura 1 muestra además dos acumulaciones en los extremos: </w:t>
       </w:r>
       <w:r>
         <w:rPr>
           <w:b/>
           <w:bCs/>
         </w:rPr>
-        <w:t xml:space="preserve">305 programas (3,2 %) con abandono cero</w:t>
+        <w:t xml:space="preserve">305 programas (3,2 %) con abandono exactamente cero</w:t>
       </w:r>
       <w:r>
         <w:t xml:space="preserve"> y </w:t>
@@ -2688,27 +3024,45 @@
         <w:t xml:space="preserve">160 (1,7 %) con abandono uno</w:t>
       </w:r>
       <w:r>
-        <w:t xml:space="preserve">, que conviene diagnosticar porque podrían delatar un desajuste entre las bases de origen. Se cruzó cada uno con su último año de matrícula y con las titulaciones acumuladas en cualquier año. </w:t>
+        <w:t xml:space="preserve">. Conviene averiguar si describen el fenómeno o delatan un desajuste entre las dos bases de origen, porque la interpretación cambia por completo. Se cruzó cada uno de esos 465 programas con el último año en que registró matrícula y con las titulaciones acumuladas en cualquier año.</w:t>
+      </w:r>
+    </w:p>
+    <w:p>
+      <w:pPr>
+        <w:spacing w:after="120" w:line="264"/>
+        <w:jc w:val="both"/>
+      </w:pPr>
+      <w:r>
+        <w:t xml:space="preserve">El diagnóstico separa dos situaciones. </w:t>
       </w:r>
       <w:r>
         <w:rPr>
           <w:b/>
           <w:bCs/>
         </w:rPr>
-        <w:t xml:space="preserve">Los 160 con abandono uno son, en su gran mayoría, programas que cerraron</w:t>
-      </w:r>
-      <w:r>
-        <w:t xml:space="preserve">: el 91 % dejó de matricular antes o durante el año de egreso esperado; solo 14 seguían activos y 11 de ellos sí registran titulaciones, de modo que en esos el cero refleja el desfase de la ventana y no la realidad. </w:t>
+        <w:t xml:space="preserve">Los 160 programas con abandono uno son, en su gran mayoría, programas que cerraron</w:t>
+      </w:r>
+      <w:r>
+        <w:t xml:space="preserve">: el 91 % dejó de matricular antes o durante el año de egreso esperado, lo que es coherente con un programa discontinuado antes de titular a su primera cohorte. Solo 14 seguían activos después de esa fecha y 11 de ellos sí registran titulaciones en algún año; en esos casos el cero no describe la realidad, sino el desfase entre la ventana de observación y el egreso efectivo. </w:t>
       </w:r>
       <w:r>
         <w:rPr>
           <w:b/>
           <w:bCs/>
         </w:rPr>
-        <w:t xml:space="preserve">Los 305 con abandono cero</w:t>
-      </w:r>
-      <w:r>
-        <w:t xml:space="preserve"> registran todos titulaciones y la mitad seguía matriculando: titulan al menos tantas personas como ingresaron, por convalidaciones o traslados. Ambos extremos son el 4,8 % de los casos y el 3,3 % de la matrícula, y excluirlos desplazaría la media nueve milésimas: no comprometen ninguna conclusión, pero son el residuo visible de que la variable es aparente.</w:t>
+        <w:t xml:space="preserve">Los 305 con abandono cero responden a otra causa</w:t>
+      </w:r>
+      <w:r>
+        <w:t xml:space="preserve">: todos registran titulaciones y la mitad seguía matriculando, de modo que titulan al menos tantas personas como ingresaron en la ventana, por convalidaciones, traslados o cohortes que no calzan con el desfase teórico.</w:t>
+      </w:r>
+    </w:p>
+    <w:p>
+      <w:pPr>
+        <w:spacing w:after="120" w:line="264"/>
+        <w:jc w:val="both"/>
+      </w:pPr>
+      <w:r>
+        <w:t xml:space="preserve">En conjunto, ambos extremos son el 4,8 % de los casos y el 3,3 % de la matrícula. Excluirlos desplazaría la media del sistema de 0,518 a 0,527, es decir nueve milésimas: no comprometen ninguna conclusión, pero son el residuo visible de que la variable es aparente y no una medición directa.</w:t>
       </w:r>
     </w:p>
     <w:p>
@@ -2729,7 +3083,7 @@
     </w:p>
     <w:p>
       <w:pPr>
-        <w:spacing w:after="110" w:line="256"/>
+        <w:spacing w:after="120" w:line="264"/>
         <w:jc w:val="both"/>
       </w:pPr>
       <w:r>
@@ -2774,7 +3128,7 @@
     </w:p>
     <w:p>
       <w:pPr>
-        <w:spacing w:after="110" w:line="256"/>
+        <w:spacing w:after="120" w:line="264"/>
         <w:jc w:val="both"/>
       </w:pPr>
       <w:r>
@@ -3931,7 +4285,7 @@
     </w:p>
     <w:p>
       <w:pPr>
-        <w:spacing w:after="110" w:line="256"/>
+        <w:spacing w:after="120" w:line="264"/>
         <w:jc w:val="both"/>
       </w:pPr>
       <w:r>
@@ -3946,7 +4300,7 @@
       <w:r>
         <w:drawing>
           <wp:inline distT="0" distB="0" distL="0" distR="0">
-            <wp:extent cx="3888486" cy="1524379"/>
+            <wp:extent cx="4752594" cy="1863130"/>
             <wp:effectExtent t="0" r="0" b="0" l="0"/>
             <wp:docPr id="3" name="" descr="" title=""/>
             <wp:cNvGraphicFramePr>
@@ -3971,7 +4325,7 @@
                   <pic:spPr bwMode="auto">
                     <a:xfrm>
                       <a:off x="0" y="0"/>
-                      <a:ext cx="3888486" cy="1524379"/>
+                      <a:ext cx="4752594" cy="1863130"/>
                     </a:xfrm>
                     <a:prstGeom prst="rect">
                       <a:avLst/>
@@ -4018,7 +4372,7 @@
     </w:p>
     <w:p>
       <w:pPr>
-        <w:spacing w:after="110" w:line="256"/>
+        <w:spacing w:after="120" w:line="264"/>
         <w:jc w:val="both"/>
       </w:pPr>
       <w:r>
@@ -5385,7 +5739,7 @@
       <w:r>
         <w:drawing>
           <wp:inline distT="0" distB="0" distL="0" distR="0">
-            <wp:extent cx="3888486" cy="2008636"/>
+            <wp:extent cx="4752594" cy="2454999"/>
             <wp:effectExtent t="0" r="0" b="0" l="0"/>
             <wp:docPr id="4" name="" descr="" title=""/>
             <wp:cNvGraphicFramePr>
@@ -5410,7 +5764,7 @@
                   <pic:spPr bwMode="auto">
                     <a:xfrm>
                       <a:off x="0" y="0"/>
-                      <a:ext cx="3888486" cy="2008636"/>
+                      <a:ext cx="4752594" cy="2454999"/>
                     </a:xfrm>
                     <a:prstGeom prst="rect">
                       <a:avLst/>
@@ -5441,7 +5795,7 @@
     </w:p>
     <w:p>
       <w:pPr>
-        <w:spacing w:after="110" w:line="256"/>
+        <w:spacing w:after="120" w:line="264"/>
         <w:jc w:val="both"/>
       </w:pPr>
       <w:r>
@@ -5460,38 +5814,13 @@
     </w:p>
     <w:p>
       <w:pPr>
-        <w:pStyle w:val="Heading2"/>
-        <w:spacing w:after="90" w:before="180"/>
-      </w:pPr>
-      <w:r>
-        <w:rPr>
-          <w:b/>
-          <w:bCs/>
-          <w:color w:val="2E5496"/>
-          <w:sz w:val="22"/>
-          <w:szCs w:val="22"/>
-        </w:rPr>
-        <w:t xml:space="preserve">3.4 Análisis bivariado</w:t>
-      </w:r>
-    </w:p>
-    <w:p>
-      <w:pPr>
-        <w:spacing w:after="110" w:line="256"/>
-        <w:jc w:val="both"/>
-      </w:pPr>
-      <w:r>
-        <w:t xml:space="preserve">Hasta aquí cada variable se ha descrito por separado. El paso siguiente examina cómo se relacionan entre sí, que es lo que permite anticipar qué factores merecen un contraste formal y cuáles podrían estar midiendo lo mismo.</w:t>
-      </w:r>
-    </w:p>
-    <w:p>
-      <w:pPr>
         <w:spacing w:after="50" w:before="140"/>
         <w:jc w:val="center"/>
       </w:pPr>
       <w:r>
         <w:drawing>
           <wp:inline distT="0" distB="0" distL="0" distR="0">
-            <wp:extent cx="3096387" cy="2788311"/>
+            <wp:extent cx="4752594" cy="2675063"/>
             <wp:effectExtent t="0" r="0" b="0" l="0"/>
             <wp:docPr id="5" name="" descr="" title=""/>
             <wp:cNvGraphicFramePr>
@@ -5516,7 +5845,7 @@
                   <pic:spPr bwMode="auto">
                     <a:xfrm>
                       <a:off x="0" y="0"/>
-                      <a:ext cx="3096387" cy="2788311"/>
+                      <a:ext cx="4752594" cy="2675063"/>
                     </a:xfrm>
                     <a:prstGeom prst="rect">
                       <a:avLst/>
@@ -5542,28 +5871,108 @@
           <w:sz w:val="16"/>
           <w:szCs w:val="16"/>
         </w:rPr>
-        <w:t xml:space="preserve">Figura 4. Matriz de correlaciones de Pearson entre las variables numéricas.</w:t>
-      </w:r>
-    </w:p>
-    <w:p>
-      <w:pPr>
-        <w:spacing w:after="110" w:line="256"/>
+        <w:t xml:space="preserve">Figura 4. Abandono aparente medio por área del conocimiento.</w:t>
+      </w:r>
+    </w:p>
+    <w:p>
+      <w:pPr>
+        <w:spacing w:after="120" w:line="264"/>
         <w:jc w:val="both"/>
+      </w:pPr>
+      <w:r>
+        <w:t xml:space="preserve">El gradiente por área del conocimiento es más marcado que el institucional, con 17,5 puntos entre Humanidades y Salud, pero descansa sobre grupos de tamaño muy desigual —de 78 programas a 3.009—, lo que obliga a acompañar cada media de su incertidumbre antes de usarla para decidir.</w:t>
+      </w:r>
+    </w:p>
+    <w:p>
+      <w:pPr>
+        <w:pStyle w:val="Heading2"/>
+        <w:spacing w:after="90" w:before="180"/>
       </w:pPr>
       <w:r>
         <w:rPr>
           <w:b/>
           <w:bCs/>
-        </w:rPr>
-        <w:t xml:space="preserve">Ninguna variable aislada explica el abandono.</w:t>
-      </w:r>
-      <w:r>
-        <w:t xml:space="preserve"> La correlación más fuerte es la de la acreditación de carrera, con r = −0,311, que equivale a un 9,7 % de varianza compartida; las demás no superan 0,26 en valor absoluto. El fenómeno es multifactorial, lo que anticipa que ningún criterio único de focalización será suficiente. En particular, el tamaño del programa se asocia negativamente con el abandono (r = −0,247) pero explica apenas un 6 % de la variación.</w:t>
-      </w:r>
-    </w:p>
-    <w:p>
-      <w:pPr>
-        <w:spacing w:after="110" w:line="256"/>
+          <w:color w:val="2E5496"/>
+          <w:sz w:val="22"/>
+          <w:szCs w:val="22"/>
+        </w:rPr>
+        <w:t xml:space="preserve">3.4 Análisis bivariado</w:t>
+      </w:r>
+    </w:p>
+    <w:p>
+      <w:pPr>
+        <w:spacing w:after="120" w:line="264"/>
+        <w:jc w:val="both"/>
+      </w:pPr>
+      <w:r>
+        <w:t xml:space="preserve">Hasta aquí cada variable se ha descrito por separado. El paso siguiente examina cómo se relacionan entre sí, que es lo que permite anticipar qué factores merecen un contraste formal y cuáles podrían estar midiendo lo mismo.</w:t>
+      </w:r>
+    </w:p>
+    <w:p>
+      <w:pPr>
+        <w:spacing w:after="50" w:before="140"/>
+        <w:jc w:val="center"/>
+      </w:pPr>
+      <w:r>
+        <w:drawing>
+          <wp:inline distT="0" distB="0" distL="0" distR="0">
+            <wp:extent cx="4176522" cy="3760978"/>
+            <wp:effectExtent t="0" r="0" b="0" l="0"/>
+            <wp:docPr id="6" name="" descr="" title=""/>
+            <wp:cNvGraphicFramePr>
+              <a:graphicFrameLocks xmlns:a="http://schemas.openxmlformats.org/drawingml/2006/main" noChangeAspect="1"/>
+            </wp:cNvGraphicFramePr>
+            <a:graphic xmlns:a="http://schemas.openxmlformats.org/drawingml/2006/main">
+              <a:graphicData uri="http://schemas.openxmlformats.org/drawingml/2006/picture">
+                <pic:pic xmlns:pic="http://schemas.openxmlformats.org/drawingml/2006/picture">
+                  <pic:nvPicPr>
+                    <pic:cNvPr id="0" name="" descr=""/>
+                    <pic:cNvPicPr>
+                      <a:picLocks noChangeAspect="1" noChangeArrowheads="1"/>
+                    </pic:cNvPicPr>
+                  </pic:nvPicPr>
+                  <pic:blipFill>
+                    <a:blip r:embed="rId13" cstate="none"/>
+                    <a:srcRect/>
+                    <a:stretch>
+                      <a:fillRect/>
+                    </a:stretch>
+                  </pic:blipFill>
+                  <pic:spPr bwMode="auto">
+                    <a:xfrm>
+                      <a:off x="0" y="0"/>
+                      <a:ext cx="4176522" cy="3760978"/>
+                    </a:xfrm>
+                    <a:prstGeom prst="rect">
+                      <a:avLst/>
+                    </a:prstGeom>
+                  </pic:spPr>
+                </pic:pic>
+              </a:graphicData>
+            </a:graphic>
+          </wp:inline>
+        </w:drawing>
+      </w:r>
+    </w:p>
+    <w:p>
+      <w:pPr>
+        <w:spacing w:after="160"/>
+        <w:jc w:val="center"/>
+      </w:pPr>
+      <w:r>
+        <w:rPr>
+          <w:i/>
+          <w:iCs/>
+          <w:color w:val="555555"/>
+          <w:sz w:val="16"/>
+          <w:szCs w:val="16"/>
+        </w:rPr>
+        <w:t xml:space="preserve">Figura 5. Matriz de correlaciones de Pearson entre las variables numéricas.</w:t>
+      </w:r>
+    </w:p>
+    <w:p>
+      <w:pPr>
+        <w:spacing w:after="120" w:line="264"/>
         <w:jc w:val="both"/>
       </w:pPr>
       <w:r>
@@ -5571,15 +5980,15 @@
           <w:b/>
           <w:bCs/>
         </w:rPr>
-        <w:t xml:space="preserve">El signo de cada relación es el esperado</w:t>
-      </w:r>
-      <w:r>
-        <w:t xml:space="preserve">: acreditación, tamaño, proporción de mujeres y duración formal se asocian negativamente con el abandono, mientras que la edad media de la matrícula y el origen técnico-profesional lo hacen positivamente. Ninguna correlación contradice lo previsible, lo que da verosimilitud al conjunto.</w:t>
-      </w:r>
-    </w:p>
-    <w:p>
-      <w:pPr>
-        <w:spacing w:after="110" w:line="256"/>
+        <w:t xml:space="preserve">Ninguna variable aislada explica el abandono.</w:t>
+      </w:r>
+      <w:r>
+        <w:t xml:space="preserve"> La correlación más fuerte es la de la acreditación de carrera, con r = −0,311, que equivale a un 9,7 % de varianza compartida; las demás no superan 0,26 en valor absoluto. El fenómeno es multifactorial, lo que anticipa que ningún criterio único de focalización será suficiente. En particular, el tamaño del programa se asocia negativamente con el abandono (r = −0,247) pero explica apenas un 6 % de la variación.</w:t>
+      </w:r>
+    </w:p>
+    <w:p>
+      <w:pPr>
+        <w:spacing w:after="120" w:line="264"/>
         <w:jc w:val="both"/>
       </w:pPr>
       <w:r>
@@ -5587,10 +5996,42 @@
           <w:b/>
           <w:bCs/>
         </w:rPr>
+        <w:t xml:space="preserve">El signo de cada relación es el esperado</w:t>
+      </w:r>
+      <w:r>
+        <w:t xml:space="preserve">: acreditación, tamaño, proporción de mujeres y duración formal se asocian negativamente con el abandono, mientras que la edad media de la matrícula y el origen técnico-profesional lo hacen positivamente. Ninguna correlación contradice lo previsible, lo que da verosimilitud al conjunto.</w:t>
+      </w:r>
+    </w:p>
+    <w:p>
+      <w:pPr>
+        <w:spacing w:after="120" w:line="264"/>
+        <w:jc w:val="both"/>
+      </w:pPr>
+      <w:r>
+        <w:rPr>
+          <w:b/>
+          <w:bCs/>
+        </w:rPr>
         <w:t xml:space="preserve">Hay colinealidad entre las predictoras.</w:t>
       </w:r>
       <w:r>
         <w:t xml:space="preserve"> El par más correlacionado es la proporción de egresados de colegios particulares pagados con la de establecimientos técnico-profesionales (r = −0,583), seguida de esta última con la duración formal (r = −0,535). Esa estructura importa para la fase siguiente, porque un modelo multivariado no podrá separar limpiamente esos efectos.</w:t>
+      </w:r>
+    </w:p>
+    <w:p>
+      <w:pPr>
+        <w:spacing w:after="140" w:before="60" w:line="240"/>
+        <w:jc w:val="both"/>
+      </w:pPr>
+      <w:r>
+        <w:rPr>
+          <w:i/>
+          <w:iCs/>
+          <w:color w:val="444444"/>
+          <w:sz w:val="17"/>
+          <w:szCs w:val="17"/>
+        </w:rPr>
+        <w:t xml:space="preserve">Conviene advertir que todas las correlaciones resultan significativas al 5 %, incluso la de 0,050. Es el mismo fenómeno que domina el apartado 5: con 9.678 observaciones la significación estadística deja de informar sobre la relevancia.</w:t>
       </w:r>
     </w:p>
     <w:p>
@@ -5627,7 +6068,7 @@
     </w:p>
     <w:p>
       <w:pPr>
-        <w:spacing w:after="110" w:line="256"/>
+        <w:spacing w:after="120" w:line="264"/>
         <w:jc w:val="both"/>
       </w:pPr>
       <w:r>
@@ -5641,7 +6082,16 @@
         <w:t xml:space="preserve">¿de qué población se habla?</w:t>
       </w:r>
       <w:r>
-        <w:t xml:space="preserve"> Los 9.678 programas no son una muestra sino todos los que cumplen los criterios de inclusión en el período, y sobre un censo un intervalo de confianza en sentido estricto carecería de sentido, porque el parámetro ya está medido sin error muestral. La inferencia se formula, por tanto, sobre el </w:t>
+        <w:t xml:space="preserve"> Los 9.678 programas no son una muestra extraída al azar de un universo mayor: son todos los programas chilenos que cumplen los criterios de inclusión en el período. Sobre un censo, un intervalo de confianza en sentido estricto carecería de sentido, porque el parámetro ya está medido sin error muestral.</w:t>
+      </w:r>
+    </w:p>
+    <w:p>
+      <w:pPr>
+        <w:spacing w:after="120" w:line="264"/>
+        <w:jc w:val="both"/>
+      </w:pPr>
+      <w:r>
+        <w:t xml:space="preserve">La inferencia que sigue se formula, por tanto, sobre el </w:t>
       </w:r>
       <w:r>
         <w:rPr>
@@ -5651,7 +6101,7 @@
         <w:t xml:space="preserve">proceso generador</w:t>
       </w:r>
       <w:r>
-        <w:t xml:space="preserve">: los programas observados como una realización de un sistema que sigue operando y pudo haber producido resultados algo distintos. La distinción cambia lo que puede afirmarse: autoriza a decir que el abandono esperado está entre 0,514 y 0,523, y prohíbe decir que hay un 95 % de probabilidad de que el valor real caiga ahí, lectura que el intervalo frecuentista no admite.</w:t>
+        <w:t xml:space="preserve">: los programas observados se tratan como una realización de un sistema educativo que sigue operando y que pudo haber producido resultados algo distintos. El parámetro estimado es el abandono esperado de ese proceso, y el intervalo mide la incertidumbre que introduce la variabilidad del sistema, no el muestreo. La distinción cambia lo que puede afirmarse: autoriza a decir que el abandono esperado está entre 0,514 y 0,523, y prohíbe decir que hay un 95 % de probabilidad de que el valor real caiga ahí, que es una lectura que el intervalo frecuentista no admite.</w:t>
       </w:r>
     </w:p>
     <w:p>
@@ -5672,7 +6122,7 @@
     </w:p>
     <w:p>
       <w:pPr>
-        <w:spacing w:after="110" w:line="256"/>
+        <w:spacing w:after="120" w:line="264"/>
         <w:jc w:val="both"/>
       </w:pPr>
       <w:r>
@@ -6365,7 +6815,7 @@
     </w:p>
     <w:p>
       <w:pPr>
-        <w:spacing w:after="110" w:line="256"/>
+        <w:spacing w:after="120" w:line="264"/>
         <w:jc w:val="both"/>
       </w:pPr>
       <w:r>
@@ -6391,7 +6841,7 @@
     </w:p>
     <w:p>
       <w:pPr>
-        <w:spacing w:after="110" w:line="256"/>
+        <w:spacing w:after="120" w:line="264"/>
         <w:jc w:val="both"/>
       </w:pPr>
       <w:r>
@@ -6402,12 +6852,12 @@
         <w:t xml:space="preserve">El abandono.</w:t>
       </w:r>
       <w:r>
-        <w:t xml:space="preserve"> Su intervalo mide nueve milésimas de ancho. Esa precisión no proviene de que el fenómeno sea homogéneo —la desviación de 0,224 dice lo contrario— sino del tamaño del conjunto, que divide la desviación por 98,4. Un remuestreo bootstrap de 5.000 réplicas arroja [0,5139 ; 0,5226], coincidente hasta la cuarta cifra, lo que confirma que el supuesto de normalidad de la media es sostenible.</w:t>
-      </w:r>
-    </w:p>
-    <w:p>
-      <w:pPr>
-        <w:spacing w:after="110" w:line="256"/>
+        <w:t xml:space="preserve"> El intervalo mide nueve milésimas de ancho. Esa precisión no proviene de que el fenómeno sea homogéneo —la desviación estándar de 0,224 dice lo contrario— sino del tamaño del conjunto: el error estándar divide la desviación por la raíz de 9.678, es decir por 98,4. Conviene no confundir precisión con homogeneidad: el intervalo describe cuán bien conocemos el promedio, no cuán parecidos son los programas entre sí. Un remuestreo bootstrap de 5.000 réplicas arroja [0,5139 ; 0,5226], coincidente hasta la cuarta cifra, lo que confirma que el supuesto de normalidad de la media es sostenible.</w:t>
+      </w:r>
+    </w:p>
+    <w:p>
+      <w:pPr>
+        <w:spacing w:after="120" w:line="264"/>
         <w:jc w:val="both"/>
       </w:pPr>
       <w:r>
@@ -6415,30 +6865,36 @@
           <w:b/>
           <w:bCs/>
         </w:rPr>
-        <w:t xml:space="preserve">La proporción y la diferencia.</w:t>
-      </w:r>
-      <w:r>
-        <w:t xml:space="preserve"> Para la proporción se emplea el método de Wilson (1927) y no la aproximación normal, porque no produce límites fuera de [0, 1] y conserva su cobertura cerca de los extremos; con </w:t>
+        <w:t xml:space="preserve">La proporción.</w:t>
+      </w:r>
+      <w:r>
+        <w:t xml:space="preserve"> Se emplea el método de Wilson (1927) en lugar de la aproximación normal porque no produce límites fuera del intervalo [0, 1] y conserva su cobertura cerca de los extremos. Con una proporción próxima a 0,5 y un </w:t>
       </w:r>
       <w:r>
         <w:rPr>
           <w:i/>
           <w:iCs/>
         </w:rPr>
-        <w:t xml:space="preserve">p</w:t>
-      </w:r>
-      <w:r>
-        <w:t xml:space="preserve"> próxima a 0,5 y </w:t>
-      </w:r>
-      <w:r>
-        <w:rPr>
-          <w:i/>
-          <w:iCs/>
-        </w:rPr>
         <w:t xml:space="preserve">n</w:t>
       </w:r>
       <w:r>
-        <w:t xml:space="preserve"> grande ambos coinciden, pero la elección deja de ser indiferente en otros escenarios. El intervalo de la diferencia no contiene el cero y su límite inferior ya alcanza los 15,9 puntos porcentuales, de modo que la conclusión no depende del extremo que se tome.</w:t>
+        <w:t xml:space="preserve"> grande ambos coinciden, pero la elección deja de ser indiferente en otros escenarios.</w:t>
+      </w:r>
+    </w:p>
+    <w:p>
+      <w:pPr>
+        <w:spacing w:after="120" w:line="264"/>
+        <w:jc w:val="both"/>
+      </w:pPr>
+      <w:r>
+        <w:rPr>
+          <w:b/>
+          <w:bCs/>
+        </w:rPr>
+        <w:t xml:space="preserve">La diferencia.</w:t>
+      </w:r>
+      <w:r>
+        <w:t xml:space="preserve"> El intervalo no contiene el cero y su límite inferior ya alcanza los 15,9 puntos porcentuales, de modo que la conclusión no depende del extremo del intervalo que se tome.</w:t>
       </w:r>
     </w:p>
     <w:p>
@@ -6459,7 +6915,7 @@
     </w:p>
     <w:p>
       <w:pPr>
-        <w:spacing w:after="110" w:line="256"/>
+        <w:spacing w:after="120" w:line="264"/>
         <w:jc w:val="both"/>
       </w:pPr>
       <w:r>
@@ -6478,11 +6934,21 @@
     </w:p>
     <w:p>
       <w:pPr>
-        <w:spacing w:after="110" w:line="256"/>
+        <w:spacing w:after="120" w:line="264"/>
         <w:jc w:val="both"/>
       </w:pPr>
       <w:r>
-        <w:t xml:space="preserve">Sobre los supuestos: Kolmogorov-Smirnov rechaza la normalidad exacta (D = 0,021; p &lt; 0,001), pero a este tamaño detecta desviaciones irrelevantes y lo que los procedimientos requieren es la normalidad de la media, que el teorema central del límite garantiza y la asimetría casi nula refuerza. Levene no rechaza la igualdad de varianzas (W = 0,869; p = 0,351); aun así se emplea la versión de Welch (1947), que no la supone, por conservadora.</w:t>
+        <w:t xml:space="preserve">Respecto de los supuestos: la prueba de Kolmogorov-Smirnov rechaza la normalidad exacta (D = 0,021; p &lt; 0,001), pero con </w:t>
+      </w:r>
+      <w:r>
+        <w:rPr>
+          <w:i/>
+          <w:iCs/>
+        </w:rPr>
+        <w:t xml:space="preserve">n</w:t>
+      </w:r>
+      <w:r>
+        <w:t xml:space="preserve"> = 9.678 detecta desviaciones irrelevantes. Lo que los procedimientos requieren no es que la variable sea normal, sino que lo sea la distribución de la media, que el teorema central del límite garantiza a este tamaño y que la asimetría casi nula refuerza. La prueba de Levene no rechaza la igualdad de varianzas (W = 0,869; p = 0,351); aun así se emplea la versión de Welch (1947), que no la supone, por ser la opción conservadora.</w:t>
       </w:r>
     </w:p>
     <w:tbl>
@@ -7055,7 +7521,7 @@
     </w:p>
     <w:p>
       <w:pPr>
-        <w:spacing w:after="110" w:line="256"/>
+        <w:spacing w:after="120" w:line="264"/>
         <w:jc w:val="both"/>
       </w:pPr>
       <w:r>
@@ -7071,7 +7537,7 @@
     </w:p>
     <w:p>
       <w:pPr>
-        <w:spacing w:after="110" w:line="256"/>
+        <w:spacing w:after="120" w:line="264"/>
         <w:jc w:val="both"/>
       </w:pPr>
       <w:r>
@@ -7100,7 +7566,7 @@
     </w:p>
     <w:p>
       <w:pPr>
-        <w:spacing w:after="110" w:line="256"/>
+        <w:spacing w:after="120" w:line="264"/>
         <w:jc w:val="both"/>
       </w:pPr>
       <w:r>
@@ -7119,10 +7585,17 @@
     </w:p>
     <w:p>
       <w:pPr>
-        <w:spacing w:after="110" w:line="256"/>
+        <w:spacing w:after="140" w:before="60" w:line="240"/>
         <w:jc w:val="both"/>
       </w:pPr>
       <w:r>
+        <w:rPr>
+          <w:i/>
+          <w:iCs/>
+          <w:color w:val="444444"/>
+          <w:sz w:val="17"/>
+          <w:szCs w:val="17"/>
+        </w:rPr>
         <w:t xml:space="preserve">Las comparaciones múltiples de Tukey (1949), que controlan el error por familia, confirman diferencias significativas en 30 de los 45 pares de áreas; la mayor separa Humanidades de Salud, con 17,4 puntos porcentuales.</w:t>
       </w:r>
     </w:p>
@@ -7144,7 +7617,7 @@
     </w:p>
     <w:p>
       <w:pPr>
-        <w:spacing w:after="110" w:line="256"/>
+        <w:spacing w:after="120" w:line="264"/>
         <w:jc w:val="both"/>
       </w:pPr>
       <w:r>
@@ -7153,7 +7626,7 @@
     </w:p>
     <w:p>
       <w:pPr>
-        <w:spacing w:after="110" w:line="256"/>
+        <w:spacing w:after="120" w:line="264"/>
         <w:jc w:val="both"/>
       </w:pPr>
       <w:r>
@@ -7161,15 +7634,15 @@
           <w:b/>
           <w:bCs/>
         </w:rPr>
-        <w:t xml:space="preserve">La magnitud justifica actuar y la heterogeneidad justifica focalizar.</w:t>
-      </w:r>
-      <w:r>
-        <w:t xml:space="preserve"> El abandono esperado se estima en 0,518, con intervalo de 0,514 a 0,523, y el 54,9 % de los programas supera el 50 %: no son casos aislados. Pero con un coeficiente de variación de 0,43 y una mitad central que abarca casi treinta puntos porcentuales, los programas difieren demasiado como para tratarlos igual.</w:t>
-      </w:r>
-    </w:p>
-    <w:p>
-      <w:pPr>
-        <w:spacing w:after="110" w:line="256"/>
+        <w:t xml:space="preserve">La magnitud justifica actuar.</w:t>
+      </w:r>
+      <w:r>
+        <w:t xml:space="preserve"> El abandono esperado del sistema se estima en 0,518, con un intervalo de 0,514 a 0,523, y el 54,9 % de los programas supera el 50 %. No se trata de casos aislados.</w:t>
+      </w:r>
+    </w:p>
+    <w:p>
+      <w:pPr>
+        <w:spacing w:after="120" w:line="264"/>
         <w:jc w:val="both"/>
       </w:pPr>
       <w:r>
@@ -7177,15 +7650,15 @@
           <w:b/>
           <w:bCs/>
         </w:rPr>
-        <w:t xml:space="preserve">El criterio de focalización importa, y no todos valen.</w:t>
-      </w:r>
-      <w:r>
-        <w:t xml:space="preserve"> La acreditación institucional separa grupos con una diferencia de 17,6 puntos y un efecto grande: es un criterio útil. El área del conocimiento y el tipo de institución producen contrastes igual de significativos pero con efectos pequeños, porque la mayor parte de la variación ocurre dentro de cada categoría y no entre ellas; usarlos como criterio principal repartiría recursos con poca ganancia.</w:t>
-      </w:r>
-    </w:p>
-    <w:p>
-      <w:pPr>
-        <w:spacing w:after="110" w:line="256"/>
+        <w:t xml:space="preserve">La heterogeneidad justifica focalizar.</w:t>
+      </w:r>
+      <w:r>
+        <w:t xml:space="preserve"> Con un coeficiente de variación de 0,43 y una mitad central que abarca casi treinta puntos porcentuales, los programas difieren demasiado como para tratarlos igual.</w:t>
+      </w:r>
+    </w:p>
+    <w:p>
+      <w:pPr>
+        <w:spacing w:after="120" w:line="264"/>
         <w:jc w:val="both"/>
       </w:pPr>
       <w:r>
@@ -7193,6 +7666,22 @@
           <w:b/>
           <w:bCs/>
         </w:rPr>
+        <w:t xml:space="preserve">El criterio de focalización importa, y no todos valen.</w:t>
+      </w:r>
+      <w:r>
+        <w:t xml:space="preserve"> La acreditación institucional separa grupos con una diferencia de 17,6 puntos y un efecto grande: es un criterio útil. El área del conocimiento y el tipo de institución producen contrastes igual de significativos pero con efectos pequeños, porque la mayor parte de la variación ocurre dentro de cada categoría y no entre ellas; usarlos como criterio principal repartiría recursos con poca ganancia.</w:t>
+      </w:r>
+    </w:p>
+    <w:p>
+      <w:pPr>
+        <w:spacing w:after="120" w:line="264"/>
+        <w:jc w:val="both"/>
+      </w:pPr>
+      <w:r>
+        <w:rPr>
+          <w:b/>
+          <w:bCs/>
+        </w:rPr>
         <w:t xml:space="preserve">La incertidumbre acompaña, pero no impide decidir.</w:t>
       </w:r>
       <w:r>
@@ -7201,7 +7690,7 @@
     </w:p>
     <w:p>
       <w:pPr>
-        <w:spacing w:after="110" w:line="256"/>
+        <w:spacing w:after="120" w:line="264"/>
         <w:jc w:val="both"/>
       </w:pPr>
       <w:r>
@@ -7236,7 +7725,7 @@
     </w:p>
     <w:p>
       <w:pPr>
-        <w:spacing w:after="110" w:line="256"/>
+        <w:spacing w:after="120" w:line="264"/>
         <w:jc w:val="both"/>
       </w:pPr>
       <w:r>
@@ -7247,7 +7736,7 @@
         <w:t xml:space="preserve">El abandono es aparente, no observado</w:t>
       </w:r>
       <w:r>
-        <w:t xml:space="preserve">, de modo que la magnitud estimada es una cota superior; el diagnóstico del apartado 3 acota ese efecto en los extremos pero no en el resto de la escala, donde no es observable. </w:t>
+        <w:t xml:space="preserve">: quien se cambia de carrera y se titula en otra parte cuenta como abandono, de modo que la magnitud estimada es una cota superior. El diagnóstico del apartado 3 acota ese efecto en los casos extremos —desplazan la media nueve milésimas— pero no lo elimina en el resto de la escala, donde no es observable. </w:t>
       </w:r>
       <w:r>
         <w:rPr>
@@ -7257,7 +7746,7 @@
         <w:t xml:space="preserve">La unidad de análisis es el programa</w:t>
       </w:r>
       <w:r>
-        <w:t xml:space="preserve">, por lo que trasladar las conclusiones a individuos sería una falacia ecológica. </w:t>
+        <w:t xml:space="preserve">, por lo que las conclusiones no pueden trasladarse a individuos sin incurrir en falacia ecológica. </w:t>
       </w:r>
       <w:r>
         <w:rPr>
@@ -7267,7 +7756,7 @@
         <w:t xml:space="preserve">Las asociaciones no son causas</w:t>
       </w:r>
       <w:r>
-        <w:t xml:space="preserve">: sin grupo de control ni asignación aleatoria, la acreditación podría estar recogiendo el efecto de la selectividad del ingreso o de los recursos de la institución. </w:t>
+        <w:t xml:space="preserve">: no hay grupo de control ni asignación aleatoria, y la acreditación podría estar recogiendo el efecto de la selectividad del ingreso o de los recursos de la institución. </w:t>
       </w:r>
       <w:r>
         <w:rPr>
@@ -7277,7 +7766,7 @@
         <w:t xml:space="preserve">La ventana temporal trunca las cohortes recientes</w:t>
       </w:r>
       <w:r>
-        <w:t xml:space="preserve">, cuyo abandono queda inflado. Y </w:t>
+        <w:t xml:space="preserve">, cuyo abandono aparente queda inflado. Y </w:t>
       </w:r>
       <w:r>
         <w:rPr>
@@ -7287,7 +7776,7 @@
         <w:t xml:space="preserve">los contrastes son univariados</w:t>
       </w:r>
       <w:r>
-        <w:t xml:space="preserve">, de modo que los efectos podrían estar confundidos entre sí.</w:t>
+        <w:t xml:space="preserve">, de modo que los efectos podrían estar confundidos entre sí; un modelo multivariado, previsto para la fase siguiente, permitiría estimar cada efecto manteniendo los demás constantes.</w:t>
       </w:r>
     </w:p>
     <w:p>
@@ -7308,7 +7797,7 @@
     </w:p>
     <w:p>
       <w:pPr>
-        <w:spacing w:after="110" w:line="256"/>
+        <w:spacing w:after="120" w:line="264"/>
         <w:jc w:val="both"/>
       </w:pPr>
       <w:r>
@@ -7317,7 +7806,7 @@
     </w:p>
     <w:p>
       <w:pPr>
-        <w:spacing w:after="110" w:line="256"/>
+        <w:spacing w:after="120" w:line="264"/>
         <w:jc w:val="both"/>
       </w:pPr>
       <w:r>
@@ -7328,12 +7817,12 @@
         <w:t xml:space="preserve">1. Modelo multivariado.</w:t>
       </w:r>
       <w:r>
-        <w:t xml:space="preserve"> Una regresión sobre el conjunto de predictoras estimaría el efecto de cada una manteniendo las demás constantes. Es necesario porque el apartado 3.4 mostró colinealidad: los programas que reciben egresados de enseñanza técnico-profesional son también los más cortos, y hoy no puede separarse qué parte del abandono corresponde a cada rasgo.</w:t>
-      </w:r>
-    </w:p>
-    <w:p>
-      <w:pPr>
-        <w:spacing w:after="110" w:line="256"/>
+        <w:t xml:space="preserve"> Una regresión del abandono sobre el conjunto de predictoras permitiría estimar el efecto de cada una manteniendo las demás constantes. Es necesario porque el apartado 3.4 mostró colinealidad: los programas que reciben egresados de enseñanza técnico-profesional son también los más cortos, de modo que hoy no puede separarse qué parte del abandono corresponde a cada rasgo.</w:t>
+      </w:r>
+    </w:p>
+    <w:p>
+      <w:pPr>
+        <w:spacing w:after="120" w:line="264"/>
         <w:jc w:val="both"/>
       </w:pPr>
       <w:r>
@@ -7344,12 +7833,12 @@
         <w:t xml:space="preserve">2. Agrupación por institución.</w:t>
       </w:r>
       <w:r>
-        <w:t xml:space="preserve"> Los programas de una misma institución comparten políticas y selectividad, de modo que no son observaciones independientes; los errores estándar de este informe no lo recogen y un modelo con errores agrupados corregiría esa subestimación.</w:t>
-      </w:r>
-    </w:p>
-    <w:p>
-      <w:pPr>
-        <w:spacing w:after="110" w:line="256"/>
+        <w:t xml:space="preserve"> Los programas de una misma institución comparten políticas, infraestructura y selectividad, de modo que sus observaciones no son independientes. Los errores estándar de este informe no lo recogen; un modelo con errores agrupados o una especificación jerárquica corregiría esa subestimación.</w:t>
+      </w:r>
+    </w:p>
+    <w:p>
+      <w:pPr>
+        <w:spacing w:after="120" w:line="264"/>
         <w:jc w:val="both"/>
       </w:pPr>
       <w:r>
@@ -7360,12 +7849,12 @@
         <w:t xml:space="preserve">3. Ponderación por tamaño.</w:t>
       </w:r>
       <w:r>
-        <w:t xml:space="preserve"> Aquí cada programa pesa igual, sea de 100 o de 9.994 estudiantes. Ponderar por el ingreso respondería una pregunta complementaria: cuántos estudiantes, y no cuántos programas, están expuestos a un abandono alto.</w:t>
-      </w:r>
-    </w:p>
-    <w:p>
-      <w:pPr>
-        <w:spacing w:after="110" w:line="256"/>
+        <w:t xml:space="preserve"> Aquí cada programa pesa igual, sea de 100 o de 9.994 estudiantes. Una estimación ponderada por el ingreso respondería una pregunta complementaria: cuántos estudiantes, y no cuántos programas, están expuestos a un abandono alto.</w:t>
+      </w:r>
+    </w:p>
+    <w:p>
+      <w:pPr>
+        <w:spacing w:after="120" w:line="264"/>
         <w:jc w:val="both"/>
       </w:pPr>
       <w:r>
@@ -7373,15 +7862,15 @@
           <w:b/>
           <w:bCs/>
         </w:rPr>
-        <w:t xml:space="preserve">4. Corregir el truncamiento.</w:t>
-      </w:r>
-      <w:r>
-        <w:t xml:space="preserve"> Restringir la lectura longitudinal a las cohortes con ventana completa y contrastar contra las bases de retención del propio SIES permitiría acotar cuánto del abandono medido es cambio de carrera y cuánto salida del sistema.</w:t>
-      </w:r>
-    </w:p>
-    <w:p>
-      <w:pPr>
-        <w:spacing w:after="110" w:line="256"/>
+        <w:t xml:space="preserve">4. Corregir el sesgo de truncamiento.</w:t>
+      </w:r>
+      <w:r>
+        <w:t xml:space="preserve"> Restringir la lectura longitudinal a las cohortes con ventana de exposición completa, y contrastar el abandono aparente contra las bases de retención del propio SIES, permitiría acotar cuánto del abandono medido es cambio de carrera y cuánto es salida efectiva del sistema.</w:t>
+      </w:r>
+    </w:p>
+    <w:p>
+      <w:pPr>
+        <w:spacing w:after="120" w:line="264"/>
         <w:jc w:val="both"/>
       </w:pPr>
       <w:r>
@@ -7392,7 +7881,7 @@
         <w:t xml:space="preserve">5. Capacidad predictiva.</w:t>
       </w:r>
       <w:r>
-        <w:t xml:space="preserve"> Con el modelo ajustado podría evaluarse si el abandono es anticipable desde las características observables, que es la pregunta que convierte el diagnóstico en un instrumento de focalización.</w:t>
+        <w:t xml:space="preserve"> Con el modelo ajustado podría evaluarse si el abandono de un programa es anticipable a partir de sus características observables, que es la pregunta que convierte el diagnóstico en un instrumento de focalización.</w:t>
       </w:r>
     </w:p>
     <w:p>
@@ -7413,11 +7902,11 @@
     </w:p>
     <w:p>
       <w:pPr>
-        <w:spacing w:after="110" w:line="256"/>
+        <w:spacing w:after="120" w:line="264"/>
         <w:jc w:val="both"/>
       </w:pPr>
       <w:r>
-        <w:t xml:space="preserve">Todas las cifras, tablas y figuras se generan al ejecutar </w:t>
+        <w:t xml:space="preserve">Todas las cifras, tablas y figuras de este informe se generan al ejecutar el cuaderno </w:t>
       </w:r>
       <w:r>
         <w:rPr>
@@ -7439,7 +7928,7 @@
         <w:t xml:space="preserve">resultados/</w:t>
       </w:r>
       <w:r>
-        <w:t xml:space="preserve">, incluido el detalle que este informe resume. El conjunto analítico está versionado, de modo que reproducirlo no exige descargar las bases originales del SIES; las versiones de las bibliotecas están fijadas en </w:t>
+        <w:t xml:space="preserve">. El conjunto analítico está versionado en el repositorio, de modo que la reproducción no requiere descargar las bases originales del SIES. Las versiones de las bibliotecas están fijadas en </w:t>
       </w:r>
       <w:r>
         <w:rPr>
@@ -7450,7 +7939,16 @@
         <w:t xml:space="preserve">requirements.txt</w:t>
       </w:r>
       <w:r>
-        <w:t xml:space="preserve"> y la semilla en 42. Repositorio: https://github.com/santunez75/analisis-desercion</w:t>
+        <w:t xml:space="preserve"> y la semilla aleatoria en 42.</w:t>
+      </w:r>
+    </w:p>
+    <w:p>
+      <w:pPr>
+        <w:spacing w:after="120" w:line="264"/>
+        <w:jc w:val="both"/>
+      </w:pPr>
+      <w:r>
+        <w:t xml:space="preserve">Repositorio: https://github.com/santunez75/analisis-desercion</w:t>
       </w:r>
     </w:p>
     <w:p>
@@ -7516,17 +8014,17 @@
         <w:jc w:val="both"/>
       </w:pPr>
       <w:r>
-        <w:t xml:space="preserve">Servicio de Información de Educación Superior. (2026). </w:t>
+        <w:t xml:space="preserve">Harris, C. R., Millman, K. J., van der Walt, S. J., Gommers, R., Virtanen, P., Cournapeau, D. et al. (2020). Array programming with NumPy. </w:t>
       </w:r>
       <w:r>
         <w:rPr>
           <w:i/>
           <w:iCs/>
         </w:rPr>
-        <w:t xml:space="preserve">Bases de datos de matrícula en educación superior 2007–2026</w:t>
-      </w:r>
-      <w:r>
-        <w:t xml:space="preserve">. Ministerio de Educación de Chile. https://datosabiertos.mineduc.cl/</w:t>
+        <w:t xml:space="preserve">Nature</w:t>
+      </w:r>
+      <w:r>
+        <w:t xml:space="preserve">, 585, 357–362.</w:t>
       </w:r>
     </w:p>
     <w:p>
@@ -7536,17 +8034,17 @@
         <w:jc w:val="both"/>
       </w:pPr>
       <w:r>
-        <w:t xml:space="preserve">Servicio de Información de Educación Superior. (2026). </w:t>
+        <w:t xml:space="preserve">McKinney, W. (2010). Data structures for statistical computing in Python. En </w:t>
       </w:r>
       <w:r>
         <w:rPr>
           <w:i/>
           <w:iCs/>
         </w:rPr>
-        <w:t xml:space="preserve">Bases de datos de titulados de educación superior 2007–2025</w:t>
-      </w:r>
-      <w:r>
-        <w:t xml:space="preserve">. Ministerio de Educación de Chile. https://datosabiertos.mineduc.cl/</w:t>
+        <w:t xml:space="preserve">Proceedings of the 9th Python in Science Conference</w:t>
+      </w:r>
+      <w:r>
+        <w:t xml:space="preserve"> (pp. 56–61).</w:t>
       </w:r>
     </w:p>
     <w:p>
@@ -7556,17 +8054,97 @@
         <w:jc w:val="both"/>
       </w:pPr>
       <w:r>
-        <w:t xml:space="preserve">Tukey, J. W. (1949). Comparing individual means in the analysis of variance. </w:t>
+        <w:t xml:space="preserve">Seabold, S. y Perktold, J. (2010). statsmodels: econometric and statistical modeling with Python. En </w:t>
       </w:r>
       <w:r>
         <w:rPr>
           <w:i/>
           <w:iCs/>
         </w:rPr>
+        <w:t xml:space="preserve">Proceedings of the 9th Python in Science Conference</w:t>
+      </w:r>
+      <w:r>
+        <w:t xml:space="preserve"> (pp. 92–96).</w:t>
+      </w:r>
+    </w:p>
+    <w:p>
+      <w:pPr>
+        <w:spacing w:after="110" w:line="264"/>
+        <w:ind w:left="420" w:hanging="420"/>
+        <w:jc w:val="both"/>
+      </w:pPr>
+      <w:r>
+        <w:t xml:space="preserve">Servicio de Información de Educación Superior. (2026). </w:t>
+      </w:r>
+      <w:r>
+        <w:rPr>
+          <w:i/>
+          <w:iCs/>
+        </w:rPr>
+        <w:t xml:space="preserve">Bases de datos de matrícula en educación superior 2007–2026</w:t>
+      </w:r>
+      <w:r>
+        <w:t xml:space="preserve">. Ministerio de Educación de Chile. https://datosabiertos.mineduc.cl/</w:t>
+      </w:r>
+    </w:p>
+    <w:p>
+      <w:pPr>
+        <w:spacing w:after="110" w:line="264"/>
+        <w:ind w:left="420" w:hanging="420"/>
+        <w:jc w:val="both"/>
+      </w:pPr>
+      <w:r>
+        <w:t xml:space="preserve">Servicio de Información de Educación Superior. (2026). </w:t>
+      </w:r>
+      <w:r>
+        <w:rPr>
+          <w:i/>
+          <w:iCs/>
+        </w:rPr>
+        <w:t xml:space="preserve">Bases de datos de titulados de educación superior 2007–2025</w:t>
+      </w:r>
+      <w:r>
+        <w:t xml:space="preserve">. Ministerio de Educación de Chile. https://datosabiertos.mineduc.cl/</w:t>
+      </w:r>
+    </w:p>
+    <w:p>
+      <w:pPr>
+        <w:spacing w:after="110" w:line="264"/>
+        <w:ind w:left="420" w:hanging="420"/>
+        <w:jc w:val="both"/>
+      </w:pPr>
+      <w:r>
+        <w:t xml:space="preserve">Tukey, J. W. (1949). Comparing individual means in the analysis of variance. </w:t>
+      </w:r>
+      <w:r>
+        <w:rPr>
+          <w:i/>
+          <w:iCs/>
+        </w:rPr>
         <w:t xml:space="preserve">Biometrics</w:t>
       </w:r>
       <w:r>
         <w:t xml:space="preserve">, 5(2), 99–114.</w:t>
+      </w:r>
+    </w:p>
+    <w:p>
+      <w:pPr>
+        <w:spacing w:after="110" w:line="264"/>
+        <w:ind w:left="420" w:hanging="420"/>
+        <w:jc w:val="both"/>
+      </w:pPr>
+      <w:r>
+        <w:t xml:space="preserve">Virtanen, P., Gommers, R., Oliphant, T. E., Haberland, M., Reddy, T., Cournapeau, D. et al. (2020). SciPy 1.0: fundamental algorithms for scientific computing in Python. </w:t>
+      </w:r>
+      <w:r>
+        <w:rPr>
+          <w:i/>
+          <w:iCs/>
+        </w:rPr>
+        <w:t xml:space="preserve">Nature Methods</w:t>
+      </w:r>
+      <w:r>
+        <w:t xml:space="preserve">, 17, 261–272.</w:t>
       </w:r>
     </w:p>
     <w:p>
@@ -7844,8 +8422,8 @@
     <w:rPrDefault>
       <w:rPr>
         <w:rFonts w:ascii="Calibri" w:cs="Calibri" w:eastAsia="Calibri" w:hAnsi="Calibri"/>
-        <w:sz w:val="20"/>
-        <w:szCs w:val="20"/>
+        <w:sz w:val="21"/>
+        <w:szCs w:val="21"/>
       </w:rPr>
     </w:rPrDefault>
     <w:pPrDefault/>

</xml_diff>